<commit_message>
C2: students find WASP-2 and choose apertures themselves; rebuild questions
Part 1 now starts with WASP-2b and 51 Pegasi b in the NASA Exoplanet
Archive, then students find WASP-2 with Aladin Lite instead of a finder
chart, pick their own reference stars and read their aperture from the
seeing profile. Steps follow the coordinator's style without bold
openers, with the coordinator's AstroImageJ screenshots. The proforma's
ten questions now follow the background session slides.

Co-Authored-By: Claude Opus 5.5 <noreply@anthropic.com>
Claude-Session: https://claude.ai/code/session_01NAwACSWWsG155bmFUMGXxb
</commit_message>
<xml_diff>
--- a/C2/AstroLabC2_Proforma.docx
+++ b/C2/AstroLabC2_Proforma.docx
@@ -87,7 +87,7 @@
         <w:spacing w:after="240"/>
       </w:pPr>
       <w:r>
-        <w:t xml:space="preserve">Complete Part 1 (find the transit yourself) and Part 2 (the same planet from space), then add a short reflection at the end. For each multiple-choice question, put an X in the box next to one answer.</w:t>
+        <w:t xml:space="preserve">Complete Part 1 (meet WASP-2b and find its transit) and Part 2 (the same planet from space), then add a short reflection at the end. For each multiple-choice question, put an X in the box next to one answer.</w:t>
       </w:r>
     </w:p>
     <w:tbl>
@@ -371,9 +371,1543 @@
           <w:sz w:val="26"/>
           <w:szCs w:val="26"/>
         </w:rPr>
-        <w:t xml:space="preserve">Part 1: Find the transit yourself</w:t>
+        <w:t xml:space="preserve">Part 1: Meet WASP-2b and find its transit</w:t>
       </w:r>
     </w:p>
+    <w:p>
+      <w:pPr>
+        <w:keepNext/>
+        <w:spacing w:after="100" w:before="200"/>
+      </w:pPr>
+      <w:r>
+        <w:rPr>
+          <w:b/>
+          <w:bCs/>
+          <w:color w:val="003B71"/>
+          <w:sz w:val="23"/>
+          <w:szCs w:val="23"/>
+        </w:rPr>
+        <w:t xml:space="preserve">WASP-2b and 51 Pegasi b</w:t>
+      </w:r>
+    </w:p>
+    <w:p>
+      <w:pPr>
+        <w:keepNext/>
+        <w:spacing w:after="120"/>
+      </w:pPr>
+      <w:r>
+        <w:t xml:space="preserve">Use the NASA Exoplanet Archive to fill in this table. If the archive doesn’t give a value, write “not known”.</w:t>
+      </w:r>
+    </w:p>
+    <w:tbl>
+      <w:tblPr>
+        <w:tblW w:type="dxa" w:w="9638"/>
+        <w:tblBorders>
+          <w:top w:val="single" w:color="auto" w:sz="4"/>
+          <w:left w:val="single" w:color="auto" w:sz="4"/>
+          <w:bottom w:val="single" w:color="auto" w:sz="4"/>
+          <w:right w:val="single" w:color="auto" w:sz="4"/>
+          <w:insideH w:val="single" w:color="auto" w:sz="4"/>
+          <w:insideV w:val="single" w:color="auto" w:sz="4"/>
+        </w:tblBorders>
+      </w:tblPr>
+      <w:tblGrid>
+        <w:gridCol w:w="3600"/>
+        <w:gridCol w:w="3019"/>
+        <w:gridCol w:w="3019"/>
+      </w:tblGrid>
+      <w:tr>
+        <w:trPr>
+          <w:cantSplit/>
+          <w:tblHeader/>
+        </w:trPr>
+        <w:tc>
+          <w:tcPr>
+            <w:tcW w:type="dxa" w:w="3600"/>
+            <w:tcBorders>
+              <w:top w:val="single" w:color="B7C3D0" w:sz="4"/>
+              <w:left w:val="single" w:color="B7C3D0" w:sz="4"/>
+              <w:bottom w:val="single" w:color="B7C3D0" w:sz="4"/>
+              <w:right w:val="single" w:color="B7C3D0" w:sz="4"/>
+            </w:tcBorders>
+            <w:shd w:fill="E8EEF5" w:color="auto" w:val="clear"/>
+            <w:tcMar>
+              <w:top w:type="dxa" w:w="90"/>
+              <w:left w:type="dxa" w:w="120"/>
+              <w:bottom w:type="dxa" w:w="90"/>
+              <w:right w:type="dxa" w:w="120"/>
+            </w:tcMar>
+            <w:vAlign w:val="center"/>
+          </w:tcPr>
+          <w:p>
+            <w:pPr>
+              <w:spacing w:after="0"/>
+            </w:pPr>
+            <w:r>
+              <w:rPr>
+                <w:b/>
+                <w:bCs/>
+                <w:sz w:val="20"/>
+                <w:szCs w:val="20"/>
+              </w:rPr>
+              <w:t xml:space="preserve">Property</w:t>
+            </w:r>
+          </w:p>
+        </w:tc>
+        <w:tc>
+          <w:tcPr>
+            <w:tcW w:type="dxa" w:w="3019"/>
+            <w:tcBorders>
+              <w:top w:val="single" w:color="B7C3D0" w:sz="4"/>
+              <w:left w:val="single" w:color="B7C3D0" w:sz="4"/>
+              <w:bottom w:val="single" w:color="B7C3D0" w:sz="4"/>
+              <w:right w:val="single" w:color="B7C3D0" w:sz="4"/>
+            </w:tcBorders>
+            <w:shd w:fill="E8EEF5" w:color="auto" w:val="clear"/>
+            <w:tcMar>
+              <w:top w:type="dxa" w:w="90"/>
+              <w:left w:type="dxa" w:w="120"/>
+              <w:bottom w:type="dxa" w:w="90"/>
+              <w:right w:type="dxa" w:w="120"/>
+            </w:tcMar>
+            <w:vAlign w:val="center"/>
+          </w:tcPr>
+          <w:p>
+            <w:pPr>
+              <w:spacing w:after="0"/>
+            </w:pPr>
+            <w:r>
+              <w:rPr>
+                <w:b/>
+                <w:bCs/>
+                <w:sz w:val="20"/>
+                <w:szCs w:val="20"/>
+              </w:rPr>
+              <w:t xml:space="preserve">WASP-2b</w:t>
+            </w:r>
+          </w:p>
+        </w:tc>
+        <w:tc>
+          <w:tcPr>
+            <w:tcW w:type="dxa" w:w="3019"/>
+            <w:tcBorders>
+              <w:top w:val="single" w:color="B7C3D0" w:sz="4"/>
+              <w:left w:val="single" w:color="B7C3D0" w:sz="4"/>
+              <w:bottom w:val="single" w:color="B7C3D0" w:sz="4"/>
+              <w:right w:val="single" w:color="B7C3D0" w:sz="4"/>
+            </w:tcBorders>
+            <w:shd w:fill="E8EEF5" w:color="auto" w:val="clear"/>
+            <w:tcMar>
+              <w:top w:type="dxa" w:w="90"/>
+              <w:left w:type="dxa" w:w="120"/>
+              <w:bottom w:type="dxa" w:w="90"/>
+              <w:right w:type="dxa" w:w="120"/>
+            </w:tcMar>
+            <w:vAlign w:val="center"/>
+          </w:tcPr>
+          <w:p>
+            <w:pPr>
+              <w:spacing w:after="0"/>
+            </w:pPr>
+            <w:r>
+              <w:rPr>
+                <w:b/>
+                <w:bCs/>
+                <w:sz w:val="20"/>
+                <w:szCs w:val="20"/>
+              </w:rPr>
+              <w:t xml:space="preserve">51 Pegasi b</w:t>
+            </w:r>
+          </w:p>
+        </w:tc>
+      </w:tr>
+      <w:tr>
+        <w:trPr>
+          <w:cantSplit/>
+          <w:trHeight w:val="560" w:hRule="atLeast"/>
+        </w:trPr>
+        <w:tc>
+          <w:tcPr>
+            <w:tcW w:type="dxa" w:w="3600"/>
+            <w:tcBorders>
+              <w:top w:val="single" w:color="B7C3D0" w:sz="4"/>
+              <w:left w:val="single" w:color="B7C3D0" w:sz="4"/>
+              <w:bottom w:val="single" w:color="B7C3D0" w:sz="4"/>
+              <w:right w:val="single" w:color="B7C3D0" w:sz="4"/>
+            </w:tcBorders>
+            <w:shd w:fill="E8EEF5" w:color="auto" w:val="clear"/>
+            <w:tcMar>
+              <w:top w:type="dxa" w:w="90"/>
+              <w:left w:type="dxa" w:w="120"/>
+              <w:bottom w:type="dxa" w:w="90"/>
+              <w:right w:type="dxa" w:w="120"/>
+            </w:tcMar>
+            <w:vAlign w:val="center"/>
+          </w:tcPr>
+          <w:p>
+            <w:pPr>
+              <w:spacing w:after="0"/>
+            </w:pPr>
+            <w:r>
+              <w:rPr>
+                <w:b/>
+                <w:bCs/>
+                <w:sz w:val="20"/>
+                <w:szCs w:val="20"/>
+              </w:rPr>
+              <w:t xml:space="preserve">Discovery year</w:t>
+            </w:r>
+          </w:p>
+        </w:tc>
+        <w:tc>
+          <w:tcPr>
+            <w:tcW w:type="dxa" w:w="3019"/>
+            <w:tcBorders>
+              <w:top w:val="single" w:color="B7C3D0" w:sz="4"/>
+              <w:left w:val="single" w:color="B7C3D0" w:sz="4"/>
+              <w:bottom w:val="single" w:color="B7C3D0" w:sz="4"/>
+              <w:right w:val="single" w:color="B7C3D0" w:sz="4"/>
+            </w:tcBorders>
+            <w:tcMar>
+              <w:top w:type="dxa" w:w="90"/>
+              <w:left w:type="dxa" w:w="120"/>
+              <w:bottom w:type="dxa" w:w="90"/>
+              <w:right w:type="dxa" w:w="120"/>
+            </w:tcMar>
+            <w:vAlign w:val="center"/>
+          </w:tcPr>
+          <w:p>
+            <w:pPr>
+              <w:spacing w:after="0"/>
+            </w:pPr>
+            <w:r>
+              <w:rPr>
+                <w:sz w:val="22"/>
+                <w:szCs w:val="22"/>
+              </w:rPr>
+              <w:t xml:space="preserve"/>
+            </w:r>
+          </w:p>
+        </w:tc>
+        <w:tc>
+          <w:tcPr>
+            <w:tcW w:type="dxa" w:w="3019"/>
+            <w:tcBorders>
+              <w:top w:val="single" w:color="B7C3D0" w:sz="4"/>
+              <w:left w:val="single" w:color="B7C3D0" w:sz="4"/>
+              <w:bottom w:val="single" w:color="B7C3D0" w:sz="4"/>
+              <w:right w:val="single" w:color="B7C3D0" w:sz="4"/>
+            </w:tcBorders>
+            <w:tcMar>
+              <w:top w:type="dxa" w:w="90"/>
+              <w:left w:type="dxa" w:w="120"/>
+              <w:bottom w:type="dxa" w:w="90"/>
+              <w:right w:type="dxa" w:w="120"/>
+            </w:tcMar>
+            <w:vAlign w:val="center"/>
+          </w:tcPr>
+          <w:p>
+            <w:pPr>
+              <w:spacing w:after="0"/>
+            </w:pPr>
+            <w:r>
+              <w:rPr>
+                <w:sz w:val="22"/>
+                <w:szCs w:val="22"/>
+              </w:rPr>
+              <w:t xml:space="preserve"/>
+            </w:r>
+          </w:p>
+        </w:tc>
+      </w:tr>
+      <w:tr>
+        <w:trPr>
+          <w:cantSplit/>
+          <w:trHeight w:val="560" w:hRule="atLeast"/>
+        </w:trPr>
+        <w:tc>
+          <w:tcPr>
+            <w:tcW w:type="dxa" w:w="3600"/>
+            <w:tcBorders>
+              <w:top w:val="single" w:color="B7C3D0" w:sz="4"/>
+              <w:left w:val="single" w:color="B7C3D0" w:sz="4"/>
+              <w:bottom w:val="single" w:color="B7C3D0" w:sz="4"/>
+              <w:right w:val="single" w:color="B7C3D0" w:sz="4"/>
+            </w:tcBorders>
+            <w:shd w:fill="E8EEF5" w:color="auto" w:val="clear"/>
+            <w:tcMar>
+              <w:top w:type="dxa" w:w="90"/>
+              <w:left w:type="dxa" w:w="120"/>
+              <w:bottom w:type="dxa" w:w="90"/>
+              <w:right w:type="dxa" w:w="120"/>
+            </w:tcMar>
+            <w:vAlign w:val="center"/>
+          </w:tcPr>
+          <w:p>
+            <w:pPr>
+              <w:spacing w:after="0"/>
+            </w:pPr>
+            <w:r>
+              <w:rPr>
+                <w:b/>
+                <w:bCs/>
+                <w:sz w:val="20"/>
+                <w:szCs w:val="20"/>
+              </w:rPr>
+              <w:t xml:space="preserve">Discovery method</w:t>
+            </w:r>
+          </w:p>
+        </w:tc>
+        <w:tc>
+          <w:tcPr>
+            <w:tcW w:type="dxa" w:w="3019"/>
+            <w:tcBorders>
+              <w:top w:val="single" w:color="B7C3D0" w:sz="4"/>
+              <w:left w:val="single" w:color="B7C3D0" w:sz="4"/>
+              <w:bottom w:val="single" w:color="B7C3D0" w:sz="4"/>
+              <w:right w:val="single" w:color="B7C3D0" w:sz="4"/>
+            </w:tcBorders>
+            <w:tcMar>
+              <w:top w:type="dxa" w:w="90"/>
+              <w:left w:type="dxa" w:w="120"/>
+              <w:bottom w:type="dxa" w:w="90"/>
+              <w:right w:type="dxa" w:w="120"/>
+            </w:tcMar>
+            <w:vAlign w:val="center"/>
+          </w:tcPr>
+          <w:p>
+            <w:pPr>
+              <w:spacing w:after="0"/>
+            </w:pPr>
+            <w:r>
+              <w:rPr>
+                <w:sz w:val="22"/>
+                <w:szCs w:val="22"/>
+              </w:rPr>
+              <w:t xml:space="preserve"/>
+            </w:r>
+          </w:p>
+        </w:tc>
+        <w:tc>
+          <w:tcPr>
+            <w:tcW w:type="dxa" w:w="3019"/>
+            <w:tcBorders>
+              <w:top w:val="single" w:color="B7C3D0" w:sz="4"/>
+              <w:left w:val="single" w:color="B7C3D0" w:sz="4"/>
+              <w:bottom w:val="single" w:color="B7C3D0" w:sz="4"/>
+              <w:right w:val="single" w:color="B7C3D0" w:sz="4"/>
+            </w:tcBorders>
+            <w:tcMar>
+              <w:top w:type="dxa" w:w="90"/>
+              <w:left w:type="dxa" w:w="120"/>
+              <w:bottom w:type="dxa" w:w="90"/>
+              <w:right w:type="dxa" w:w="120"/>
+            </w:tcMar>
+            <w:vAlign w:val="center"/>
+          </w:tcPr>
+          <w:p>
+            <w:pPr>
+              <w:spacing w:after="0"/>
+            </w:pPr>
+            <w:r>
+              <w:rPr>
+                <w:sz w:val="22"/>
+                <w:szCs w:val="22"/>
+              </w:rPr>
+              <w:t xml:space="preserve"/>
+            </w:r>
+          </w:p>
+        </w:tc>
+      </w:tr>
+      <w:tr>
+        <w:trPr>
+          <w:cantSplit/>
+          <w:trHeight w:val="560" w:hRule="atLeast"/>
+        </w:trPr>
+        <w:tc>
+          <w:tcPr>
+            <w:tcW w:type="dxa" w:w="3600"/>
+            <w:tcBorders>
+              <w:top w:val="single" w:color="B7C3D0" w:sz="4"/>
+              <w:left w:val="single" w:color="B7C3D0" w:sz="4"/>
+              <w:bottom w:val="single" w:color="B7C3D0" w:sz="4"/>
+              <w:right w:val="single" w:color="B7C3D0" w:sz="4"/>
+            </w:tcBorders>
+            <w:shd w:fill="E8EEF5" w:color="auto" w:val="clear"/>
+            <w:tcMar>
+              <w:top w:type="dxa" w:w="90"/>
+              <w:left w:type="dxa" w:w="120"/>
+              <w:bottom w:type="dxa" w:w="90"/>
+              <w:right w:type="dxa" w:w="120"/>
+            </w:tcMar>
+            <w:vAlign w:val="center"/>
+          </w:tcPr>
+          <w:p>
+            <w:pPr>
+              <w:spacing w:after="0"/>
+            </w:pPr>
+            <w:r>
+              <w:rPr>
+                <w:b/>
+                <w:bCs/>
+                <w:sz w:val="20"/>
+                <w:szCs w:val="20"/>
+              </w:rPr>
+              <w:t xml:space="preserve">Orbital period (days)</w:t>
+            </w:r>
+          </w:p>
+        </w:tc>
+        <w:tc>
+          <w:tcPr>
+            <w:tcW w:type="dxa" w:w="3019"/>
+            <w:tcBorders>
+              <w:top w:val="single" w:color="B7C3D0" w:sz="4"/>
+              <w:left w:val="single" w:color="B7C3D0" w:sz="4"/>
+              <w:bottom w:val="single" w:color="B7C3D0" w:sz="4"/>
+              <w:right w:val="single" w:color="B7C3D0" w:sz="4"/>
+            </w:tcBorders>
+            <w:tcMar>
+              <w:top w:type="dxa" w:w="90"/>
+              <w:left w:type="dxa" w:w="120"/>
+              <w:bottom w:type="dxa" w:w="90"/>
+              <w:right w:type="dxa" w:w="120"/>
+            </w:tcMar>
+            <w:vAlign w:val="center"/>
+          </w:tcPr>
+          <w:p>
+            <w:pPr>
+              <w:spacing w:after="0"/>
+            </w:pPr>
+            <w:r>
+              <w:rPr>
+                <w:sz w:val="22"/>
+                <w:szCs w:val="22"/>
+              </w:rPr>
+              <w:t xml:space="preserve"/>
+            </w:r>
+          </w:p>
+        </w:tc>
+        <w:tc>
+          <w:tcPr>
+            <w:tcW w:type="dxa" w:w="3019"/>
+            <w:tcBorders>
+              <w:top w:val="single" w:color="B7C3D0" w:sz="4"/>
+              <w:left w:val="single" w:color="B7C3D0" w:sz="4"/>
+              <w:bottom w:val="single" w:color="B7C3D0" w:sz="4"/>
+              <w:right w:val="single" w:color="B7C3D0" w:sz="4"/>
+            </w:tcBorders>
+            <w:tcMar>
+              <w:top w:type="dxa" w:w="90"/>
+              <w:left w:type="dxa" w:w="120"/>
+              <w:bottom w:type="dxa" w:w="90"/>
+              <w:right w:type="dxa" w:w="120"/>
+            </w:tcMar>
+            <w:vAlign w:val="center"/>
+          </w:tcPr>
+          <w:p>
+            <w:pPr>
+              <w:spacing w:after="0"/>
+            </w:pPr>
+            <w:r>
+              <w:rPr>
+                <w:sz w:val="22"/>
+                <w:szCs w:val="22"/>
+              </w:rPr>
+              <w:t xml:space="preserve"/>
+            </w:r>
+          </w:p>
+        </w:tc>
+      </w:tr>
+      <w:tr>
+        <w:trPr>
+          <w:cantSplit/>
+          <w:trHeight w:val="560" w:hRule="atLeast"/>
+        </w:trPr>
+        <w:tc>
+          <w:tcPr>
+            <w:tcW w:type="dxa" w:w="3600"/>
+            <w:tcBorders>
+              <w:top w:val="single" w:color="B7C3D0" w:sz="4"/>
+              <w:left w:val="single" w:color="B7C3D0" w:sz="4"/>
+              <w:bottom w:val="single" w:color="B7C3D0" w:sz="4"/>
+              <w:right w:val="single" w:color="B7C3D0" w:sz="4"/>
+            </w:tcBorders>
+            <w:shd w:fill="E8EEF5" w:color="auto" w:val="clear"/>
+            <w:tcMar>
+              <w:top w:type="dxa" w:w="90"/>
+              <w:left w:type="dxa" w:w="120"/>
+              <w:bottom w:type="dxa" w:w="90"/>
+              <w:right w:type="dxa" w:w="120"/>
+            </w:tcMar>
+            <w:vAlign w:val="center"/>
+          </w:tcPr>
+          <w:p>
+            <w:pPr>
+              <w:spacing w:after="0"/>
+            </w:pPr>
+            <w:r>
+              <w:rPr>
+                <w:b/>
+                <w:bCs/>
+                <w:sz w:val="20"/>
+                <w:szCs w:val="20"/>
+              </w:rPr>
+              <w:t xml:space="preserve">Planet radius (Jupiter radii)</w:t>
+            </w:r>
+          </w:p>
+        </w:tc>
+        <w:tc>
+          <w:tcPr>
+            <w:tcW w:type="dxa" w:w="3019"/>
+            <w:tcBorders>
+              <w:top w:val="single" w:color="B7C3D0" w:sz="4"/>
+              <w:left w:val="single" w:color="B7C3D0" w:sz="4"/>
+              <w:bottom w:val="single" w:color="B7C3D0" w:sz="4"/>
+              <w:right w:val="single" w:color="B7C3D0" w:sz="4"/>
+            </w:tcBorders>
+            <w:tcMar>
+              <w:top w:type="dxa" w:w="90"/>
+              <w:left w:type="dxa" w:w="120"/>
+              <w:bottom w:type="dxa" w:w="90"/>
+              <w:right w:type="dxa" w:w="120"/>
+            </w:tcMar>
+            <w:vAlign w:val="center"/>
+          </w:tcPr>
+          <w:p>
+            <w:pPr>
+              <w:spacing w:after="0"/>
+            </w:pPr>
+            <w:r>
+              <w:rPr>
+                <w:sz w:val="22"/>
+                <w:szCs w:val="22"/>
+              </w:rPr>
+              <w:t xml:space="preserve"/>
+            </w:r>
+          </w:p>
+        </w:tc>
+        <w:tc>
+          <w:tcPr>
+            <w:tcW w:type="dxa" w:w="3019"/>
+            <w:tcBorders>
+              <w:top w:val="single" w:color="B7C3D0" w:sz="4"/>
+              <w:left w:val="single" w:color="B7C3D0" w:sz="4"/>
+              <w:bottom w:val="single" w:color="B7C3D0" w:sz="4"/>
+              <w:right w:val="single" w:color="B7C3D0" w:sz="4"/>
+            </w:tcBorders>
+            <w:tcMar>
+              <w:top w:type="dxa" w:w="90"/>
+              <w:left w:type="dxa" w:w="120"/>
+              <w:bottom w:type="dxa" w:w="90"/>
+              <w:right w:type="dxa" w:w="120"/>
+            </w:tcMar>
+            <w:vAlign w:val="center"/>
+          </w:tcPr>
+          <w:p>
+            <w:pPr>
+              <w:spacing w:after="0"/>
+            </w:pPr>
+            <w:r>
+              <w:rPr>
+                <w:sz w:val="22"/>
+                <w:szCs w:val="22"/>
+              </w:rPr>
+              <w:t xml:space="preserve"/>
+            </w:r>
+          </w:p>
+        </w:tc>
+      </w:tr>
+      <w:tr>
+        <w:trPr>
+          <w:cantSplit/>
+          <w:trHeight w:val="560" w:hRule="atLeast"/>
+        </w:trPr>
+        <w:tc>
+          <w:tcPr>
+            <w:tcW w:type="dxa" w:w="3600"/>
+            <w:tcBorders>
+              <w:top w:val="single" w:color="B7C3D0" w:sz="4"/>
+              <w:left w:val="single" w:color="B7C3D0" w:sz="4"/>
+              <w:bottom w:val="single" w:color="B7C3D0" w:sz="4"/>
+              <w:right w:val="single" w:color="B7C3D0" w:sz="4"/>
+            </w:tcBorders>
+            <w:shd w:fill="E8EEF5" w:color="auto" w:val="clear"/>
+            <w:tcMar>
+              <w:top w:type="dxa" w:w="90"/>
+              <w:left w:type="dxa" w:w="120"/>
+              <w:bottom w:type="dxa" w:w="90"/>
+              <w:right w:type="dxa" w:w="120"/>
+            </w:tcMar>
+            <w:vAlign w:val="center"/>
+          </w:tcPr>
+          <w:p>
+            <w:pPr>
+              <w:spacing w:after="0"/>
+            </w:pPr>
+            <w:r>
+              <w:rPr>
+                <w:b/>
+                <w:bCs/>
+                <w:sz w:val="20"/>
+                <w:szCs w:val="20"/>
+              </w:rPr>
+              <w:t xml:space="preserve">Planet mass (Jupiter masses)</w:t>
+            </w:r>
+          </w:p>
+        </w:tc>
+        <w:tc>
+          <w:tcPr>
+            <w:tcW w:type="dxa" w:w="3019"/>
+            <w:tcBorders>
+              <w:top w:val="single" w:color="B7C3D0" w:sz="4"/>
+              <w:left w:val="single" w:color="B7C3D0" w:sz="4"/>
+              <w:bottom w:val="single" w:color="B7C3D0" w:sz="4"/>
+              <w:right w:val="single" w:color="B7C3D0" w:sz="4"/>
+            </w:tcBorders>
+            <w:tcMar>
+              <w:top w:type="dxa" w:w="90"/>
+              <w:left w:type="dxa" w:w="120"/>
+              <w:bottom w:type="dxa" w:w="90"/>
+              <w:right w:type="dxa" w:w="120"/>
+            </w:tcMar>
+            <w:vAlign w:val="center"/>
+          </w:tcPr>
+          <w:p>
+            <w:pPr>
+              <w:spacing w:after="0"/>
+            </w:pPr>
+            <w:r>
+              <w:rPr>
+                <w:sz w:val="22"/>
+                <w:szCs w:val="22"/>
+              </w:rPr>
+              <w:t xml:space="preserve"/>
+            </w:r>
+          </w:p>
+        </w:tc>
+        <w:tc>
+          <w:tcPr>
+            <w:tcW w:type="dxa" w:w="3019"/>
+            <w:tcBorders>
+              <w:top w:val="single" w:color="B7C3D0" w:sz="4"/>
+              <w:left w:val="single" w:color="B7C3D0" w:sz="4"/>
+              <w:bottom w:val="single" w:color="B7C3D0" w:sz="4"/>
+              <w:right w:val="single" w:color="B7C3D0" w:sz="4"/>
+            </w:tcBorders>
+            <w:tcMar>
+              <w:top w:type="dxa" w:w="90"/>
+              <w:left w:type="dxa" w:w="120"/>
+              <w:bottom w:type="dxa" w:w="90"/>
+              <w:right w:type="dxa" w:w="120"/>
+            </w:tcMar>
+            <w:vAlign w:val="center"/>
+          </w:tcPr>
+          <w:p>
+            <w:pPr>
+              <w:spacing w:after="0"/>
+            </w:pPr>
+            <w:r>
+              <w:rPr>
+                <w:sz w:val="22"/>
+                <w:szCs w:val="22"/>
+              </w:rPr>
+              <w:t xml:space="preserve"/>
+            </w:r>
+          </w:p>
+        </w:tc>
+      </w:tr>
+      <w:tr>
+        <w:trPr>
+          <w:cantSplit/>
+          <w:trHeight w:val="560" w:hRule="atLeast"/>
+        </w:trPr>
+        <w:tc>
+          <w:tcPr>
+            <w:tcW w:type="dxa" w:w="3600"/>
+            <w:tcBorders>
+              <w:top w:val="single" w:color="B7C3D0" w:sz="4"/>
+              <w:left w:val="single" w:color="B7C3D0" w:sz="4"/>
+              <w:bottom w:val="single" w:color="B7C3D0" w:sz="4"/>
+              <w:right w:val="single" w:color="B7C3D0" w:sz="4"/>
+            </w:tcBorders>
+            <w:shd w:fill="E8EEF5" w:color="auto" w:val="clear"/>
+            <w:tcMar>
+              <w:top w:type="dxa" w:w="90"/>
+              <w:left w:type="dxa" w:w="120"/>
+              <w:bottom w:type="dxa" w:w="90"/>
+              <w:right w:type="dxa" w:w="120"/>
+            </w:tcMar>
+            <w:vAlign w:val="center"/>
+          </w:tcPr>
+          <w:p>
+            <w:pPr>
+              <w:spacing w:after="0"/>
+            </w:pPr>
+            <w:r>
+              <w:rPr>
+                <w:b/>
+                <w:bCs/>
+                <w:sz w:val="20"/>
+                <w:szCs w:val="20"/>
+              </w:rPr>
+              <w:t xml:space="preserve">Distance (light-years)</w:t>
+            </w:r>
+          </w:p>
+        </w:tc>
+        <w:tc>
+          <w:tcPr>
+            <w:tcW w:type="dxa" w:w="3019"/>
+            <w:tcBorders>
+              <w:top w:val="single" w:color="B7C3D0" w:sz="4"/>
+              <w:left w:val="single" w:color="B7C3D0" w:sz="4"/>
+              <w:bottom w:val="single" w:color="B7C3D0" w:sz="4"/>
+              <w:right w:val="single" w:color="B7C3D0" w:sz="4"/>
+            </w:tcBorders>
+            <w:tcMar>
+              <w:top w:type="dxa" w:w="90"/>
+              <w:left w:type="dxa" w:w="120"/>
+              <w:bottom w:type="dxa" w:w="90"/>
+              <w:right w:type="dxa" w:w="120"/>
+            </w:tcMar>
+            <w:vAlign w:val="center"/>
+          </w:tcPr>
+          <w:p>
+            <w:pPr>
+              <w:spacing w:after="0"/>
+            </w:pPr>
+            <w:r>
+              <w:rPr>
+                <w:sz w:val="22"/>
+                <w:szCs w:val="22"/>
+              </w:rPr>
+              <w:t xml:space="preserve"/>
+            </w:r>
+          </w:p>
+        </w:tc>
+        <w:tc>
+          <w:tcPr>
+            <w:tcW w:type="dxa" w:w="3019"/>
+            <w:tcBorders>
+              <w:top w:val="single" w:color="B7C3D0" w:sz="4"/>
+              <w:left w:val="single" w:color="B7C3D0" w:sz="4"/>
+              <w:bottom w:val="single" w:color="B7C3D0" w:sz="4"/>
+              <w:right w:val="single" w:color="B7C3D0" w:sz="4"/>
+            </w:tcBorders>
+            <w:tcMar>
+              <w:top w:type="dxa" w:w="90"/>
+              <w:left w:type="dxa" w:w="120"/>
+              <w:bottom w:type="dxa" w:w="90"/>
+              <w:right w:type="dxa" w:w="120"/>
+            </w:tcMar>
+            <w:vAlign w:val="center"/>
+          </w:tcPr>
+          <w:p>
+            <w:pPr>
+              <w:spacing w:after="0"/>
+            </w:pPr>
+            <w:r>
+              <w:rPr>
+                <w:sz w:val="22"/>
+                <w:szCs w:val="22"/>
+              </w:rPr>
+              <w:t xml:space="preserve"/>
+            </w:r>
+          </w:p>
+        </w:tc>
+      </w:tr>
+      <w:tr>
+        <w:trPr>
+          <w:cantSplit/>
+          <w:trHeight w:val="560" w:hRule="atLeast"/>
+        </w:trPr>
+        <w:tc>
+          <w:tcPr>
+            <w:tcW w:type="dxa" w:w="3600"/>
+            <w:tcBorders>
+              <w:top w:val="single" w:color="B7C3D0" w:sz="4"/>
+              <w:left w:val="single" w:color="B7C3D0" w:sz="4"/>
+              <w:bottom w:val="single" w:color="B7C3D0" w:sz="4"/>
+              <w:right w:val="single" w:color="B7C3D0" w:sz="4"/>
+            </w:tcBorders>
+            <w:shd w:fill="E8EEF5" w:color="auto" w:val="clear"/>
+            <w:tcMar>
+              <w:top w:type="dxa" w:w="90"/>
+              <w:left w:type="dxa" w:w="120"/>
+              <w:bottom w:type="dxa" w:w="90"/>
+              <w:right w:type="dxa" w:w="120"/>
+            </w:tcMar>
+            <w:vAlign w:val="center"/>
+          </w:tcPr>
+          <w:p>
+            <w:pPr>
+              <w:spacing w:after="0"/>
+            </w:pPr>
+            <w:r>
+              <w:rPr>
+                <w:b/>
+                <w:bCs/>
+                <w:sz w:val="20"/>
+                <w:szCs w:val="20"/>
+              </w:rPr>
+              <w:t xml:space="preserve">Star’s temperature (K)</w:t>
+            </w:r>
+          </w:p>
+        </w:tc>
+        <w:tc>
+          <w:tcPr>
+            <w:tcW w:type="dxa" w:w="3019"/>
+            <w:tcBorders>
+              <w:top w:val="single" w:color="B7C3D0" w:sz="4"/>
+              <w:left w:val="single" w:color="B7C3D0" w:sz="4"/>
+              <w:bottom w:val="single" w:color="B7C3D0" w:sz="4"/>
+              <w:right w:val="single" w:color="B7C3D0" w:sz="4"/>
+            </w:tcBorders>
+            <w:tcMar>
+              <w:top w:type="dxa" w:w="90"/>
+              <w:left w:type="dxa" w:w="120"/>
+              <w:bottom w:type="dxa" w:w="90"/>
+              <w:right w:type="dxa" w:w="120"/>
+            </w:tcMar>
+            <w:vAlign w:val="center"/>
+          </w:tcPr>
+          <w:p>
+            <w:pPr>
+              <w:spacing w:after="0"/>
+            </w:pPr>
+            <w:r>
+              <w:rPr>
+                <w:sz w:val="22"/>
+                <w:szCs w:val="22"/>
+              </w:rPr>
+              <w:t xml:space="preserve"/>
+            </w:r>
+          </w:p>
+        </w:tc>
+        <w:tc>
+          <w:tcPr>
+            <w:tcW w:type="dxa" w:w="3019"/>
+            <w:tcBorders>
+              <w:top w:val="single" w:color="B7C3D0" w:sz="4"/>
+              <w:left w:val="single" w:color="B7C3D0" w:sz="4"/>
+              <w:bottom w:val="single" w:color="B7C3D0" w:sz="4"/>
+              <w:right w:val="single" w:color="B7C3D0" w:sz="4"/>
+            </w:tcBorders>
+            <w:tcMar>
+              <w:top w:type="dxa" w:w="90"/>
+              <w:left w:type="dxa" w:w="120"/>
+              <w:bottom w:type="dxa" w:w="90"/>
+              <w:right w:type="dxa" w:w="120"/>
+            </w:tcMar>
+            <w:vAlign w:val="center"/>
+          </w:tcPr>
+          <w:p>
+            <w:pPr>
+              <w:spacing w:after="0"/>
+            </w:pPr>
+            <w:r>
+              <w:rPr>
+                <w:sz w:val="22"/>
+                <w:szCs w:val="22"/>
+              </w:rPr>
+              <w:t xml:space="preserve"/>
+            </w:r>
+          </w:p>
+        </w:tc>
+      </w:tr>
+    </w:tbl>
+    <w:p>
+      <w:pPr>
+        <w:spacing w:after="160"/>
+      </w:pPr>
+    </w:p>
+    <w:tbl>
+      <w:tblPr>
+        <w:tblW w:type="dxa" w:w="9638"/>
+        <w:tblBorders>
+          <w:top w:val="single" w:color="auto" w:sz="4"/>
+          <w:left w:val="single" w:color="auto" w:sz="4"/>
+          <w:bottom w:val="single" w:color="auto" w:sz="4"/>
+          <w:right w:val="single" w:color="auto" w:sz="4"/>
+          <w:insideH w:val="single" w:color="auto" w:sz="4"/>
+          <w:insideV w:val="single" w:color="auto" w:sz="4"/>
+        </w:tblBorders>
+      </w:tblPr>
+      <w:tblGrid>
+        <w:gridCol w:w="6338"/>
+        <w:gridCol w:w="3300"/>
+      </w:tblGrid>
+      <w:tr>
+        <w:trPr>
+          <w:cantSplit/>
+          <w:tblHeader/>
+        </w:trPr>
+        <w:tc>
+          <w:tcPr>
+            <w:tcW w:type="dxa" w:w="6338"/>
+            <w:tcBorders>
+              <w:top w:val="single" w:color="B7C3D0" w:sz="4"/>
+              <w:left w:val="single" w:color="B7C3D0" w:sz="4"/>
+              <w:bottom w:val="single" w:color="B7C3D0" w:sz="4"/>
+              <w:right w:val="single" w:color="B7C3D0" w:sz="4"/>
+            </w:tcBorders>
+            <w:shd w:fill="E8EEF5" w:color="auto" w:val="clear"/>
+            <w:tcMar>
+              <w:top w:type="dxa" w:w="90"/>
+              <w:left w:type="dxa" w:w="120"/>
+              <w:bottom w:type="dxa" w:w="90"/>
+              <w:right w:type="dxa" w:w="120"/>
+            </w:tcMar>
+            <w:vAlign w:val="center"/>
+          </w:tcPr>
+          <w:p>
+            <w:pPr>
+              <w:spacing w:after="0"/>
+            </w:pPr>
+            <w:r>
+              <w:rPr>
+                <w:b/>
+                <w:bCs/>
+                <w:sz w:val="20"/>
+                <w:szCs w:val="20"/>
+              </w:rPr>
+              <w:t xml:space="preserve">Confirmed planets</w:t>
+            </w:r>
+          </w:p>
+        </w:tc>
+        <w:tc>
+          <w:tcPr>
+            <w:tcW w:type="dxa" w:w="3300"/>
+            <w:tcBorders>
+              <w:top w:val="single" w:color="B7C3D0" w:sz="4"/>
+              <w:left w:val="single" w:color="B7C3D0" w:sz="4"/>
+              <w:bottom w:val="single" w:color="B7C3D0" w:sz="4"/>
+              <w:right w:val="single" w:color="B7C3D0" w:sz="4"/>
+            </w:tcBorders>
+            <w:shd w:fill="E8EEF5" w:color="auto" w:val="clear"/>
+            <w:tcMar>
+              <w:top w:type="dxa" w:w="90"/>
+              <w:left w:type="dxa" w:w="120"/>
+              <w:bottom w:type="dxa" w:w="90"/>
+              <w:right w:type="dxa" w:w="120"/>
+            </w:tcMar>
+            <w:vAlign w:val="center"/>
+          </w:tcPr>
+          <w:p>
+            <w:pPr>
+              <w:spacing w:after="0"/>
+            </w:pPr>
+            <w:r>
+              <w:rPr>
+                <w:b/>
+                <w:bCs/>
+                <w:sz w:val="20"/>
+                <w:szCs w:val="20"/>
+              </w:rPr>
+              <w:t xml:space="preserve">Number</w:t>
+            </w:r>
+          </w:p>
+        </w:tc>
+      </w:tr>
+      <w:tr>
+        <w:trPr>
+          <w:cantSplit/>
+          <w:trHeight w:val="560" w:hRule="atLeast"/>
+        </w:trPr>
+        <w:tc>
+          <w:tcPr>
+            <w:tcW w:type="dxa" w:w="6338"/>
+            <w:tcBorders>
+              <w:top w:val="single" w:color="B7C3D0" w:sz="4"/>
+              <w:left w:val="single" w:color="B7C3D0" w:sz="4"/>
+              <w:bottom w:val="single" w:color="B7C3D0" w:sz="4"/>
+              <w:right w:val="single" w:color="B7C3D0" w:sz="4"/>
+            </w:tcBorders>
+            <w:shd w:fill="E8EEF5" w:color="auto" w:val="clear"/>
+            <w:tcMar>
+              <w:top w:type="dxa" w:w="90"/>
+              <w:left w:type="dxa" w:w="120"/>
+              <w:bottom w:type="dxa" w:w="90"/>
+              <w:right w:type="dxa" w:w="120"/>
+            </w:tcMar>
+            <w:vAlign w:val="center"/>
+          </w:tcPr>
+          <w:p>
+            <w:pPr>
+              <w:spacing w:after="0"/>
+            </w:pPr>
+            <w:r>
+              <w:rPr>
+                <w:b/>
+                <w:bCs/>
+                <w:sz w:val="20"/>
+                <w:szCs w:val="20"/>
+              </w:rPr>
+              <w:t xml:space="preserve">Found by the transit method</w:t>
+            </w:r>
+          </w:p>
+        </w:tc>
+        <w:tc>
+          <w:tcPr>
+            <w:tcW w:type="dxa" w:w="3300"/>
+            <w:tcBorders>
+              <w:top w:val="single" w:color="B7C3D0" w:sz="4"/>
+              <w:left w:val="single" w:color="B7C3D0" w:sz="4"/>
+              <w:bottom w:val="single" w:color="B7C3D0" w:sz="4"/>
+              <w:right w:val="single" w:color="B7C3D0" w:sz="4"/>
+            </w:tcBorders>
+            <w:tcMar>
+              <w:top w:type="dxa" w:w="90"/>
+              <w:left w:type="dxa" w:w="120"/>
+              <w:bottom w:type="dxa" w:w="90"/>
+              <w:right w:type="dxa" w:w="120"/>
+            </w:tcMar>
+            <w:vAlign w:val="center"/>
+          </w:tcPr>
+          <w:p>
+            <w:pPr>
+              <w:spacing w:after="0"/>
+            </w:pPr>
+            <w:r>
+              <w:rPr>
+                <w:sz w:val="22"/>
+                <w:szCs w:val="22"/>
+              </w:rPr>
+              <w:t xml:space="preserve"/>
+            </w:r>
+          </w:p>
+        </w:tc>
+      </w:tr>
+      <w:tr>
+        <w:trPr>
+          <w:cantSplit/>
+          <w:trHeight w:val="560" w:hRule="atLeast"/>
+        </w:trPr>
+        <w:tc>
+          <w:tcPr>
+            <w:tcW w:type="dxa" w:w="6338"/>
+            <w:tcBorders>
+              <w:top w:val="single" w:color="B7C3D0" w:sz="4"/>
+              <w:left w:val="single" w:color="B7C3D0" w:sz="4"/>
+              <w:bottom w:val="single" w:color="B7C3D0" w:sz="4"/>
+              <w:right w:val="single" w:color="B7C3D0" w:sz="4"/>
+            </w:tcBorders>
+            <w:shd w:fill="E8EEF5" w:color="auto" w:val="clear"/>
+            <w:tcMar>
+              <w:top w:type="dxa" w:w="90"/>
+              <w:left w:type="dxa" w:w="120"/>
+              <w:bottom w:type="dxa" w:w="90"/>
+              <w:right w:type="dxa" w:w="120"/>
+            </w:tcMar>
+            <w:vAlign w:val="center"/>
+          </w:tcPr>
+          <w:p>
+            <w:pPr>
+              <w:spacing w:after="0"/>
+            </w:pPr>
+            <w:r>
+              <w:rPr>
+                <w:b/>
+                <w:bCs/>
+                <w:sz w:val="20"/>
+                <w:szCs w:val="20"/>
+              </w:rPr>
+              <w:t xml:space="preserve">Found by all methods</w:t>
+            </w:r>
+          </w:p>
+        </w:tc>
+        <w:tc>
+          <w:tcPr>
+            <w:tcW w:type="dxa" w:w="3300"/>
+            <w:tcBorders>
+              <w:top w:val="single" w:color="B7C3D0" w:sz="4"/>
+              <w:left w:val="single" w:color="B7C3D0" w:sz="4"/>
+              <w:bottom w:val="single" w:color="B7C3D0" w:sz="4"/>
+              <w:right w:val="single" w:color="B7C3D0" w:sz="4"/>
+            </w:tcBorders>
+            <w:tcMar>
+              <w:top w:type="dxa" w:w="90"/>
+              <w:left w:type="dxa" w:w="120"/>
+              <w:bottom w:type="dxa" w:w="90"/>
+              <w:right w:type="dxa" w:w="120"/>
+            </w:tcMar>
+            <w:vAlign w:val="center"/>
+          </w:tcPr>
+          <w:p>
+            <w:pPr>
+              <w:spacing w:after="0"/>
+            </w:pPr>
+            <w:r>
+              <w:rPr>
+                <w:sz w:val="22"/>
+                <w:szCs w:val="22"/>
+              </w:rPr>
+              <w:t xml:space="preserve"/>
+            </w:r>
+          </w:p>
+        </w:tc>
+      </w:tr>
+    </w:tbl>
+    <w:p>
+      <w:pPr>
+        <w:spacing w:after="160"/>
+      </w:pPr>
+    </w:p>
+    <w:p>
+      <w:pPr>
+        <w:keepNext/>
+        <w:spacing w:after="100" w:before="200"/>
+      </w:pPr>
+      <w:r>
+        <w:rPr>
+          <w:b/>
+          <w:bCs/>
+          <w:color w:val="003B71"/>
+          <w:sz w:val="23"/>
+          <w:szCs w:val="23"/>
+        </w:rPr>
+        <w:t xml:space="preserve">Your choices</w:t>
+      </w:r>
+    </w:p>
+    <w:p>
+      <w:pPr>
+        <w:keepNext/>
+        <w:spacing w:after="120"/>
+      </w:pPr>
+      <w:r>
+        <w:t xml:space="preserve">Record the values from your seeing profile, and describe the reference stars you chose.</w:t>
+      </w:r>
+    </w:p>
+    <w:tbl>
+      <w:tblPr>
+        <w:tblW w:type="dxa" w:w="9638"/>
+        <w:tblBorders>
+          <w:top w:val="single" w:color="auto" w:sz="4"/>
+          <w:left w:val="single" w:color="auto" w:sz="4"/>
+          <w:bottom w:val="single" w:color="auto" w:sz="4"/>
+          <w:right w:val="single" w:color="auto" w:sz="4"/>
+          <w:insideH w:val="single" w:color="auto" w:sz="4"/>
+          <w:insideV w:val="single" w:color="auto" w:sz="4"/>
+        </w:tblBorders>
+      </w:tblPr>
+      <w:tblGrid>
+        <w:gridCol w:w="6338"/>
+        <w:gridCol w:w="3300"/>
+      </w:tblGrid>
+      <w:tr>
+        <w:trPr>
+          <w:cantSplit/>
+          <w:tblHeader/>
+        </w:trPr>
+        <w:tc>
+          <w:tcPr>
+            <w:tcW w:type="dxa" w:w="6338"/>
+            <w:tcBorders>
+              <w:top w:val="single" w:color="B7C3D0" w:sz="4"/>
+              <w:left w:val="single" w:color="B7C3D0" w:sz="4"/>
+              <w:bottom w:val="single" w:color="B7C3D0" w:sz="4"/>
+              <w:right w:val="single" w:color="B7C3D0" w:sz="4"/>
+            </w:tcBorders>
+            <w:shd w:fill="E8EEF5" w:color="auto" w:val="clear"/>
+            <w:tcMar>
+              <w:top w:type="dxa" w:w="90"/>
+              <w:left w:type="dxa" w:w="120"/>
+              <w:bottom w:type="dxa" w:w="90"/>
+              <w:right w:type="dxa" w:w="120"/>
+            </w:tcMar>
+            <w:vAlign w:val="center"/>
+          </w:tcPr>
+          <w:p>
+            <w:pPr>
+              <w:spacing w:after="0"/>
+            </w:pPr>
+            <w:r>
+              <w:rPr>
+                <w:b/>
+                <w:bCs/>
+                <w:sz w:val="20"/>
+                <w:szCs w:val="20"/>
+              </w:rPr>
+              <w:t xml:space="preserve">Measurement</w:t>
+            </w:r>
+          </w:p>
+        </w:tc>
+        <w:tc>
+          <w:tcPr>
+            <w:tcW w:type="dxa" w:w="3300"/>
+            <w:tcBorders>
+              <w:top w:val="single" w:color="B7C3D0" w:sz="4"/>
+              <w:left w:val="single" w:color="B7C3D0" w:sz="4"/>
+              <w:bottom w:val="single" w:color="B7C3D0" w:sz="4"/>
+              <w:right w:val="single" w:color="B7C3D0" w:sz="4"/>
+            </w:tcBorders>
+            <w:shd w:fill="E8EEF5" w:color="auto" w:val="clear"/>
+            <w:tcMar>
+              <w:top w:type="dxa" w:w="90"/>
+              <w:left w:type="dxa" w:w="120"/>
+              <w:bottom w:type="dxa" w:w="90"/>
+              <w:right w:type="dxa" w:w="120"/>
+            </w:tcMar>
+            <w:vAlign w:val="center"/>
+          </w:tcPr>
+          <w:p>
+            <w:pPr>
+              <w:spacing w:after="0"/>
+            </w:pPr>
+            <w:r>
+              <w:rPr>
+                <w:b/>
+                <w:bCs/>
+                <w:sz w:val="20"/>
+                <w:szCs w:val="20"/>
+              </w:rPr>
+              <w:t xml:space="preserve">Your answer</w:t>
+            </w:r>
+          </w:p>
+        </w:tc>
+      </w:tr>
+      <w:tr>
+        <w:trPr>
+          <w:cantSplit/>
+          <w:trHeight w:val="560" w:hRule="atLeast"/>
+        </w:trPr>
+        <w:tc>
+          <w:tcPr>
+            <w:tcW w:type="dxa" w:w="6338"/>
+            <w:tcBorders>
+              <w:top w:val="single" w:color="B7C3D0" w:sz="4"/>
+              <w:left w:val="single" w:color="B7C3D0" w:sz="4"/>
+              <w:bottom w:val="single" w:color="B7C3D0" w:sz="4"/>
+              <w:right w:val="single" w:color="B7C3D0" w:sz="4"/>
+            </w:tcBorders>
+            <w:shd w:fill="E8EEF5" w:color="auto" w:val="clear"/>
+            <w:tcMar>
+              <w:top w:type="dxa" w:w="90"/>
+              <w:left w:type="dxa" w:w="120"/>
+              <w:bottom w:type="dxa" w:w="90"/>
+              <w:right w:type="dxa" w:w="120"/>
+            </w:tcMar>
+            <w:vAlign w:val="center"/>
+          </w:tcPr>
+          <w:p>
+            <w:pPr>
+              <w:spacing w:after="0"/>
+            </w:pPr>
+            <w:r>
+              <w:rPr>
+                <w:b/>
+                <w:bCs/>
+                <w:sz w:val="20"/>
+                <w:szCs w:val="20"/>
+              </w:rPr>
+              <w:t xml:space="preserve">FWHM of WASP-2 (pixels)</w:t>
+            </w:r>
+          </w:p>
+        </w:tc>
+        <w:tc>
+          <w:tcPr>
+            <w:tcW w:type="dxa" w:w="3300"/>
+            <w:tcBorders>
+              <w:top w:val="single" w:color="B7C3D0" w:sz="4"/>
+              <w:left w:val="single" w:color="B7C3D0" w:sz="4"/>
+              <w:bottom w:val="single" w:color="B7C3D0" w:sz="4"/>
+              <w:right w:val="single" w:color="B7C3D0" w:sz="4"/>
+            </w:tcBorders>
+            <w:tcMar>
+              <w:top w:type="dxa" w:w="90"/>
+              <w:left w:type="dxa" w:w="120"/>
+              <w:bottom w:type="dxa" w:w="90"/>
+              <w:right w:type="dxa" w:w="120"/>
+            </w:tcMar>
+            <w:vAlign w:val="center"/>
+          </w:tcPr>
+          <w:p>
+            <w:pPr>
+              <w:spacing w:after="0"/>
+            </w:pPr>
+            <w:r>
+              <w:rPr>
+                <w:sz w:val="22"/>
+                <w:szCs w:val="22"/>
+              </w:rPr>
+              <w:t xml:space="preserve"/>
+            </w:r>
+          </w:p>
+        </w:tc>
+      </w:tr>
+      <w:tr>
+        <w:trPr>
+          <w:cantSplit/>
+          <w:trHeight w:val="560" w:hRule="atLeast"/>
+        </w:trPr>
+        <w:tc>
+          <w:tcPr>
+            <w:tcW w:type="dxa" w:w="6338"/>
+            <w:tcBorders>
+              <w:top w:val="single" w:color="B7C3D0" w:sz="4"/>
+              <w:left w:val="single" w:color="B7C3D0" w:sz="4"/>
+              <w:bottom w:val="single" w:color="B7C3D0" w:sz="4"/>
+              <w:right w:val="single" w:color="B7C3D0" w:sz="4"/>
+            </w:tcBorders>
+            <w:shd w:fill="E8EEF5" w:color="auto" w:val="clear"/>
+            <w:tcMar>
+              <w:top w:type="dxa" w:w="90"/>
+              <w:left w:type="dxa" w:w="120"/>
+              <w:bottom w:type="dxa" w:w="90"/>
+              <w:right w:type="dxa" w:w="120"/>
+            </w:tcMar>
+            <w:vAlign w:val="center"/>
+          </w:tcPr>
+          <w:p>
+            <w:pPr>
+              <w:spacing w:after="0"/>
+            </w:pPr>
+            <w:r>
+              <w:rPr>
+                <w:b/>
+                <w:bCs/>
+                <w:sz w:val="20"/>
+                <w:szCs w:val="20"/>
+              </w:rPr>
+              <w:t xml:space="preserve">Aperture radius (pixels)</w:t>
+            </w:r>
+          </w:p>
+        </w:tc>
+        <w:tc>
+          <w:tcPr>
+            <w:tcW w:type="dxa" w:w="3300"/>
+            <w:tcBorders>
+              <w:top w:val="single" w:color="B7C3D0" w:sz="4"/>
+              <w:left w:val="single" w:color="B7C3D0" w:sz="4"/>
+              <w:bottom w:val="single" w:color="B7C3D0" w:sz="4"/>
+              <w:right w:val="single" w:color="B7C3D0" w:sz="4"/>
+            </w:tcBorders>
+            <w:tcMar>
+              <w:top w:type="dxa" w:w="90"/>
+              <w:left w:type="dxa" w:w="120"/>
+              <w:bottom w:type="dxa" w:w="90"/>
+              <w:right w:type="dxa" w:w="120"/>
+            </w:tcMar>
+            <w:vAlign w:val="center"/>
+          </w:tcPr>
+          <w:p>
+            <w:pPr>
+              <w:spacing w:after="0"/>
+            </w:pPr>
+            <w:r>
+              <w:rPr>
+                <w:sz w:val="22"/>
+                <w:szCs w:val="22"/>
+              </w:rPr>
+              <w:t xml:space="preserve"/>
+            </w:r>
+          </w:p>
+        </w:tc>
+      </w:tr>
+      <w:tr>
+        <w:trPr>
+          <w:cantSplit/>
+          <w:trHeight w:val="560" w:hRule="atLeast"/>
+        </w:trPr>
+        <w:tc>
+          <w:tcPr>
+            <w:tcW w:type="dxa" w:w="6338"/>
+            <w:tcBorders>
+              <w:top w:val="single" w:color="B7C3D0" w:sz="4"/>
+              <w:left w:val="single" w:color="B7C3D0" w:sz="4"/>
+              <w:bottom w:val="single" w:color="B7C3D0" w:sz="4"/>
+              <w:right w:val="single" w:color="B7C3D0" w:sz="4"/>
+            </w:tcBorders>
+            <w:shd w:fill="E8EEF5" w:color="auto" w:val="clear"/>
+            <w:tcMar>
+              <w:top w:type="dxa" w:w="90"/>
+              <w:left w:type="dxa" w:w="120"/>
+              <w:bottom w:type="dxa" w:w="90"/>
+              <w:right w:type="dxa" w:w="120"/>
+            </w:tcMar>
+            <w:vAlign w:val="center"/>
+          </w:tcPr>
+          <w:p>
+            <w:pPr>
+              <w:spacing w:after="0"/>
+            </w:pPr>
+            <w:r>
+              <w:rPr>
+                <w:b/>
+                <w:bCs/>
+                <w:sz w:val="20"/>
+                <w:szCs w:val="20"/>
+              </w:rPr>
+              <w:t xml:space="preserve">Background annulus, inner and outer radius (pixels)</w:t>
+            </w:r>
+          </w:p>
+        </w:tc>
+        <w:tc>
+          <w:tcPr>
+            <w:tcW w:type="dxa" w:w="3300"/>
+            <w:tcBorders>
+              <w:top w:val="single" w:color="B7C3D0" w:sz="4"/>
+              <w:left w:val="single" w:color="B7C3D0" w:sz="4"/>
+              <w:bottom w:val="single" w:color="B7C3D0" w:sz="4"/>
+              <w:right w:val="single" w:color="B7C3D0" w:sz="4"/>
+            </w:tcBorders>
+            <w:tcMar>
+              <w:top w:type="dxa" w:w="90"/>
+              <w:left w:type="dxa" w:w="120"/>
+              <w:bottom w:type="dxa" w:w="90"/>
+              <w:right w:type="dxa" w:w="120"/>
+            </w:tcMar>
+            <w:vAlign w:val="center"/>
+          </w:tcPr>
+          <w:p>
+            <w:pPr>
+              <w:spacing w:after="0"/>
+            </w:pPr>
+            <w:r>
+              <w:rPr>
+                <w:sz w:val="22"/>
+                <w:szCs w:val="22"/>
+              </w:rPr>
+              <w:t xml:space="preserve"/>
+            </w:r>
+          </w:p>
+        </w:tc>
+      </w:tr>
+      <w:tr>
+        <w:trPr>
+          <w:cantSplit/>
+          <w:trHeight w:val="560" w:hRule="atLeast"/>
+        </w:trPr>
+        <w:tc>
+          <w:tcPr>
+            <w:tcW w:type="dxa" w:w="6338"/>
+            <w:tcBorders>
+              <w:top w:val="single" w:color="B7C3D0" w:sz="4"/>
+              <w:left w:val="single" w:color="B7C3D0" w:sz="4"/>
+              <w:bottom w:val="single" w:color="B7C3D0" w:sz="4"/>
+              <w:right w:val="single" w:color="B7C3D0" w:sz="4"/>
+            </w:tcBorders>
+            <w:shd w:fill="E8EEF5" w:color="auto" w:val="clear"/>
+            <w:tcMar>
+              <w:top w:type="dxa" w:w="90"/>
+              <w:left w:type="dxa" w:w="120"/>
+              <w:bottom w:type="dxa" w:w="90"/>
+              <w:right w:type="dxa" w:w="120"/>
+            </w:tcMar>
+            <w:vAlign w:val="center"/>
+          </w:tcPr>
+          <w:p>
+            <w:pPr>
+              <w:spacing w:after="0"/>
+            </w:pPr>
+            <w:r>
+              <w:rPr>
+                <w:b/>
+                <w:bCs/>
+                <w:sz w:val="20"/>
+                <w:szCs w:val="20"/>
+              </w:rPr>
+              <w:t xml:space="preserve">Is the aperture radius between 1.5 and 2 times the FWHM?</w:t>
+            </w:r>
+          </w:p>
+        </w:tc>
+        <w:tc>
+          <w:tcPr>
+            <w:tcW w:type="dxa" w:w="3300"/>
+            <w:tcBorders>
+              <w:top w:val="single" w:color="B7C3D0" w:sz="4"/>
+              <w:left w:val="single" w:color="B7C3D0" w:sz="4"/>
+              <w:bottom w:val="single" w:color="B7C3D0" w:sz="4"/>
+              <w:right w:val="single" w:color="B7C3D0" w:sz="4"/>
+            </w:tcBorders>
+            <w:tcMar>
+              <w:top w:type="dxa" w:w="90"/>
+              <w:left w:type="dxa" w:w="120"/>
+              <w:bottom w:type="dxa" w:w="90"/>
+              <w:right w:type="dxa" w:w="120"/>
+            </w:tcMar>
+            <w:vAlign w:val="center"/>
+          </w:tcPr>
+          <w:p>
+            <w:pPr>
+              <w:spacing w:after="0"/>
+            </w:pPr>
+            <w:r>
+              <w:rPr>
+                <w:sz w:val="22"/>
+                <w:szCs w:val="22"/>
+              </w:rPr>
+              <w:t xml:space="preserve"/>
+            </w:r>
+          </w:p>
+        </w:tc>
+      </w:tr>
+    </w:tbl>
+    <w:p>
+      <w:pPr>
+        <w:spacing w:after="160"/>
+      </w:pPr>
+    </w:p>
+    <w:p>
+      <w:pPr>
+        <w:keepNext/>
+        <w:spacing w:after="120"/>
+      </w:pPr>
+      <w:r>
+        <w:t xml:space="preserve">Where in the image are your three reference stars, and why did you choose them?</w:t>
+      </w:r>
+    </w:p>
+    <w:tbl>
+      <w:tblPr>
+        <w:tblW w:type="dxa" w:w="9638"/>
+        <w:tblBorders>
+          <w:top w:val="single" w:color="auto" w:sz="4"/>
+          <w:left w:val="single" w:color="auto" w:sz="4"/>
+          <w:bottom w:val="single" w:color="auto" w:sz="4"/>
+          <w:right w:val="single" w:color="auto" w:sz="4"/>
+          <w:insideH w:val="single" w:color="auto" w:sz="4"/>
+          <w:insideV w:val="single" w:color="auto" w:sz="4"/>
+        </w:tblBorders>
+      </w:tblPr>
+      <w:tblGrid>
+        <w:gridCol w:w="9638"/>
+      </w:tblGrid>
+      <w:tr>
+        <w:trPr>
+          <w:trHeight w:val="2400" w:hRule="atLeast"/>
+        </w:trPr>
+        <w:tc>
+          <w:tcPr>
+            <w:tcW w:type="dxa" w:w="9638"/>
+            <w:tcBorders>
+              <w:top w:val="single" w:color="B7C3D0" w:sz="4"/>
+              <w:left w:val="single" w:color="B7C3D0" w:sz="4"/>
+              <w:bottom w:val="single" w:color="B7C3D0" w:sz="4"/>
+              <w:right w:val="single" w:color="B7C3D0" w:sz="4"/>
+            </w:tcBorders>
+            <w:tcMar>
+              <w:top w:type="dxa" w:w="90"/>
+              <w:left w:type="dxa" w:w="120"/>
+              <w:bottom w:type="dxa" w:w="90"/>
+              <w:right w:type="dxa" w:w="120"/>
+            </w:tcMar>
+            <w:vAlign w:val="top"/>
+          </w:tcPr>
+          <w:p>
+            <w:pPr>
+              <w:spacing w:after="0"/>
+            </w:pPr>
+            <w:r>
+              <w:rPr>
+                <w:i/>
+                <w:iCs/>
+                <w:color w:val="8A8A8A"/>
+              </w:rPr>
+              <w:t xml:space="preserve">Type your answer here</w:t>
+            </w:r>
+          </w:p>
+        </w:tc>
+      </w:tr>
+    </w:tbl>
     <w:p>
       <w:pPr>
         <w:keepNext/>
@@ -455,22 +1989,6 @@
     <w:p>
       <w:pPr>
         <w:keepNext/>
-        <w:spacing w:after="100" w:before="200"/>
-      </w:pPr>
-      <w:r>
-        <w:rPr>
-          <w:b/>
-          <w:bCs/>
-          <w:color w:val="003B71"/>
-          <w:sz w:val="23"/>
-          <w:szCs w:val="23"/>
-        </w:rPr>
-        <w:t xml:space="preserve">Your measurements</w:t>
-      </w:r>
-    </w:p>
-    <w:p>
-      <w:pPr>
-        <w:keepNext/>
         <w:spacing w:after="120"/>
       </w:pPr>
       <w:r>
@@ -490,8 +2008,8 @@
         </w:tblBorders>
       </w:tblPr>
       <w:tblGrid>
-        <w:gridCol w:w="4300"/>
-        <w:gridCol w:w="5338"/>
+        <w:gridCol w:w="6338"/>
+        <w:gridCol w:w="3300"/>
       </w:tblGrid>
       <w:tr>
         <w:trPr>
@@ -500,7 +2018,7 @@
         </w:trPr>
         <w:tc>
           <w:tcPr>
-            <w:tcW w:type="dxa" w:w="4300"/>
+            <w:tcW w:type="dxa" w:w="6338"/>
             <w:tcBorders>
               <w:top w:val="single" w:color="B7C3D0" w:sz="4"/>
               <w:left w:val="single" w:color="B7C3D0" w:sz="4"/>
@@ -533,7 +2051,7 @@
         </w:tc>
         <w:tc>
           <w:tcPr>
-            <w:tcW w:type="dxa" w:w="5338"/>
+            <w:tcW w:type="dxa" w:w="3300"/>
             <w:tcBorders>
               <w:top w:val="single" w:color="B7C3D0" w:sz="4"/>
               <w:left w:val="single" w:color="B7C3D0" w:sz="4"/>
@@ -572,7 +2090,7 @@
         </w:trPr>
         <w:tc>
           <w:tcPr>
-            <w:tcW w:type="dxa" w:w="4300"/>
+            <w:tcW w:type="dxa" w:w="6338"/>
             <w:tcBorders>
               <w:top w:val="single" w:color="B7C3D0" w:sz="4"/>
               <w:left w:val="single" w:color="B7C3D0" w:sz="4"/>
@@ -605,7 +2123,7 @@
         </w:tc>
         <w:tc>
           <w:tcPr>
-            <w:tcW w:type="dxa" w:w="5338"/>
+            <w:tcW w:type="dxa" w:w="3300"/>
             <w:tcBorders>
               <w:top w:val="single" w:color="B7C3D0" w:sz="4"/>
               <w:left w:val="single" w:color="B7C3D0" w:sz="4"/>
@@ -641,7 +2159,7 @@
         </w:trPr>
         <w:tc>
           <w:tcPr>
-            <w:tcW w:type="dxa" w:w="4300"/>
+            <w:tcW w:type="dxa" w:w="6338"/>
             <w:tcBorders>
               <w:top w:val="single" w:color="B7C3D0" w:sz="4"/>
               <w:left w:val="single" w:color="B7C3D0" w:sz="4"/>
@@ -674,7 +2192,7 @@
         </w:tc>
         <w:tc>
           <w:tcPr>
-            <w:tcW w:type="dxa" w:w="5338"/>
+            <w:tcW w:type="dxa" w:w="3300"/>
             <w:tcBorders>
               <w:top w:val="single" w:color="B7C3D0" w:sz="4"/>
               <w:left w:val="single" w:color="B7C3D0" w:sz="4"/>
@@ -858,7 +2376,7 @@
                 <w:b/>
                 <w:bCs/>
               </w:rPr>
-              <w:t xml:space="preserve">Why do we divide the brightness of WASP-2 by the brightness of reference stars, rather than measuring WASP-2 on its own?</w:t>
+              <w:t xml:space="preserve">The archive gives a mass for 51 Pegasi b but no radius. Why?</w:t>
             </w:r>
           </w:p>
         </w:tc>
@@ -915,7 +2433,7 @@
               <w:spacing w:after="0"/>
             </w:pPr>
             <w:r>
-              <w:t xml:space="preserve">To make WASP-2 look brighter, so the dip is easier to see</w:t>
+              <w:t xml:space="preserve">It’s too far away to measure</w:t>
             </w:r>
           </w:p>
         </w:tc>
@@ -972,7 +2490,7 @@
               <w:spacing w:after="0"/>
             </w:pPr>
             <w:r>
-              <w:t xml:space="preserve">Because the reference stars have planets too</w:t>
+              <w:t xml:space="preserve">It was found by the wobble it causes in its star’s motion, and it doesn’t pass in front of its star, so it has never been seen blocking any light</w:t>
             </w:r>
           </w:p>
         </w:tc>
@@ -1029,7 +2547,7 @@
               <w:spacing w:after="0"/>
             </w:pPr>
             <w:r>
-              <w:t xml:space="preserve">Because haze, thin cloud and the star sinking lower in the sky affect all the stars in an image in the same way, so dividing cancels them out</w:t>
+              <w:t xml:space="preserve">It has no solid surface, so it has no radius</w:t>
             </w:r>
           </w:p>
         </w:tc>
@@ -1086,7 +2604,7 @@
               <w:spacing w:after="0"/>
             </w:pPr>
             <w:r>
-              <w:t xml:space="preserve">To convert the brightness into units of the Sun’s brightness</w:t>
+              <w:t xml:space="preserve">Its star is too faint for telescopes to see</w:t>
             </w:r>
           </w:p>
         </w:tc>
@@ -1153,7 +2671,7 @@
                 <w:b/>
                 <w:bCs/>
               </w:rPr>
-              <w:t xml:space="preserve">What makes a good reference star?</w:t>
+              <w:t xml:space="preserve">Why have most known exoplanets been found by the transit method?</w:t>
             </w:r>
           </w:p>
         </w:tc>
@@ -1210,7 +2728,7 @@
               <w:spacing w:after="0"/>
             </w:pPr>
             <w:r>
-              <w:t xml:space="preserve">The brightest star in the image, even if it’s saturated</w:t>
+              <w:t xml:space="preserve">Transiting planets are more common than any other kind</w:t>
             </w:r>
           </w:p>
         </w:tc>
@@ -1267,7 +2785,7 @@
               <w:spacing w:after="0"/>
             </w:pPr>
             <w:r>
-              <w:t xml:space="preserve">A star near the edge of the image, away from the target</w:t>
+              <w:t xml:space="preserve">It’s the only method that works for giant planets</w:t>
             </w:r>
           </w:p>
         </w:tc>
@@ -1324,7 +2842,7 @@
               <w:spacing w:after="0"/>
             </w:pPr>
             <w:r>
-              <w:t xml:space="preserve">A star of similar brightness to the target, with no close neighbours, whose own brightness doesn’t change</w:t>
+              <w:t xml:space="preserve">Space telescopes such as Kepler and TESS can watch hundreds of thousands of stars at once, catching any that dim</w:t>
             </w:r>
           </w:p>
         </w:tc>
@@ -1381,7 +2899,7 @@
               <w:spacing w:after="0"/>
             </w:pPr>
             <w:r>
-              <w:t xml:space="preserve">Any star that’s a different colour from the target</w:t>
+              <w:t xml:space="preserve">Transits make stars much brighter, so they’re easy to spot</w:t>
             </w:r>
           </w:p>
         </w:tc>
@@ -1448,7 +2966,7 @@
                 <w:b/>
                 <w:bCs/>
               </w:rPr>
-              <w:t xml:space="preserve">What is the background annulus (the outer ring around each star) for?</w:t>
+              <w:t xml:space="preserve">The background annulus measures light that didn’t come from the star. Where does that light come from?</w:t>
             </w:r>
           </w:p>
         </w:tc>
@@ -1505,7 +3023,7 @@
               <w:spacing w:after="0"/>
             </w:pPr>
             <w:r>
-              <w:t xml:space="preserve">It collects extra light from the star to make it brighter</w:t>
+              <w:t xml:space="preserve">The planet itself</w:t>
             </w:r>
           </w:p>
         </w:tc>
@@ -1562,7 +3080,7 @@
               <w:spacing w:after="0"/>
             </w:pPr>
             <w:r>
-              <w:t xml:space="preserve">It blocks the light from the planet</w:t>
+              <w:t xml:space="preserve">The star’s outer layers</w:t>
             </w:r>
           </w:p>
         </w:tc>
@@ -1619,7 +3137,7 @@
               <w:spacing w:after="0"/>
             </w:pPr>
             <w:r>
-              <w:t xml:space="preserve">It marks the star’s position so the images can be aligned</w:t>
+              <w:t xml:space="preserve">The Moon only</w:t>
             </w:r>
           </w:p>
         </w:tc>
@@ -1676,7 +3194,7 @@
               <w:spacing w:after="0"/>
             </w:pPr>
             <w:r>
-              <w:t xml:space="preserve">It measures the glow of the sky around the star, which is then subtracted from the starlight</w:t>
+              <w:t xml:space="preserve">Scattered light, the glow of the atmosphere, and noise from the telescope’s camera</w:t>
             </w:r>
           </w:p>
         </w:tc>
@@ -1743,7 +3261,7 @@
                 <w:b/>
                 <w:bCs/>
               </w:rPr>
-              <w:t xml:space="preserve">During the ingress (the start of a transit), the brightness falls gradually rather than all at once. Why?</w:t>
+              <w:t xml:space="preserve">What would happen if you chose an aperture much bigger than 2 times the FWHM?</w:t>
             </w:r>
           </w:p>
         </w:tc>
@@ -1800,7 +3318,7 @@
               <w:spacing w:after="0"/>
             </w:pPr>
             <w:r>
-              <w:t xml:space="preserve">The planet is moving onto the face of the star, so it covers more and more of the star until it’s fully in front</w:t>
+              <w:t xml:space="preserve">It would miss some of the star’s light</w:t>
             </w:r>
           </w:p>
         </w:tc>
@@ -1857,7 +3375,7 @@
               <w:spacing w:after="0"/>
             </w:pPr>
             <w:r>
-              <w:t xml:space="preserve">The planet is moving behind the star</w:t>
+              <w:t xml:space="preserve">It would collect more sky, and possibly light from neighbouring stars, adding noise to your light curve</w:t>
             </w:r>
           </w:p>
         </w:tc>
@@ -1914,7 +3432,7 @@
               <w:spacing w:after="0"/>
             </w:pPr>
             <w:r>
-              <w:t xml:space="preserve">The star is slowly shrinking</w:t>
+              <w:t xml:space="preserve">The star would look brighter, so the transit would look deeper</w:t>
             </w:r>
           </w:p>
         </w:tc>
@@ -1971,7 +3489,597 @@
               <w:spacing w:after="0"/>
             </w:pPr>
             <w:r>
-              <w:t xml:space="preserve">The telescope takes time to refocus</w:t>
+              <w:t xml:space="preserve">Nothing would change</w:t>
+            </w:r>
+          </w:p>
+        </w:tc>
+      </w:tr>
+    </w:tbl>
+    <w:p>
+      <w:pPr>
+        <w:spacing w:after="160"/>
+      </w:pPr>
+    </w:p>
+    <w:tbl>
+      <w:tblPr>
+        <w:tblW w:type="dxa" w:w="9638"/>
+        <w:tblBorders>
+          <w:top w:val="single" w:color="auto" w:sz="4"/>
+          <w:left w:val="single" w:color="auto" w:sz="4"/>
+          <w:bottom w:val="single" w:color="auto" w:sz="4"/>
+          <w:right w:val="single" w:color="auto" w:sz="4"/>
+          <w:insideH w:val="single" w:color="auto" w:sz="4"/>
+          <w:insideV w:val="single" w:color="auto" w:sz="4"/>
+        </w:tblBorders>
+      </w:tblPr>
+      <w:tblGrid>
+        <w:gridCol w:w="800"/>
+        <w:gridCol w:w="8838"/>
+      </w:tblGrid>
+      <w:tr>
+        <w:trPr>
+          <w:cantSplit/>
+        </w:trPr>
+        <w:tc>
+          <w:tcPr>
+            <w:tcW w:type="dxa" w:w="9638"/>
+            <w:gridSpan w:val="2"/>
+            <w:tcBorders>
+              <w:top w:val="single" w:color="B7C3D0" w:sz="4"/>
+              <w:left w:val="single" w:color="B7C3D0" w:sz="4"/>
+              <w:bottom w:val="single" w:color="B7C3D0" w:sz="4"/>
+              <w:right w:val="single" w:color="B7C3D0" w:sz="4"/>
+            </w:tcBorders>
+            <w:shd w:fill="E8EEF5" w:color="auto" w:val="clear"/>
+            <w:tcMar>
+              <w:top w:type="dxa" w:w="90"/>
+              <w:left w:type="dxa" w:w="120"/>
+              <w:bottom w:type="dxa" w:w="90"/>
+              <w:right w:type="dxa" w:w="120"/>
+            </w:tcMar>
+          </w:tcPr>
+          <w:p>
+            <w:pPr>
+              <w:keepNext/>
+              <w:spacing w:after="0"/>
+            </w:pPr>
+            <w:r>
+              <w:rPr>
+                <w:b/>
+                <w:bCs/>
+                <w:color w:val="003B71"/>
+              </w:rPr>
+              <w:t xml:space="preserve">Question 5. </w:t>
+            </w:r>
+            <w:r>
+              <w:rPr>
+                <w:b/>
+                <w:bCs/>
+              </w:rPr>
+              <w:t xml:space="preserve">Why do we divide the brightness of WASP-2 by the brightness of reference stars, rather than measuring WASP-2 on its own?</w:t>
+            </w:r>
+          </w:p>
+        </w:tc>
+      </w:tr>
+      <w:tr>
+        <w:trPr>
+          <w:cantSplit/>
+        </w:trPr>
+        <w:tc>
+          <w:tcPr>
+            <w:tcW w:type="dxa" w:w="800"/>
+            <w:tcBorders>
+              <w:top w:val="single" w:color="B7C3D0" w:sz="4"/>
+              <w:left w:val="single" w:color="B7C3D0" w:sz="4"/>
+              <w:bottom w:val="single" w:color="B7C3D0" w:sz="4"/>
+              <w:right w:val="single" w:color="B7C3D0" w:sz="4"/>
+            </w:tcBorders>
+            <w:tcMar>
+              <w:top w:type="dxa" w:w="90"/>
+              <w:left w:type="dxa" w:w="120"/>
+              <w:bottom w:type="dxa" w:w="90"/>
+              <w:right w:type="dxa" w:w="120"/>
+            </w:tcMar>
+            <w:vAlign w:val="center"/>
+          </w:tcPr>
+          <w:p>
+            <w:pPr>
+              <w:keepNext/>
+              <w:spacing w:after="0"/>
+              <w:jc w:val="center"/>
+            </w:pPr>
+          </w:p>
+        </w:tc>
+        <w:tc>
+          <w:tcPr>
+            <w:tcW w:type="dxa" w:w="8838"/>
+            <w:tcBorders>
+              <w:top w:val="single" w:color="B7C3D0" w:sz="4"/>
+              <w:left w:val="single" w:color="B7C3D0" w:sz="4"/>
+              <w:bottom w:val="single" w:color="B7C3D0" w:sz="4"/>
+              <w:right w:val="single" w:color="B7C3D0" w:sz="4"/>
+            </w:tcBorders>
+            <w:tcMar>
+              <w:top w:type="dxa" w:w="90"/>
+              <w:left w:type="dxa" w:w="120"/>
+              <w:bottom w:type="dxa" w:w="90"/>
+              <w:right w:type="dxa" w:w="120"/>
+            </w:tcMar>
+            <w:vAlign w:val="center"/>
+          </w:tcPr>
+          <w:p>
+            <w:pPr>
+              <w:keepNext/>
+              <w:spacing w:after="0"/>
+            </w:pPr>
+            <w:r>
+              <w:t xml:space="preserve">Because haze, thin cloud and the star sinking lower in the sky affect all the stars in an image in the same way, so dividing cancels them out</w:t>
+            </w:r>
+          </w:p>
+        </w:tc>
+      </w:tr>
+      <w:tr>
+        <w:trPr>
+          <w:cantSplit/>
+        </w:trPr>
+        <w:tc>
+          <w:tcPr>
+            <w:tcW w:type="dxa" w:w="800"/>
+            <w:tcBorders>
+              <w:top w:val="single" w:color="B7C3D0" w:sz="4"/>
+              <w:left w:val="single" w:color="B7C3D0" w:sz="4"/>
+              <w:bottom w:val="single" w:color="B7C3D0" w:sz="4"/>
+              <w:right w:val="single" w:color="B7C3D0" w:sz="4"/>
+            </w:tcBorders>
+            <w:tcMar>
+              <w:top w:type="dxa" w:w="90"/>
+              <w:left w:type="dxa" w:w="120"/>
+              <w:bottom w:type="dxa" w:w="90"/>
+              <w:right w:type="dxa" w:w="120"/>
+            </w:tcMar>
+            <w:vAlign w:val="center"/>
+          </w:tcPr>
+          <w:p>
+            <w:pPr>
+              <w:keepNext/>
+              <w:spacing w:after="0"/>
+              <w:jc w:val="center"/>
+            </w:pPr>
+          </w:p>
+        </w:tc>
+        <w:tc>
+          <w:tcPr>
+            <w:tcW w:type="dxa" w:w="8838"/>
+            <w:tcBorders>
+              <w:top w:val="single" w:color="B7C3D0" w:sz="4"/>
+              <w:left w:val="single" w:color="B7C3D0" w:sz="4"/>
+              <w:bottom w:val="single" w:color="B7C3D0" w:sz="4"/>
+              <w:right w:val="single" w:color="B7C3D0" w:sz="4"/>
+            </w:tcBorders>
+            <w:tcMar>
+              <w:top w:type="dxa" w:w="90"/>
+              <w:left w:type="dxa" w:w="120"/>
+              <w:bottom w:type="dxa" w:w="90"/>
+              <w:right w:type="dxa" w:w="120"/>
+            </w:tcMar>
+            <w:vAlign w:val="center"/>
+          </w:tcPr>
+          <w:p>
+            <w:pPr>
+              <w:keepNext/>
+              <w:spacing w:after="0"/>
+            </w:pPr>
+            <w:r>
+              <w:t xml:space="preserve">To make WASP-2 look brighter, so the dip is easier to see</w:t>
+            </w:r>
+          </w:p>
+        </w:tc>
+      </w:tr>
+      <w:tr>
+        <w:trPr>
+          <w:cantSplit/>
+        </w:trPr>
+        <w:tc>
+          <w:tcPr>
+            <w:tcW w:type="dxa" w:w="800"/>
+            <w:tcBorders>
+              <w:top w:val="single" w:color="B7C3D0" w:sz="4"/>
+              <w:left w:val="single" w:color="B7C3D0" w:sz="4"/>
+              <w:bottom w:val="single" w:color="B7C3D0" w:sz="4"/>
+              <w:right w:val="single" w:color="B7C3D0" w:sz="4"/>
+            </w:tcBorders>
+            <w:tcMar>
+              <w:top w:type="dxa" w:w="90"/>
+              <w:left w:type="dxa" w:w="120"/>
+              <w:bottom w:type="dxa" w:w="90"/>
+              <w:right w:type="dxa" w:w="120"/>
+            </w:tcMar>
+            <w:vAlign w:val="center"/>
+          </w:tcPr>
+          <w:p>
+            <w:pPr>
+              <w:keepNext/>
+              <w:spacing w:after="0"/>
+              <w:jc w:val="center"/>
+            </w:pPr>
+          </w:p>
+        </w:tc>
+        <w:tc>
+          <w:tcPr>
+            <w:tcW w:type="dxa" w:w="8838"/>
+            <w:tcBorders>
+              <w:top w:val="single" w:color="B7C3D0" w:sz="4"/>
+              <w:left w:val="single" w:color="B7C3D0" w:sz="4"/>
+              <w:bottom w:val="single" w:color="B7C3D0" w:sz="4"/>
+              <w:right w:val="single" w:color="B7C3D0" w:sz="4"/>
+            </w:tcBorders>
+            <w:tcMar>
+              <w:top w:type="dxa" w:w="90"/>
+              <w:left w:type="dxa" w:w="120"/>
+              <w:bottom w:type="dxa" w:w="90"/>
+              <w:right w:type="dxa" w:w="120"/>
+            </w:tcMar>
+            <w:vAlign w:val="center"/>
+          </w:tcPr>
+          <w:p>
+            <w:pPr>
+              <w:keepNext/>
+              <w:spacing w:after="0"/>
+            </w:pPr>
+            <w:r>
+              <w:t xml:space="preserve">Because the reference stars have planets too</w:t>
+            </w:r>
+          </w:p>
+        </w:tc>
+      </w:tr>
+      <w:tr>
+        <w:trPr>
+          <w:cantSplit/>
+        </w:trPr>
+        <w:tc>
+          <w:tcPr>
+            <w:tcW w:type="dxa" w:w="800"/>
+            <w:tcBorders>
+              <w:top w:val="single" w:color="B7C3D0" w:sz="4"/>
+              <w:left w:val="single" w:color="B7C3D0" w:sz="4"/>
+              <w:bottom w:val="single" w:color="B7C3D0" w:sz="4"/>
+              <w:right w:val="single" w:color="B7C3D0" w:sz="4"/>
+            </w:tcBorders>
+            <w:tcMar>
+              <w:top w:type="dxa" w:w="90"/>
+              <w:left w:type="dxa" w:w="120"/>
+              <w:bottom w:type="dxa" w:w="90"/>
+              <w:right w:type="dxa" w:w="120"/>
+            </w:tcMar>
+            <w:vAlign w:val="center"/>
+          </w:tcPr>
+          <w:p>
+            <w:pPr>
+              <w:keepNext w:val="false"/>
+              <w:spacing w:after="0"/>
+              <w:jc w:val="center"/>
+            </w:pPr>
+          </w:p>
+        </w:tc>
+        <w:tc>
+          <w:tcPr>
+            <w:tcW w:type="dxa" w:w="8838"/>
+            <w:tcBorders>
+              <w:top w:val="single" w:color="B7C3D0" w:sz="4"/>
+              <w:left w:val="single" w:color="B7C3D0" w:sz="4"/>
+              <w:bottom w:val="single" w:color="B7C3D0" w:sz="4"/>
+              <w:right w:val="single" w:color="B7C3D0" w:sz="4"/>
+            </w:tcBorders>
+            <w:tcMar>
+              <w:top w:type="dxa" w:w="90"/>
+              <w:left w:type="dxa" w:w="120"/>
+              <w:bottom w:type="dxa" w:w="90"/>
+              <w:right w:type="dxa" w:w="120"/>
+            </w:tcMar>
+            <w:vAlign w:val="center"/>
+          </w:tcPr>
+          <w:p>
+            <w:pPr>
+              <w:keepNext w:val="false"/>
+              <w:spacing w:after="0"/>
+            </w:pPr>
+            <w:r>
+              <w:t xml:space="preserve">To convert the brightness into units of the Sun’s brightness</w:t>
+            </w:r>
+          </w:p>
+        </w:tc>
+      </w:tr>
+    </w:tbl>
+    <w:p>
+      <w:pPr>
+        <w:spacing w:after="160"/>
+      </w:pPr>
+    </w:p>
+    <w:tbl>
+      <w:tblPr>
+        <w:tblW w:type="dxa" w:w="9638"/>
+        <w:tblBorders>
+          <w:top w:val="single" w:color="auto" w:sz="4"/>
+          <w:left w:val="single" w:color="auto" w:sz="4"/>
+          <w:bottom w:val="single" w:color="auto" w:sz="4"/>
+          <w:right w:val="single" w:color="auto" w:sz="4"/>
+          <w:insideH w:val="single" w:color="auto" w:sz="4"/>
+          <w:insideV w:val="single" w:color="auto" w:sz="4"/>
+        </w:tblBorders>
+      </w:tblPr>
+      <w:tblGrid>
+        <w:gridCol w:w="800"/>
+        <w:gridCol w:w="8838"/>
+      </w:tblGrid>
+      <w:tr>
+        <w:trPr>
+          <w:cantSplit/>
+        </w:trPr>
+        <w:tc>
+          <w:tcPr>
+            <w:tcW w:type="dxa" w:w="9638"/>
+            <w:gridSpan w:val="2"/>
+            <w:tcBorders>
+              <w:top w:val="single" w:color="B7C3D0" w:sz="4"/>
+              <w:left w:val="single" w:color="B7C3D0" w:sz="4"/>
+              <w:bottom w:val="single" w:color="B7C3D0" w:sz="4"/>
+              <w:right w:val="single" w:color="B7C3D0" w:sz="4"/>
+            </w:tcBorders>
+            <w:shd w:fill="E8EEF5" w:color="auto" w:val="clear"/>
+            <w:tcMar>
+              <w:top w:type="dxa" w:w="90"/>
+              <w:left w:type="dxa" w:w="120"/>
+              <w:bottom w:type="dxa" w:w="90"/>
+              <w:right w:type="dxa" w:w="120"/>
+            </w:tcMar>
+          </w:tcPr>
+          <w:p>
+            <w:pPr>
+              <w:keepNext/>
+              <w:spacing w:after="0"/>
+            </w:pPr>
+            <w:r>
+              <w:rPr>
+                <w:b/>
+                <w:bCs/>
+                <w:color w:val="003B71"/>
+              </w:rPr>
+              <w:t xml:space="preserve">Question 6. </w:t>
+            </w:r>
+            <w:r>
+              <w:rPr>
+                <w:b/>
+                <w:bCs/>
+              </w:rPr>
+              <w:t xml:space="preserve">Does your light curve tell you how bright WASP-2 really is?</w:t>
+            </w:r>
+          </w:p>
+        </w:tc>
+      </w:tr>
+      <w:tr>
+        <w:trPr>
+          <w:cantSplit/>
+        </w:trPr>
+        <w:tc>
+          <w:tcPr>
+            <w:tcW w:type="dxa" w:w="800"/>
+            <w:tcBorders>
+              <w:top w:val="single" w:color="B7C3D0" w:sz="4"/>
+              <w:left w:val="single" w:color="B7C3D0" w:sz="4"/>
+              <w:bottom w:val="single" w:color="B7C3D0" w:sz="4"/>
+              <w:right w:val="single" w:color="B7C3D0" w:sz="4"/>
+            </w:tcBorders>
+            <w:tcMar>
+              <w:top w:type="dxa" w:w="90"/>
+              <w:left w:type="dxa" w:w="120"/>
+              <w:bottom w:type="dxa" w:w="90"/>
+              <w:right w:type="dxa" w:w="120"/>
+            </w:tcMar>
+            <w:vAlign w:val="center"/>
+          </w:tcPr>
+          <w:p>
+            <w:pPr>
+              <w:keepNext/>
+              <w:spacing w:after="0"/>
+              <w:jc w:val="center"/>
+            </w:pPr>
+          </w:p>
+        </w:tc>
+        <w:tc>
+          <w:tcPr>
+            <w:tcW w:type="dxa" w:w="8838"/>
+            <w:tcBorders>
+              <w:top w:val="single" w:color="B7C3D0" w:sz="4"/>
+              <w:left w:val="single" w:color="B7C3D0" w:sz="4"/>
+              <w:bottom w:val="single" w:color="B7C3D0" w:sz="4"/>
+              <w:right w:val="single" w:color="B7C3D0" w:sz="4"/>
+            </w:tcBorders>
+            <w:tcMar>
+              <w:top w:type="dxa" w:w="90"/>
+              <w:left w:type="dxa" w:w="120"/>
+              <w:bottom w:type="dxa" w:w="90"/>
+              <w:right w:type="dxa" w:w="120"/>
+            </w:tcMar>
+            <w:vAlign w:val="center"/>
+          </w:tcPr>
+          <w:p>
+            <w:pPr>
+              <w:keepNext/>
+              <w:spacing w:after="0"/>
+            </w:pPr>
+            <w:r>
+              <w:t xml:space="preserve">Yes, in watts</w:t>
+            </w:r>
+          </w:p>
+        </w:tc>
+      </w:tr>
+      <w:tr>
+        <w:trPr>
+          <w:cantSplit/>
+        </w:trPr>
+        <w:tc>
+          <w:tcPr>
+            <w:tcW w:type="dxa" w:w="800"/>
+            <w:tcBorders>
+              <w:top w:val="single" w:color="B7C3D0" w:sz="4"/>
+              <w:left w:val="single" w:color="B7C3D0" w:sz="4"/>
+              <w:bottom w:val="single" w:color="B7C3D0" w:sz="4"/>
+              <w:right w:val="single" w:color="B7C3D0" w:sz="4"/>
+            </w:tcBorders>
+            <w:tcMar>
+              <w:top w:type="dxa" w:w="90"/>
+              <w:left w:type="dxa" w:w="120"/>
+              <w:bottom w:type="dxa" w:w="90"/>
+              <w:right w:type="dxa" w:w="120"/>
+            </w:tcMar>
+            <w:vAlign w:val="center"/>
+          </w:tcPr>
+          <w:p>
+            <w:pPr>
+              <w:keepNext/>
+              <w:spacing w:after="0"/>
+              <w:jc w:val="center"/>
+            </w:pPr>
+          </w:p>
+        </w:tc>
+        <w:tc>
+          <w:tcPr>
+            <w:tcW w:type="dxa" w:w="8838"/>
+            <w:tcBorders>
+              <w:top w:val="single" w:color="B7C3D0" w:sz="4"/>
+              <w:left w:val="single" w:color="B7C3D0" w:sz="4"/>
+              <w:bottom w:val="single" w:color="B7C3D0" w:sz="4"/>
+              <w:right w:val="single" w:color="B7C3D0" w:sz="4"/>
+            </w:tcBorders>
+            <w:tcMar>
+              <w:top w:type="dxa" w:w="90"/>
+              <w:left w:type="dxa" w:w="120"/>
+              <w:bottom w:type="dxa" w:w="90"/>
+              <w:right w:type="dxa" w:w="120"/>
+            </w:tcMar>
+            <w:vAlign w:val="center"/>
+          </w:tcPr>
+          <w:p>
+            <w:pPr>
+              <w:keepNext/>
+              <w:spacing w:after="0"/>
+            </w:pPr>
+            <w:r>
+              <w:t xml:space="preserve">Yes, because AstroImageJ calibrates every image</w:t>
+            </w:r>
+          </w:p>
+        </w:tc>
+      </w:tr>
+      <w:tr>
+        <w:trPr>
+          <w:cantSplit/>
+        </w:trPr>
+        <w:tc>
+          <w:tcPr>
+            <w:tcW w:type="dxa" w:w="800"/>
+            <w:tcBorders>
+              <w:top w:val="single" w:color="B7C3D0" w:sz="4"/>
+              <w:left w:val="single" w:color="B7C3D0" w:sz="4"/>
+              <w:bottom w:val="single" w:color="B7C3D0" w:sz="4"/>
+              <w:right w:val="single" w:color="B7C3D0" w:sz="4"/>
+            </w:tcBorders>
+            <w:tcMar>
+              <w:top w:type="dxa" w:w="90"/>
+              <w:left w:type="dxa" w:w="120"/>
+              <w:bottom w:type="dxa" w:w="90"/>
+              <w:right w:type="dxa" w:w="120"/>
+            </w:tcMar>
+            <w:vAlign w:val="center"/>
+          </w:tcPr>
+          <w:p>
+            <w:pPr>
+              <w:keepNext/>
+              <w:spacing w:after="0"/>
+              <w:jc w:val="center"/>
+            </w:pPr>
+          </w:p>
+        </w:tc>
+        <w:tc>
+          <w:tcPr>
+            <w:tcW w:type="dxa" w:w="8838"/>
+            <w:tcBorders>
+              <w:top w:val="single" w:color="B7C3D0" w:sz="4"/>
+              <w:left w:val="single" w:color="B7C3D0" w:sz="4"/>
+              <w:bottom w:val="single" w:color="B7C3D0" w:sz="4"/>
+              <w:right w:val="single" w:color="B7C3D0" w:sz="4"/>
+            </w:tcBorders>
+            <w:tcMar>
+              <w:top w:type="dxa" w:w="90"/>
+              <w:left w:type="dxa" w:w="120"/>
+              <w:bottom w:type="dxa" w:w="90"/>
+              <w:right w:type="dxa" w:w="120"/>
+            </w:tcMar>
+            <w:vAlign w:val="center"/>
+          </w:tcPr>
+          <w:p>
+            <w:pPr>
+              <w:keepNext/>
+              <w:spacing w:after="0"/>
+            </w:pPr>
+            <w:r>
+              <w:t xml:space="preserve">No, it only shows how WASP-2’s brightness changes compared with the reference stars</w:t>
+            </w:r>
+          </w:p>
+        </w:tc>
+      </w:tr>
+      <w:tr>
+        <w:trPr>
+          <w:cantSplit/>
+        </w:trPr>
+        <w:tc>
+          <w:tcPr>
+            <w:tcW w:type="dxa" w:w="800"/>
+            <w:tcBorders>
+              <w:top w:val="single" w:color="B7C3D0" w:sz="4"/>
+              <w:left w:val="single" w:color="B7C3D0" w:sz="4"/>
+              <w:bottom w:val="single" w:color="B7C3D0" w:sz="4"/>
+              <w:right w:val="single" w:color="B7C3D0" w:sz="4"/>
+            </w:tcBorders>
+            <w:tcMar>
+              <w:top w:type="dxa" w:w="90"/>
+              <w:left w:type="dxa" w:w="120"/>
+              <w:bottom w:type="dxa" w:w="90"/>
+              <w:right w:type="dxa" w:w="120"/>
+            </w:tcMar>
+            <w:vAlign w:val="center"/>
+          </w:tcPr>
+          <w:p>
+            <w:pPr>
+              <w:keepNext w:val="false"/>
+              <w:spacing w:after="0"/>
+              <w:jc w:val="center"/>
+            </w:pPr>
+          </w:p>
+        </w:tc>
+        <w:tc>
+          <w:tcPr>
+            <w:tcW w:type="dxa" w:w="8838"/>
+            <w:tcBorders>
+              <w:top w:val="single" w:color="B7C3D0" w:sz="4"/>
+              <w:left w:val="single" w:color="B7C3D0" w:sz="4"/>
+              <w:bottom w:val="single" w:color="B7C3D0" w:sz="4"/>
+              <w:right w:val="single" w:color="B7C3D0" w:sz="4"/>
+            </w:tcBorders>
+            <w:tcMar>
+              <w:top w:type="dxa" w:w="90"/>
+              <w:left w:type="dxa" w:w="120"/>
+              <w:bottom w:type="dxa" w:w="90"/>
+              <w:right w:type="dxa" w:w="120"/>
+            </w:tcMar>
+            <w:vAlign w:val="center"/>
+          </w:tcPr>
+          <w:p>
+            <w:pPr>
+              <w:keepNext w:val="false"/>
+              <w:spacing w:after="0"/>
+            </w:pPr>
+            <w:r>
+              <w:t xml:space="preserve">No, because the images are black and white</w:t>
             </w:r>
           </w:p>
         </w:tc>
@@ -2646,6 +4754,108 @@
           </w:p>
         </w:tc>
       </w:tr>
+      <w:tr>
+        <w:trPr>
+          <w:cantSplit/>
+          <w:trHeight w:val="560" w:hRule="atLeast"/>
+        </w:trPr>
+        <w:tc>
+          <w:tcPr>
+            <w:tcW w:type="dxa" w:w="3600"/>
+            <w:tcBorders>
+              <w:top w:val="single" w:color="B7C3D0" w:sz="4"/>
+              <w:left w:val="single" w:color="B7C3D0" w:sz="4"/>
+              <w:bottom w:val="single" w:color="B7C3D0" w:sz="4"/>
+              <w:right w:val="single" w:color="B7C3D0" w:sz="4"/>
+            </w:tcBorders>
+            <w:shd w:fill="E8EEF5" w:color="auto" w:val="clear"/>
+            <w:tcMar>
+              <w:top w:type="dxa" w:w="90"/>
+              <w:left w:type="dxa" w:w="120"/>
+              <w:bottom w:type="dxa" w:w="90"/>
+              <w:right w:type="dxa" w:w="120"/>
+            </w:tcMar>
+            <w:vAlign w:val="center"/>
+          </w:tcPr>
+          <w:p>
+            <w:pPr>
+              <w:spacing w:after="0"/>
+            </w:pPr>
+            <w:r>
+              <w:rPr>
+                <w:b/>
+                <w:bCs/>
+                <w:sz w:val="20"/>
+                <w:szCs w:val="20"/>
+              </w:rPr>
+              <w:t xml:space="preserve">When would the next transit after the end of the data have happened? (day)</w:t>
+            </w:r>
+          </w:p>
+        </w:tc>
+        <w:tc>
+          <w:tcPr>
+            <w:tcW w:type="dxa" w:w="3019"/>
+            <w:tcBorders>
+              <w:top w:val="single" w:color="B7C3D0" w:sz="4"/>
+              <w:left w:val="single" w:color="B7C3D0" w:sz="4"/>
+              <w:bottom w:val="single" w:color="B7C3D0" w:sz="4"/>
+              <w:right w:val="single" w:color="B7C3D0" w:sz="4"/>
+            </w:tcBorders>
+            <w:tcMar>
+              <w:top w:type="dxa" w:w="90"/>
+              <w:left w:type="dxa" w:w="120"/>
+              <w:bottom w:type="dxa" w:w="90"/>
+              <w:right w:type="dxa" w:w="120"/>
+            </w:tcMar>
+            <w:vAlign w:val="center"/>
+          </w:tcPr>
+          <w:p>
+            <w:pPr>
+              <w:spacing w:after="0"/>
+            </w:pPr>
+            <w:r>
+              <w:rPr>
+                <w:i/>
+                <w:iCs/>
+                <w:color w:val="8A8A8A"/>
+                <w:sz w:val="20"/>
+                <w:szCs w:val="20"/>
+              </w:rPr>
+              <w:t xml:space="preserve">(not needed)</w:t>
+            </w:r>
+          </w:p>
+        </w:tc>
+        <w:tc>
+          <w:tcPr>
+            <w:tcW w:type="dxa" w:w="3019"/>
+            <w:tcBorders>
+              <w:top w:val="single" w:color="B7C3D0" w:sz="4"/>
+              <w:left w:val="single" w:color="B7C3D0" w:sz="4"/>
+              <w:bottom w:val="single" w:color="B7C3D0" w:sz="4"/>
+              <w:right w:val="single" w:color="B7C3D0" w:sz="4"/>
+            </w:tcBorders>
+            <w:tcMar>
+              <w:top w:type="dxa" w:w="90"/>
+              <w:left w:type="dxa" w:w="120"/>
+              <w:bottom w:type="dxa" w:w="90"/>
+              <w:right w:type="dxa" w:w="120"/>
+            </w:tcMar>
+            <w:vAlign w:val="center"/>
+          </w:tcPr>
+          <w:p>
+            <w:pPr>
+              <w:spacing w:after="0"/>
+            </w:pPr>
+            <w:r>
+              <w:rPr>
+                <w:sz w:val="22"/>
+                <w:szCs w:val="22"/>
+              </w:rPr>
+              <w:t xml:space="preserve"/>
+            </w:r>
+          </w:p>
+        </w:tc>
+      </w:tr>
     </w:tbl>
     <w:p>
       <w:pPr>
@@ -2717,7 +4927,7 @@
                 <w:bCs/>
                 <w:color w:val="003B71"/>
               </w:rPr>
-              <w:t xml:space="preserve">Question 5. </w:t>
+              <w:t xml:space="preserve">Question 7. </w:t>
             </w:r>
             <w:r>
               <w:rPr>
@@ -2895,64 +5105,64 @@
               <w:spacing w:after="0"/>
             </w:pPr>
             <w:r>
+              <w:t xml:space="preserve">TESS only measures stars that have planets</w:t>
+            </w:r>
+          </w:p>
+        </w:tc>
+      </w:tr>
+      <w:tr>
+        <w:trPr>
+          <w:cantSplit/>
+        </w:trPr>
+        <w:tc>
+          <w:tcPr>
+            <w:tcW w:type="dxa" w:w="800"/>
+            <w:tcBorders>
+              <w:top w:val="single" w:color="B7C3D0" w:sz="4"/>
+              <w:left w:val="single" w:color="B7C3D0" w:sz="4"/>
+              <w:bottom w:val="single" w:color="B7C3D0" w:sz="4"/>
+              <w:right w:val="single" w:color="B7C3D0" w:sz="4"/>
+            </w:tcBorders>
+            <w:tcMar>
+              <w:top w:type="dxa" w:w="90"/>
+              <w:left w:type="dxa" w:w="120"/>
+              <w:bottom w:type="dxa" w:w="90"/>
+              <w:right w:type="dxa" w:w="120"/>
+            </w:tcMar>
+            <w:vAlign w:val="center"/>
+          </w:tcPr>
+          <w:p>
+            <w:pPr>
+              <w:keepNext w:val="false"/>
+              <w:spacing w:after="0"/>
+              <w:jc w:val="center"/>
+            </w:pPr>
+          </w:p>
+        </w:tc>
+        <w:tc>
+          <w:tcPr>
+            <w:tcW w:type="dxa" w:w="8838"/>
+            <w:tcBorders>
+              <w:top w:val="single" w:color="B7C3D0" w:sz="4"/>
+              <w:left w:val="single" w:color="B7C3D0" w:sz="4"/>
+              <w:bottom w:val="single" w:color="B7C3D0" w:sz="4"/>
+              <w:right w:val="single" w:color="B7C3D0" w:sz="4"/>
+            </w:tcBorders>
+            <w:tcMar>
+              <w:top w:type="dxa" w:w="90"/>
+              <w:left w:type="dxa" w:w="120"/>
+              <w:bottom w:type="dxa" w:w="90"/>
+              <w:right w:type="dxa" w:w="120"/>
+            </w:tcMar>
+            <w:vAlign w:val="center"/>
+          </w:tcPr>
+          <w:p>
+            <w:pPr>
+              <w:keepNext w:val="false"/>
+              <w:spacing w:after="0"/>
+            </w:pPr>
+            <w:r>
               <w:t xml:space="preserve">TESS is above Earth’s atmosphere, and it measured WASP-2 every 2 minutes for weeks without a break</w:t>
-            </w:r>
-          </w:p>
-        </w:tc>
-      </w:tr>
-      <w:tr>
-        <w:trPr>
-          <w:cantSplit/>
-        </w:trPr>
-        <w:tc>
-          <w:tcPr>
-            <w:tcW w:type="dxa" w:w="800"/>
-            <w:tcBorders>
-              <w:top w:val="single" w:color="B7C3D0" w:sz="4"/>
-              <w:left w:val="single" w:color="B7C3D0" w:sz="4"/>
-              <w:bottom w:val="single" w:color="B7C3D0" w:sz="4"/>
-              <w:right w:val="single" w:color="B7C3D0" w:sz="4"/>
-            </w:tcBorders>
-            <w:tcMar>
-              <w:top w:type="dxa" w:w="90"/>
-              <w:left w:type="dxa" w:w="120"/>
-              <w:bottom w:type="dxa" w:w="90"/>
-              <w:right w:type="dxa" w:w="120"/>
-            </w:tcMar>
-            <w:vAlign w:val="center"/>
-          </w:tcPr>
-          <w:p>
-            <w:pPr>
-              <w:keepNext w:val="false"/>
-              <w:spacing w:after="0"/>
-              <w:jc w:val="center"/>
-            </w:pPr>
-          </w:p>
-        </w:tc>
-        <w:tc>
-          <w:tcPr>
-            <w:tcW w:type="dxa" w:w="8838"/>
-            <w:tcBorders>
-              <w:top w:val="single" w:color="B7C3D0" w:sz="4"/>
-              <w:left w:val="single" w:color="B7C3D0" w:sz="4"/>
-              <w:bottom w:val="single" w:color="B7C3D0" w:sz="4"/>
-              <w:right w:val="single" w:color="B7C3D0" w:sz="4"/>
-            </w:tcBorders>
-            <w:tcMar>
-              <w:top w:type="dxa" w:w="90"/>
-              <w:left w:type="dxa" w:w="120"/>
-              <w:bottom w:type="dxa" w:w="90"/>
-              <w:right w:type="dxa" w:w="120"/>
-            </w:tcMar>
-            <w:vAlign w:val="center"/>
-          </w:tcPr>
-          <w:p>
-            <w:pPr>
-              <w:keepNext w:val="false"/>
-              <w:spacing w:after="0"/>
-            </w:pPr>
-            <w:r>
-              <w:t xml:space="preserve">TESS only measures stars that have planets</w:t>
             </w:r>
           </w:p>
         </w:tc>
@@ -3012,14 +5222,14 @@
                 <w:bCs/>
                 <w:color w:val="003B71"/>
               </w:rPr>
-              <w:t xml:space="preserve">Question 6. </w:t>
+              <w:t xml:space="preserve">Question 8. </w:t>
             </w:r>
             <w:r>
               <w:rPr>
                 <w:b/>
                 <w:bCs/>
               </w:rPr>
-              <w:t xml:space="preserve">Is the transit about the same depth from the ground and from space? Why?</w:t>
+              <w:t xml:space="preserve">If a planet were twice as wide as WASP-2b, how deep would its transit be, compared with WASP-2b’s?</w:t>
             </w:r>
           </w:p>
         </w:tc>
@@ -3076,7 +5286,7 @@
               <w:spacing w:after="0"/>
             </w:pPr>
             <w:r>
-              <w:t xml:space="preserve">Yes, roughly, because the depth depends on how much of the star’s face the planet covers, not on the telescope</w:t>
+              <w:t xml:space="preserve">The same depth</w:t>
             </w:r>
           </w:p>
         </w:tc>
@@ -3133,7 +5343,7 @@
               <w:spacing w:after="0"/>
             </w:pPr>
             <w:r>
-              <w:t xml:space="preserve">No, because a bigger telescope always measures a deeper transit</w:t>
+              <w:t xml:space="preserve">Twice as deep</w:t>
             </w:r>
           </w:p>
         </w:tc>
@@ -3190,7 +5400,7 @@
               <w:spacing w:after="0"/>
             </w:pPr>
             <w:r>
-              <w:t xml:space="preserve">No, because the planet has shrunk since 2008</w:t>
+              <w:t xml:space="preserve">Four times as deep</w:t>
             </w:r>
           </w:p>
         </w:tc>
@@ -3247,7 +5457,7 @@
               <w:spacing w:after="0"/>
             </w:pPr>
             <w:r>
-              <w:t xml:space="preserve">Yes, because both telescopes are on Earth</w:t>
+              <w:t xml:space="preserve">Eight times as deep</w:t>
             </w:r>
           </w:p>
         </w:tc>
@@ -3307,14 +5517,14 @@
                 <w:bCs/>
                 <w:color w:val="003B71"/>
               </w:rPr>
-              <w:t xml:space="preserve">Question 7. </w:t>
+              <w:t xml:space="preserve">Question 9. </w:t>
             </w:r>
             <w:r>
               <w:rPr>
                 <w:b/>
                 <w:bCs/>
               </w:rPr>
-              <w:t xml:space="preserve">Jupiter passing in front of the Sun would dim it by about 1%. WASP-2 is a little smaller than the Sun, and WASP-2b dims it by close to 2%. What kind of planet is WASP-2b most likely to be?</w:t>
+              <w:t xml:space="preserve">We only see a transit if the planet’s orbit is almost exactly lined up with our view. What does this mean?</w:t>
             </w:r>
           </w:p>
         </w:tc>
@@ -3371,7 +5581,7 @@
               <w:spacing w:after="0"/>
             </w:pPr>
             <w:r>
-              <w:t xml:space="preserve">A rocky planet about the size of Earth</w:t>
+              <w:t xml:space="preserve">Most planets never pass in front of their stars as seen from Earth, so for every transiting planet we find, many more go unseen</w:t>
             </w:r>
           </w:p>
         </w:tc>
@@ -3428,7 +5638,7 @@
               <w:spacing w:after="0"/>
             </w:pPr>
             <w:r>
-              <w:t xml:space="preserve">A giant planet roughly the size of Jupiter</w:t>
+              <w:t xml:space="preserve">All planets orbit in the same plane as Earth</w:t>
             </w:r>
           </w:p>
         </w:tc>
@@ -3485,7 +5695,7 @@
               <w:spacing w:after="0"/>
             </w:pPr>
             <w:r>
-              <w:t xml:space="preserve">A planet ten times bigger than Jupiter</w:t>
+              <w:t xml:space="preserve">Only planets in our own Solar System can be found this way</w:t>
             </w:r>
           </w:p>
         </w:tc>
@@ -3542,7 +5752,7 @@
               <w:spacing w:after="0"/>
             </w:pPr>
             <w:r>
-              <w:t xml:space="preserve">We can’t tell anything about its size from a transit</w:t>
+              <w:t xml:space="preserve">Every star has a planet that transits</w:t>
             </w:r>
           </w:p>
         </w:tc>
@@ -3602,14 +5812,14 @@
                 <w:bCs/>
                 <w:color w:val="003B71"/>
               </w:rPr>
-              <w:t xml:space="preserve">Question 8. </w:t>
+              <w:t xml:space="preserve">Question 10. </w:t>
             </w:r>
             <w:r>
               <w:rPr>
                 <w:b/>
                 <w:bCs/>
               </w:rPr>
-              <w:t xml:space="preserve">If a planet were twice as wide as WASP-2b, how deep would its transit be, compared with WASP-2b’s?</w:t>
+              <w:t xml:space="preserve">Compared with the planets in our Solar System, what do WASP-2b and 51 Pegasi b have in common?</w:t>
             </w:r>
           </w:p>
         </w:tc>
@@ -3666,7 +5876,7 @@
               <w:spacing w:after="0"/>
             </w:pPr>
             <w:r>
-              <w:t xml:space="preserve">The same depth</w:t>
+              <w:t xml:space="preserve">They’re both small, rocky planets</w:t>
             </w:r>
           </w:p>
         </w:tc>
@@ -3723,7 +5933,7 @@
               <w:spacing w:after="0"/>
             </w:pPr>
             <w:r>
-              <w:t xml:space="preserve">Twice as deep</w:t>
+              <w:t xml:space="preserve">They’re both giant planets that orbit their stars in just a few days, much closer than Mercury is to the Sun</w:t>
             </w:r>
           </w:p>
         </w:tc>
@@ -3780,7 +5990,7 @@
               <w:spacing w:after="0"/>
             </w:pPr>
             <w:r>
-              <w:t xml:space="preserve">Four times as deep</w:t>
+              <w:t xml:space="preserve">They’re both in their stars’ habitable zones</w:t>
             </w:r>
           </w:p>
         </w:tc>
@@ -3837,302 +6047,7 @@
               <w:spacing w:after="0"/>
             </w:pPr>
             <w:r>
-              <w:t xml:space="preserve">Eight times as deep</w:t>
-            </w:r>
-          </w:p>
-        </w:tc>
-      </w:tr>
-    </w:tbl>
-    <w:p>
-      <w:pPr>
-        <w:spacing w:after="160"/>
-      </w:pPr>
-    </w:p>
-    <w:tbl>
-      <w:tblPr>
-        <w:tblW w:type="dxa" w:w="9638"/>
-        <w:tblBorders>
-          <w:top w:val="single" w:color="auto" w:sz="4"/>
-          <w:left w:val="single" w:color="auto" w:sz="4"/>
-          <w:bottom w:val="single" w:color="auto" w:sz="4"/>
-          <w:right w:val="single" w:color="auto" w:sz="4"/>
-          <w:insideH w:val="single" w:color="auto" w:sz="4"/>
-          <w:insideV w:val="single" w:color="auto" w:sz="4"/>
-        </w:tblBorders>
-      </w:tblPr>
-      <w:tblGrid>
-        <w:gridCol w:w="800"/>
-        <w:gridCol w:w="8838"/>
-      </w:tblGrid>
-      <w:tr>
-        <w:trPr>
-          <w:cantSplit/>
-        </w:trPr>
-        <w:tc>
-          <w:tcPr>
-            <w:tcW w:type="dxa" w:w="9638"/>
-            <w:gridSpan w:val="2"/>
-            <w:tcBorders>
-              <w:top w:val="single" w:color="B7C3D0" w:sz="4"/>
-              <w:left w:val="single" w:color="B7C3D0" w:sz="4"/>
-              <w:bottom w:val="single" w:color="B7C3D0" w:sz="4"/>
-              <w:right w:val="single" w:color="B7C3D0" w:sz="4"/>
-            </w:tcBorders>
-            <w:shd w:fill="E8EEF5" w:color="auto" w:val="clear"/>
-            <w:tcMar>
-              <w:top w:type="dxa" w:w="90"/>
-              <w:left w:type="dxa" w:w="120"/>
-              <w:bottom w:type="dxa" w:w="90"/>
-              <w:right w:type="dxa" w:w="120"/>
-            </w:tcMar>
-          </w:tcPr>
-          <w:p>
-            <w:pPr>
-              <w:keepNext/>
-              <w:spacing w:after="0"/>
-            </w:pPr>
-            <w:r>
-              <w:rPr>
-                <w:b/>
-                <w:bCs/>
-                <w:color w:val="003B71"/>
-              </w:rPr>
-              <w:t xml:space="preserve">Question 9. </w:t>
-            </w:r>
-            <w:r>
-              <w:rPr>
-                <w:b/>
-                <w:bCs/>
-              </w:rPr>
-              <w:t xml:space="preserve">Why does the transit method mostly find large planets with short orbits?</w:t>
-            </w:r>
-          </w:p>
-        </w:tc>
-      </w:tr>
-      <w:tr>
-        <w:trPr>
-          <w:cantSplit/>
-        </w:trPr>
-        <w:tc>
-          <w:tcPr>
-            <w:tcW w:type="dxa" w:w="800"/>
-            <w:tcBorders>
-              <w:top w:val="single" w:color="B7C3D0" w:sz="4"/>
-              <w:left w:val="single" w:color="B7C3D0" w:sz="4"/>
-              <w:bottom w:val="single" w:color="B7C3D0" w:sz="4"/>
-              <w:right w:val="single" w:color="B7C3D0" w:sz="4"/>
-            </w:tcBorders>
-            <w:tcMar>
-              <w:top w:type="dxa" w:w="90"/>
-              <w:left w:type="dxa" w:w="120"/>
-              <w:bottom w:type="dxa" w:w="90"/>
-              <w:right w:type="dxa" w:w="120"/>
-            </w:tcMar>
-            <w:vAlign w:val="center"/>
-          </w:tcPr>
-          <w:p>
-            <w:pPr>
-              <w:keepNext/>
-              <w:spacing w:after="0"/>
-              <w:jc w:val="center"/>
-            </w:pPr>
-          </w:p>
-        </w:tc>
-        <w:tc>
-          <w:tcPr>
-            <w:tcW w:type="dxa" w:w="8838"/>
-            <w:tcBorders>
-              <w:top w:val="single" w:color="B7C3D0" w:sz="4"/>
-              <w:left w:val="single" w:color="B7C3D0" w:sz="4"/>
-              <w:bottom w:val="single" w:color="B7C3D0" w:sz="4"/>
-              <w:right w:val="single" w:color="B7C3D0" w:sz="4"/>
-            </w:tcBorders>
-            <w:tcMar>
-              <w:top w:type="dxa" w:w="90"/>
-              <w:left w:type="dxa" w:w="120"/>
-              <w:bottom w:type="dxa" w:w="90"/>
-              <w:right w:type="dxa" w:w="120"/>
-            </w:tcMar>
-            <w:vAlign w:val="center"/>
-          </w:tcPr>
-          <w:p>
-            <w:pPr>
-              <w:keepNext/>
-              <w:spacing w:after="0"/>
-            </w:pPr>
-            <w:r>
-              <w:t xml:space="preserve">Large planets on short orbits are more common than any other kind of planet</w:t>
-            </w:r>
-          </w:p>
-        </w:tc>
-      </w:tr>
-      <w:tr>
-        <w:trPr>
-          <w:cantSplit/>
-        </w:trPr>
-        <w:tc>
-          <w:tcPr>
-            <w:tcW w:type="dxa" w:w="800"/>
-            <w:tcBorders>
-              <w:top w:val="single" w:color="B7C3D0" w:sz="4"/>
-              <w:left w:val="single" w:color="B7C3D0" w:sz="4"/>
-              <w:bottom w:val="single" w:color="B7C3D0" w:sz="4"/>
-              <w:right w:val="single" w:color="B7C3D0" w:sz="4"/>
-            </w:tcBorders>
-            <w:tcMar>
-              <w:top w:type="dxa" w:w="90"/>
-              <w:left w:type="dxa" w:w="120"/>
-              <w:bottom w:type="dxa" w:w="90"/>
-              <w:right w:type="dxa" w:w="120"/>
-            </w:tcMar>
-            <w:vAlign w:val="center"/>
-          </w:tcPr>
-          <w:p>
-            <w:pPr>
-              <w:keepNext/>
-              <w:spacing w:after="0"/>
-              <w:jc w:val="center"/>
-            </w:pPr>
-          </w:p>
-        </w:tc>
-        <w:tc>
-          <w:tcPr>
-            <w:tcW w:type="dxa" w:w="8838"/>
-            <w:tcBorders>
-              <w:top w:val="single" w:color="B7C3D0" w:sz="4"/>
-              <w:left w:val="single" w:color="B7C3D0" w:sz="4"/>
-              <w:bottom w:val="single" w:color="B7C3D0" w:sz="4"/>
-              <w:right w:val="single" w:color="B7C3D0" w:sz="4"/>
-            </w:tcBorders>
-            <w:tcMar>
-              <w:top w:type="dxa" w:w="90"/>
-              <w:left w:type="dxa" w:w="120"/>
-              <w:bottom w:type="dxa" w:w="90"/>
-              <w:right w:type="dxa" w:w="120"/>
-            </w:tcMar>
-            <w:vAlign w:val="center"/>
-          </w:tcPr>
-          <w:p>
-            <w:pPr>
-              <w:keepNext/>
-              <w:spacing w:after="0"/>
-            </w:pPr>
-            <w:r>
-              <w:t xml:space="preserve">Small planets never pass in front of their stars</w:t>
-            </w:r>
-          </w:p>
-        </w:tc>
-      </w:tr>
-      <w:tr>
-        <w:trPr>
-          <w:cantSplit/>
-        </w:trPr>
-        <w:tc>
-          <w:tcPr>
-            <w:tcW w:type="dxa" w:w="800"/>
-            <w:tcBorders>
-              <w:top w:val="single" w:color="B7C3D0" w:sz="4"/>
-              <w:left w:val="single" w:color="B7C3D0" w:sz="4"/>
-              <w:bottom w:val="single" w:color="B7C3D0" w:sz="4"/>
-              <w:right w:val="single" w:color="B7C3D0" w:sz="4"/>
-            </w:tcBorders>
-            <w:tcMar>
-              <w:top w:type="dxa" w:w="90"/>
-              <w:left w:type="dxa" w:w="120"/>
-              <w:bottom w:type="dxa" w:w="90"/>
-              <w:right w:type="dxa" w:w="120"/>
-            </w:tcMar>
-            <w:vAlign w:val="center"/>
-          </w:tcPr>
-          <w:p>
-            <w:pPr>
-              <w:keepNext/>
-              <w:spacing w:after="0"/>
-              <w:jc w:val="center"/>
-            </w:pPr>
-          </w:p>
-        </w:tc>
-        <w:tc>
-          <w:tcPr>
-            <w:tcW w:type="dxa" w:w="8838"/>
-            <w:tcBorders>
-              <w:top w:val="single" w:color="B7C3D0" w:sz="4"/>
-              <w:left w:val="single" w:color="B7C3D0" w:sz="4"/>
-              <w:bottom w:val="single" w:color="B7C3D0" w:sz="4"/>
-              <w:right w:val="single" w:color="B7C3D0" w:sz="4"/>
-            </w:tcBorders>
-            <w:tcMar>
-              <w:top w:type="dxa" w:w="90"/>
-              <w:left w:type="dxa" w:w="120"/>
-              <w:bottom w:type="dxa" w:w="90"/>
-              <w:right w:type="dxa" w:w="120"/>
-            </w:tcMar>
-            <w:vAlign w:val="center"/>
-          </w:tcPr>
-          <w:p>
-            <w:pPr>
-              <w:keepNext/>
-              <w:spacing w:after="0"/>
-            </w:pPr>
-            <w:r>
-              <w:t xml:space="preserve">Telescopes can only see planets that are close to their stars</w:t>
-            </w:r>
-          </w:p>
-        </w:tc>
-      </w:tr>
-      <w:tr>
-        <w:trPr>
-          <w:cantSplit/>
-        </w:trPr>
-        <w:tc>
-          <w:tcPr>
-            <w:tcW w:type="dxa" w:w="800"/>
-            <w:tcBorders>
-              <w:top w:val="single" w:color="B7C3D0" w:sz="4"/>
-              <w:left w:val="single" w:color="B7C3D0" w:sz="4"/>
-              <w:bottom w:val="single" w:color="B7C3D0" w:sz="4"/>
-              <w:right w:val="single" w:color="B7C3D0" w:sz="4"/>
-            </w:tcBorders>
-            <w:tcMar>
-              <w:top w:type="dxa" w:w="90"/>
-              <w:left w:type="dxa" w:w="120"/>
-              <w:bottom w:type="dxa" w:w="90"/>
-              <w:right w:type="dxa" w:w="120"/>
-            </w:tcMar>
-            <w:vAlign w:val="center"/>
-          </w:tcPr>
-          <w:p>
-            <w:pPr>
-              <w:keepNext w:val="false"/>
-              <w:spacing w:after="0"/>
-              <w:jc w:val="center"/>
-            </w:pPr>
-          </w:p>
-        </w:tc>
-        <w:tc>
-          <w:tcPr>
-            <w:tcW w:type="dxa" w:w="8838"/>
-            <w:tcBorders>
-              <w:top w:val="single" w:color="B7C3D0" w:sz="4"/>
-              <w:left w:val="single" w:color="B7C3D0" w:sz="4"/>
-              <w:bottom w:val="single" w:color="B7C3D0" w:sz="4"/>
-              <w:right w:val="single" w:color="B7C3D0" w:sz="4"/>
-            </w:tcBorders>
-            <w:tcMar>
-              <w:top w:type="dxa" w:w="90"/>
-              <w:left w:type="dxa" w:w="120"/>
-              <w:bottom w:type="dxa" w:w="90"/>
-              <w:right w:type="dxa" w:w="120"/>
-            </w:tcMar>
-            <w:vAlign w:val="center"/>
-          </w:tcPr>
-          <w:p>
-            <w:pPr>
-              <w:keepNext w:val="false"/>
-              <w:spacing w:after="0"/>
-            </w:pPr>
-            <w:r>
-              <w:t xml:space="preserve">Large planets make deeper dips, short orbits give many transits to measure, and close-in planets are more likely to be lined up with our view</w:t>
+              <w:t xml:space="preserve">They were both found by the transit method</w:t>
             </w:r>
           </w:p>
         </w:tc>
@@ -4242,7 +6157,7 @@
         <w:spacing w:after="120"/>
       </w:pPr>
       <w:r>
-        <w:t xml:space="preserve">An Earth-sized planet crossing a Sun-like star would dim it by only about 0.01%. Using what you’ve seen in Parts 1 and 2, explain why we need space telescopes like TESS, and many measurements, to find planets like Earth.</w:t>
+        <w:t xml:space="preserve">An Earth-sized planet crossing a Sun-like star would dim it by only about 0.01%, and the transit method favours large planets on short orbits. Using what you’ve seen in Parts 1 and 2, explain why finding planets like Earth needs space telescopes and many measurements.</w:t>
       </w:r>
     </w:p>
     <w:tbl>

</xml_diff>

<commit_message>
C2: students find WASP-2 and choose apertures themselves; rebuild questions (#13)
Part 1 now starts with WASP-2b and 51 Pegasi b in the NASA Exoplanet
Archive, then students find WASP-2 with Aladin Lite instead of a finder
chart, pick their own reference stars and read their aperture from the
seeing profile. Steps follow the coordinator's style without bold
openers, with the coordinator's AstroImageJ screenshots. The proforma's
ten questions now follow the background session slides.


Claude-Session: https://claude.ai/code/session_01NAwACSWWsG155bmFUMGXxb

Co-authored-by: Claude <noreply@anthropic.com>
</commit_message>
<xml_diff>
--- a/C2/AstroLabC2_Proforma.docx
+++ b/C2/AstroLabC2_Proforma.docx
@@ -87,7 +87,7 @@
         <w:spacing w:after="240"/>
       </w:pPr>
       <w:r>
-        <w:t xml:space="preserve">Complete Part 1 (find the transit yourself) and Part 2 (the same planet from space), then add a short reflection at the end. For each multiple-choice question, put an X in the box next to one answer.</w:t>
+        <w:t xml:space="preserve">Complete Part 1 (meet WASP-2b and find its transit) and Part 2 (the same planet from space), then add a short reflection at the end. For each multiple-choice question, put an X in the box next to one answer.</w:t>
       </w:r>
     </w:p>
     <w:tbl>
@@ -371,9 +371,1543 @@
           <w:sz w:val="26"/>
           <w:szCs w:val="26"/>
         </w:rPr>
-        <w:t xml:space="preserve">Part 1: Find the transit yourself</w:t>
+        <w:t xml:space="preserve">Part 1: Meet WASP-2b and find its transit</w:t>
       </w:r>
     </w:p>
+    <w:p>
+      <w:pPr>
+        <w:keepNext/>
+        <w:spacing w:after="100" w:before="200"/>
+      </w:pPr>
+      <w:r>
+        <w:rPr>
+          <w:b/>
+          <w:bCs/>
+          <w:color w:val="003B71"/>
+          <w:sz w:val="23"/>
+          <w:szCs w:val="23"/>
+        </w:rPr>
+        <w:t xml:space="preserve">WASP-2b and 51 Pegasi b</w:t>
+      </w:r>
+    </w:p>
+    <w:p>
+      <w:pPr>
+        <w:keepNext/>
+        <w:spacing w:after="120"/>
+      </w:pPr>
+      <w:r>
+        <w:t xml:space="preserve">Use the NASA Exoplanet Archive to fill in this table. If the archive doesn’t give a value, write “not known”.</w:t>
+      </w:r>
+    </w:p>
+    <w:tbl>
+      <w:tblPr>
+        <w:tblW w:type="dxa" w:w="9638"/>
+        <w:tblBorders>
+          <w:top w:val="single" w:color="auto" w:sz="4"/>
+          <w:left w:val="single" w:color="auto" w:sz="4"/>
+          <w:bottom w:val="single" w:color="auto" w:sz="4"/>
+          <w:right w:val="single" w:color="auto" w:sz="4"/>
+          <w:insideH w:val="single" w:color="auto" w:sz="4"/>
+          <w:insideV w:val="single" w:color="auto" w:sz="4"/>
+        </w:tblBorders>
+      </w:tblPr>
+      <w:tblGrid>
+        <w:gridCol w:w="3600"/>
+        <w:gridCol w:w="3019"/>
+        <w:gridCol w:w="3019"/>
+      </w:tblGrid>
+      <w:tr>
+        <w:trPr>
+          <w:cantSplit/>
+          <w:tblHeader/>
+        </w:trPr>
+        <w:tc>
+          <w:tcPr>
+            <w:tcW w:type="dxa" w:w="3600"/>
+            <w:tcBorders>
+              <w:top w:val="single" w:color="B7C3D0" w:sz="4"/>
+              <w:left w:val="single" w:color="B7C3D0" w:sz="4"/>
+              <w:bottom w:val="single" w:color="B7C3D0" w:sz="4"/>
+              <w:right w:val="single" w:color="B7C3D0" w:sz="4"/>
+            </w:tcBorders>
+            <w:shd w:fill="E8EEF5" w:color="auto" w:val="clear"/>
+            <w:tcMar>
+              <w:top w:type="dxa" w:w="90"/>
+              <w:left w:type="dxa" w:w="120"/>
+              <w:bottom w:type="dxa" w:w="90"/>
+              <w:right w:type="dxa" w:w="120"/>
+            </w:tcMar>
+            <w:vAlign w:val="center"/>
+          </w:tcPr>
+          <w:p>
+            <w:pPr>
+              <w:spacing w:after="0"/>
+            </w:pPr>
+            <w:r>
+              <w:rPr>
+                <w:b/>
+                <w:bCs/>
+                <w:sz w:val="20"/>
+                <w:szCs w:val="20"/>
+              </w:rPr>
+              <w:t xml:space="preserve">Property</w:t>
+            </w:r>
+          </w:p>
+        </w:tc>
+        <w:tc>
+          <w:tcPr>
+            <w:tcW w:type="dxa" w:w="3019"/>
+            <w:tcBorders>
+              <w:top w:val="single" w:color="B7C3D0" w:sz="4"/>
+              <w:left w:val="single" w:color="B7C3D0" w:sz="4"/>
+              <w:bottom w:val="single" w:color="B7C3D0" w:sz="4"/>
+              <w:right w:val="single" w:color="B7C3D0" w:sz="4"/>
+            </w:tcBorders>
+            <w:shd w:fill="E8EEF5" w:color="auto" w:val="clear"/>
+            <w:tcMar>
+              <w:top w:type="dxa" w:w="90"/>
+              <w:left w:type="dxa" w:w="120"/>
+              <w:bottom w:type="dxa" w:w="90"/>
+              <w:right w:type="dxa" w:w="120"/>
+            </w:tcMar>
+            <w:vAlign w:val="center"/>
+          </w:tcPr>
+          <w:p>
+            <w:pPr>
+              <w:spacing w:after="0"/>
+            </w:pPr>
+            <w:r>
+              <w:rPr>
+                <w:b/>
+                <w:bCs/>
+                <w:sz w:val="20"/>
+                <w:szCs w:val="20"/>
+              </w:rPr>
+              <w:t xml:space="preserve">WASP-2b</w:t>
+            </w:r>
+          </w:p>
+        </w:tc>
+        <w:tc>
+          <w:tcPr>
+            <w:tcW w:type="dxa" w:w="3019"/>
+            <w:tcBorders>
+              <w:top w:val="single" w:color="B7C3D0" w:sz="4"/>
+              <w:left w:val="single" w:color="B7C3D0" w:sz="4"/>
+              <w:bottom w:val="single" w:color="B7C3D0" w:sz="4"/>
+              <w:right w:val="single" w:color="B7C3D0" w:sz="4"/>
+            </w:tcBorders>
+            <w:shd w:fill="E8EEF5" w:color="auto" w:val="clear"/>
+            <w:tcMar>
+              <w:top w:type="dxa" w:w="90"/>
+              <w:left w:type="dxa" w:w="120"/>
+              <w:bottom w:type="dxa" w:w="90"/>
+              <w:right w:type="dxa" w:w="120"/>
+            </w:tcMar>
+            <w:vAlign w:val="center"/>
+          </w:tcPr>
+          <w:p>
+            <w:pPr>
+              <w:spacing w:after="0"/>
+            </w:pPr>
+            <w:r>
+              <w:rPr>
+                <w:b/>
+                <w:bCs/>
+                <w:sz w:val="20"/>
+                <w:szCs w:val="20"/>
+              </w:rPr>
+              <w:t xml:space="preserve">51 Pegasi b</w:t>
+            </w:r>
+          </w:p>
+        </w:tc>
+      </w:tr>
+      <w:tr>
+        <w:trPr>
+          <w:cantSplit/>
+          <w:trHeight w:val="560" w:hRule="atLeast"/>
+        </w:trPr>
+        <w:tc>
+          <w:tcPr>
+            <w:tcW w:type="dxa" w:w="3600"/>
+            <w:tcBorders>
+              <w:top w:val="single" w:color="B7C3D0" w:sz="4"/>
+              <w:left w:val="single" w:color="B7C3D0" w:sz="4"/>
+              <w:bottom w:val="single" w:color="B7C3D0" w:sz="4"/>
+              <w:right w:val="single" w:color="B7C3D0" w:sz="4"/>
+            </w:tcBorders>
+            <w:shd w:fill="E8EEF5" w:color="auto" w:val="clear"/>
+            <w:tcMar>
+              <w:top w:type="dxa" w:w="90"/>
+              <w:left w:type="dxa" w:w="120"/>
+              <w:bottom w:type="dxa" w:w="90"/>
+              <w:right w:type="dxa" w:w="120"/>
+            </w:tcMar>
+            <w:vAlign w:val="center"/>
+          </w:tcPr>
+          <w:p>
+            <w:pPr>
+              <w:spacing w:after="0"/>
+            </w:pPr>
+            <w:r>
+              <w:rPr>
+                <w:b/>
+                <w:bCs/>
+                <w:sz w:val="20"/>
+                <w:szCs w:val="20"/>
+              </w:rPr>
+              <w:t xml:space="preserve">Discovery year</w:t>
+            </w:r>
+          </w:p>
+        </w:tc>
+        <w:tc>
+          <w:tcPr>
+            <w:tcW w:type="dxa" w:w="3019"/>
+            <w:tcBorders>
+              <w:top w:val="single" w:color="B7C3D0" w:sz="4"/>
+              <w:left w:val="single" w:color="B7C3D0" w:sz="4"/>
+              <w:bottom w:val="single" w:color="B7C3D0" w:sz="4"/>
+              <w:right w:val="single" w:color="B7C3D0" w:sz="4"/>
+            </w:tcBorders>
+            <w:tcMar>
+              <w:top w:type="dxa" w:w="90"/>
+              <w:left w:type="dxa" w:w="120"/>
+              <w:bottom w:type="dxa" w:w="90"/>
+              <w:right w:type="dxa" w:w="120"/>
+            </w:tcMar>
+            <w:vAlign w:val="center"/>
+          </w:tcPr>
+          <w:p>
+            <w:pPr>
+              <w:spacing w:after="0"/>
+            </w:pPr>
+            <w:r>
+              <w:rPr>
+                <w:sz w:val="22"/>
+                <w:szCs w:val="22"/>
+              </w:rPr>
+              <w:t xml:space="preserve"/>
+            </w:r>
+          </w:p>
+        </w:tc>
+        <w:tc>
+          <w:tcPr>
+            <w:tcW w:type="dxa" w:w="3019"/>
+            <w:tcBorders>
+              <w:top w:val="single" w:color="B7C3D0" w:sz="4"/>
+              <w:left w:val="single" w:color="B7C3D0" w:sz="4"/>
+              <w:bottom w:val="single" w:color="B7C3D0" w:sz="4"/>
+              <w:right w:val="single" w:color="B7C3D0" w:sz="4"/>
+            </w:tcBorders>
+            <w:tcMar>
+              <w:top w:type="dxa" w:w="90"/>
+              <w:left w:type="dxa" w:w="120"/>
+              <w:bottom w:type="dxa" w:w="90"/>
+              <w:right w:type="dxa" w:w="120"/>
+            </w:tcMar>
+            <w:vAlign w:val="center"/>
+          </w:tcPr>
+          <w:p>
+            <w:pPr>
+              <w:spacing w:after="0"/>
+            </w:pPr>
+            <w:r>
+              <w:rPr>
+                <w:sz w:val="22"/>
+                <w:szCs w:val="22"/>
+              </w:rPr>
+              <w:t xml:space="preserve"/>
+            </w:r>
+          </w:p>
+        </w:tc>
+      </w:tr>
+      <w:tr>
+        <w:trPr>
+          <w:cantSplit/>
+          <w:trHeight w:val="560" w:hRule="atLeast"/>
+        </w:trPr>
+        <w:tc>
+          <w:tcPr>
+            <w:tcW w:type="dxa" w:w="3600"/>
+            <w:tcBorders>
+              <w:top w:val="single" w:color="B7C3D0" w:sz="4"/>
+              <w:left w:val="single" w:color="B7C3D0" w:sz="4"/>
+              <w:bottom w:val="single" w:color="B7C3D0" w:sz="4"/>
+              <w:right w:val="single" w:color="B7C3D0" w:sz="4"/>
+            </w:tcBorders>
+            <w:shd w:fill="E8EEF5" w:color="auto" w:val="clear"/>
+            <w:tcMar>
+              <w:top w:type="dxa" w:w="90"/>
+              <w:left w:type="dxa" w:w="120"/>
+              <w:bottom w:type="dxa" w:w="90"/>
+              <w:right w:type="dxa" w:w="120"/>
+            </w:tcMar>
+            <w:vAlign w:val="center"/>
+          </w:tcPr>
+          <w:p>
+            <w:pPr>
+              <w:spacing w:after="0"/>
+            </w:pPr>
+            <w:r>
+              <w:rPr>
+                <w:b/>
+                <w:bCs/>
+                <w:sz w:val="20"/>
+                <w:szCs w:val="20"/>
+              </w:rPr>
+              <w:t xml:space="preserve">Discovery method</w:t>
+            </w:r>
+          </w:p>
+        </w:tc>
+        <w:tc>
+          <w:tcPr>
+            <w:tcW w:type="dxa" w:w="3019"/>
+            <w:tcBorders>
+              <w:top w:val="single" w:color="B7C3D0" w:sz="4"/>
+              <w:left w:val="single" w:color="B7C3D0" w:sz="4"/>
+              <w:bottom w:val="single" w:color="B7C3D0" w:sz="4"/>
+              <w:right w:val="single" w:color="B7C3D0" w:sz="4"/>
+            </w:tcBorders>
+            <w:tcMar>
+              <w:top w:type="dxa" w:w="90"/>
+              <w:left w:type="dxa" w:w="120"/>
+              <w:bottom w:type="dxa" w:w="90"/>
+              <w:right w:type="dxa" w:w="120"/>
+            </w:tcMar>
+            <w:vAlign w:val="center"/>
+          </w:tcPr>
+          <w:p>
+            <w:pPr>
+              <w:spacing w:after="0"/>
+            </w:pPr>
+            <w:r>
+              <w:rPr>
+                <w:sz w:val="22"/>
+                <w:szCs w:val="22"/>
+              </w:rPr>
+              <w:t xml:space="preserve"/>
+            </w:r>
+          </w:p>
+        </w:tc>
+        <w:tc>
+          <w:tcPr>
+            <w:tcW w:type="dxa" w:w="3019"/>
+            <w:tcBorders>
+              <w:top w:val="single" w:color="B7C3D0" w:sz="4"/>
+              <w:left w:val="single" w:color="B7C3D0" w:sz="4"/>
+              <w:bottom w:val="single" w:color="B7C3D0" w:sz="4"/>
+              <w:right w:val="single" w:color="B7C3D0" w:sz="4"/>
+            </w:tcBorders>
+            <w:tcMar>
+              <w:top w:type="dxa" w:w="90"/>
+              <w:left w:type="dxa" w:w="120"/>
+              <w:bottom w:type="dxa" w:w="90"/>
+              <w:right w:type="dxa" w:w="120"/>
+            </w:tcMar>
+            <w:vAlign w:val="center"/>
+          </w:tcPr>
+          <w:p>
+            <w:pPr>
+              <w:spacing w:after="0"/>
+            </w:pPr>
+            <w:r>
+              <w:rPr>
+                <w:sz w:val="22"/>
+                <w:szCs w:val="22"/>
+              </w:rPr>
+              <w:t xml:space="preserve"/>
+            </w:r>
+          </w:p>
+        </w:tc>
+      </w:tr>
+      <w:tr>
+        <w:trPr>
+          <w:cantSplit/>
+          <w:trHeight w:val="560" w:hRule="atLeast"/>
+        </w:trPr>
+        <w:tc>
+          <w:tcPr>
+            <w:tcW w:type="dxa" w:w="3600"/>
+            <w:tcBorders>
+              <w:top w:val="single" w:color="B7C3D0" w:sz="4"/>
+              <w:left w:val="single" w:color="B7C3D0" w:sz="4"/>
+              <w:bottom w:val="single" w:color="B7C3D0" w:sz="4"/>
+              <w:right w:val="single" w:color="B7C3D0" w:sz="4"/>
+            </w:tcBorders>
+            <w:shd w:fill="E8EEF5" w:color="auto" w:val="clear"/>
+            <w:tcMar>
+              <w:top w:type="dxa" w:w="90"/>
+              <w:left w:type="dxa" w:w="120"/>
+              <w:bottom w:type="dxa" w:w="90"/>
+              <w:right w:type="dxa" w:w="120"/>
+            </w:tcMar>
+            <w:vAlign w:val="center"/>
+          </w:tcPr>
+          <w:p>
+            <w:pPr>
+              <w:spacing w:after="0"/>
+            </w:pPr>
+            <w:r>
+              <w:rPr>
+                <w:b/>
+                <w:bCs/>
+                <w:sz w:val="20"/>
+                <w:szCs w:val="20"/>
+              </w:rPr>
+              <w:t xml:space="preserve">Orbital period (days)</w:t>
+            </w:r>
+          </w:p>
+        </w:tc>
+        <w:tc>
+          <w:tcPr>
+            <w:tcW w:type="dxa" w:w="3019"/>
+            <w:tcBorders>
+              <w:top w:val="single" w:color="B7C3D0" w:sz="4"/>
+              <w:left w:val="single" w:color="B7C3D0" w:sz="4"/>
+              <w:bottom w:val="single" w:color="B7C3D0" w:sz="4"/>
+              <w:right w:val="single" w:color="B7C3D0" w:sz="4"/>
+            </w:tcBorders>
+            <w:tcMar>
+              <w:top w:type="dxa" w:w="90"/>
+              <w:left w:type="dxa" w:w="120"/>
+              <w:bottom w:type="dxa" w:w="90"/>
+              <w:right w:type="dxa" w:w="120"/>
+            </w:tcMar>
+            <w:vAlign w:val="center"/>
+          </w:tcPr>
+          <w:p>
+            <w:pPr>
+              <w:spacing w:after="0"/>
+            </w:pPr>
+            <w:r>
+              <w:rPr>
+                <w:sz w:val="22"/>
+                <w:szCs w:val="22"/>
+              </w:rPr>
+              <w:t xml:space="preserve"/>
+            </w:r>
+          </w:p>
+        </w:tc>
+        <w:tc>
+          <w:tcPr>
+            <w:tcW w:type="dxa" w:w="3019"/>
+            <w:tcBorders>
+              <w:top w:val="single" w:color="B7C3D0" w:sz="4"/>
+              <w:left w:val="single" w:color="B7C3D0" w:sz="4"/>
+              <w:bottom w:val="single" w:color="B7C3D0" w:sz="4"/>
+              <w:right w:val="single" w:color="B7C3D0" w:sz="4"/>
+            </w:tcBorders>
+            <w:tcMar>
+              <w:top w:type="dxa" w:w="90"/>
+              <w:left w:type="dxa" w:w="120"/>
+              <w:bottom w:type="dxa" w:w="90"/>
+              <w:right w:type="dxa" w:w="120"/>
+            </w:tcMar>
+            <w:vAlign w:val="center"/>
+          </w:tcPr>
+          <w:p>
+            <w:pPr>
+              <w:spacing w:after="0"/>
+            </w:pPr>
+            <w:r>
+              <w:rPr>
+                <w:sz w:val="22"/>
+                <w:szCs w:val="22"/>
+              </w:rPr>
+              <w:t xml:space="preserve"/>
+            </w:r>
+          </w:p>
+        </w:tc>
+      </w:tr>
+      <w:tr>
+        <w:trPr>
+          <w:cantSplit/>
+          <w:trHeight w:val="560" w:hRule="atLeast"/>
+        </w:trPr>
+        <w:tc>
+          <w:tcPr>
+            <w:tcW w:type="dxa" w:w="3600"/>
+            <w:tcBorders>
+              <w:top w:val="single" w:color="B7C3D0" w:sz="4"/>
+              <w:left w:val="single" w:color="B7C3D0" w:sz="4"/>
+              <w:bottom w:val="single" w:color="B7C3D0" w:sz="4"/>
+              <w:right w:val="single" w:color="B7C3D0" w:sz="4"/>
+            </w:tcBorders>
+            <w:shd w:fill="E8EEF5" w:color="auto" w:val="clear"/>
+            <w:tcMar>
+              <w:top w:type="dxa" w:w="90"/>
+              <w:left w:type="dxa" w:w="120"/>
+              <w:bottom w:type="dxa" w:w="90"/>
+              <w:right w:type="dxa" w:w="120"/>
+            </w:tcMar>
+            <w:vAlign w:val="center"/>
+          </w:tcPr>
+          <w:p>
+            <w:pPr>
+              <w:spacing w:after="0"/>
+            </w:pPr>
+            <w:r>
+              <w:rPr>
+                <w:b/>
+                <w:bCs/>
+                <w:sz w:val="20"/>
+                <w:szCs w:val="20"/>
+              </w:rPr>
+              <w:t xml:space="preserve">Planet radius (Jupiter radii)</w:t>
+            </w:r>
+          </w:p>
+        </w:tc>
+        <w:tc>
+          <w:tcPr>
+            <w:tcW w:type="dxa" w:w="3019"/>
+            <w:tcBorders>
+              <w:top w:val="single" w:color="B7C3D0" w:sz="4"/>
+              <w:left w:val="single" w:color="B7C3D0" w:sz="4"/>
+              <w:bottom w:val="single" w:color="B7C3D0" w:sz="4"/>
+              <w:right w:val="single" w:color="B7C3D0" w:sz="4"/>
+            </w:tcBorders>
+            <w:tcMar>
+              <w:top w:type="dxa" w:w="90"/>
+              <w:left w:type="dxa" w:w="120"/>
+              <w:bottom w:type="dxa" w:w="90"/>
+              <w:right w:type="dxa" w:w="120"/>
+            </w:tcMar>
+            <w:vAlign w:val="center"/>
+          </w:tcPr>
+          <w:p>
+            <w:pPr>
+              <w:spacing w:after="0"/>
+            </w:pPr>
+            <w:r>
+              <w:rPr>
+                <w:sz w:val="22"/>
+                <w:szCs w:val="22"/>
+              </w:rPr>
+              <w:t xml:space="preserve"/>
+            </w:r>
+          </w:p>
+        </w:tc>
+        <w:tc>
+          <w:tcPr>
+            <w:tcW w:type="dxa" w:w="3019"/>
+            <w:tcBorders>
+              <w:top w:val="single" w:color="B7C3D0" w:sz="4"/>
+              <w:left w:val="single" w:color="B7C3D0" w:sz="4"/>
+              <w:bottom w:val="single" w:color="B7C3D0" w:sz="4"/>
+              <w:right w:val="single" w:color="B7C3D0" w:sz="4"/>
+            </w:tcBorders>
+            <w:tcMar>
+              <w:top w:type="dxa" w:w="90"/>
+              <w:left w:type="dxa" w:w="120"/>
+              <w:bottom w:type="dxa" w:w="90"/>
+              <w:right w:type="dxa" w:w="120"/>
+            </w:tcMar>
+            <w:vAlign w:val="center"/>
+          </w:tcPr>
+          <w:p>
+            <w:pPr>
+              <w:spacing w:after="0"/>
+            </w:pPr>
+            <w:r>
+              <w:rPr>
+                <w:sz w:val="22"/>
+                <w:szCs w:val="22"/>
+              </w:rPr>
+              <w:t xml:space="preserve"/>
+            </w:r>
+          </w:p>
+        </w:tc>
+      </w:tr>
+      <w:tr>
+        <w:trPr>
+          <w:cantSplit/>
+          <w:trHeight w:val="560" w:hRule="atLeast"/>
+        </w:trPr>
+        <w:tc>
+          <w:tcPr>
+            <w:tcW w:type="dxa" w:w="3600"/>
+            <w:tcBorders>
+              <w:top w:val="single" w:color="B7C3D0" w:sz="4"/>
+              <w:left w:val="single" w:color="B7C3D0" w:sz="4"/>
+              <w:bottom w:val="single" w:color="B7C3D0" w:sz="4"/>
+              <w:right w:val="single" w:color="B7C3D0" w:sz="4"/>
+            </w:tcBorders>
+            <w:shd w:fill="E8EEF5" w:color="auto" w:val="clear"/>
+            <w:tcMar>
+              <w:top w:type="dxa" w:w="90"/>
+              <w:left w:type="dxa" w:w="120"/>
+              <w:bottom w:type="dxa" w:w="90"/>
+              <w:right w:type="dxa" w:w="120"/>
+            </w:tcMar>
+            <w:vAlign w:val="center"/>
+          </w:tcPr>
+          <w:p>
+            <w:pPr>
+              <w:spacing w:after="0"/>
+            </w:pPr>
+            <w:r>
+              <w:rPr>
+                <w:b/>
+                <w:bCs/>
+                <w:sz w:val="20"/>
+                <w:szCs w:val="20"/>
+              </w:rPr>
+              <w:t xml:space="preserve">Planet mass (Jupiter masses)</w:t>
+            </w:r>
+          </w:p>
+        </w:tc>
+        <w:tc>
+          <w:tcPr>
+            <w:tcW w:type="dxa" w:w="3019"/>
+            <w:tcBorders>
+              <w:top w:val="single" w:color="B7C3D0" w:sz="4"/>
+              <w:left w:val="single" w:color="B7C3D0" w:sz="4"/>
+              <w:bottom w:val="single" w:color="B7C3D0" w:sz="4"/>
+              <w:right w:val="single" w:color="B7C3D0" w:sz="4"/>
+            </w:tcBorders>
+            <w:tcMar>
+              <w:top w:type="dxa" w:w="90"/>
+              <w:left w:type="dxa" w:w="120"/>
+              <w:bottom w:type="dxa" w:w="90"/>
+              <w:right w:type="dxa" w:w="120"/>
+            </w:tcMar>
+            <w:vAlign w:val="center"/>
+          </w:tcPr>
+          <w:p>
+            <w:pPr>
+              <w:spacing w:after="0"/>
+            </w:pPr>
+            <w:r>
+              <w:rPr>
+                <w:sz w:val="22"/>
+                <w:szCs w:val="22"/>
+              </w:rPr>
+              <w:t xml:space="preserve"/>
+            </w:r>
+          </w:p>
+        </w:tc>
+        <w:tc>
+          <w:tcPr>
+            <w:tcW w:type="dxa" w:w="3019"/>
+            <w:tcBorders>
+              <w:top w:val="single" w:color="B7C3D0" w:sz="4"/>
+              <w:left w:val="single" w:color="B7C3D0" w:sz="4"/>
+              <w:bottom w:val="single" w:color="B7C3D0" w:sz="4"/>
+              <w:right w:val="single" w:color="B7C3D0" w:sz="4"/>
+            </w:tcBorders>
+            <w:tcMar>
+              <w:top w:type="dxa" w:w="90"/>
+              <w:left w:type="dxa" w:w="120"/>
+              <w:bottom w:type="dxa" w:w="90"/>
+              <w:right w:type="dxa" w:w="120"/>
+            </w:tcMar>
+            <w:vAlign w:val="center"/>
+          </w:tcPr>
+          <w:p>
+            <w:pPr>
+              <w:spacing w:after="0"/>
+            </w:pPr>
+            <w:r>
+              <w:rPr>
+                <w:sz w:val="22"/>
+                <w:szCs w:val="22"/>
+              </w:rPr>
+              <w:t xml:space="preserve"/>
+            </w:r>
+          </w:p>
+        </w:tc>
+      </w:tr>
+      <w:tr>
+        <w:trPr>
+          <w:cantSplit/>
+          <w:trHeight w:val="560" w:hRule="atLeast"/>
+        </w:trPr>
+        <w:tc>
+          <w:tcPr>
+            <w:tcW w:type="dxa" w:w="3600"/>
+            <w:tcBorders>
+              <w:top w:val="single" w:color="B7C3D0" w:sz="4"/>
+              <w:left w:val="single" w:color="B7C3D0" w:sz="4"/>
+              <w:bottom w:val="single" w:color="B7C3D0" w:sz="4"/>
+              <w:right w:val="single" w:color="B7C3D0" w:sz="4"/>
+            </w:tcBorders>
+            <w:shd w:fill="E8EEF5" w:color="auto" w:val="clear"/>
+            <w:tcMar>
+              <w:top w:type="dxa" w:w="90"/>
+              <w:left w:type="dxa" w:w="120"/>
+              <w:bottom w:type="dxa" w:w="90"/>
+              <w:right w:type="dxa" w:w="120"/>
+            </w:tcMar>
+            <w:vAlign w:val="center"/>
+          </w:tcPr>
+          <w:p>
+            <w:pPr>
+              <w:spacing w:after="0"/>
+            </w:pPr>
+            <w:r>
+              <w:rPr>
+                <w:b/>
+                <w:bCs/>
+                <w:sz w:val="20"/>
+                <w:szCs w:val="20"/>
+              </w:rPr>
+              <w:t xml:space="preserve">Distance (light-years)</w:t>
+            </w:r>
+          </w:p>
+        </w:tc>
+        <w:tc>
+          <w:tcPr>
+            <w:tcW w:type="dxa" w:w="3019"/>
+            <w:tcBorders>
+              <w:top w:val="single" w:color="B7C3D0" w:sz="4"/>
+              <w:left w:val="single" w:color="B7C3D0" w:sz="4"/>
+              <w:bottom w:val="single" w:color="B7C3D0" w:sz="4"/>
+              <w:right w:val="single" w:color="B7C3D0" w:sz="4"/>
+            </w:tcBorders>
+            <w:tcMar>
+              <w:top w:type="dxa" w:w="90"/>
+              <w:left w:type="dxa" w:w="120"/>
+              <w:bottom w:type="dxa" w:w="90"/>
+              <w:right w:type="dxa" w:w="120"/>
+            </w:tcMar>
+            <w:vAlign w:val="center"/>
+          </w:tcPr>
+          <w:p>
+            <w:pPr>
+              <w:spacing w:after="0"/>
+            </w:pPr>
+            <w:r>
+              <w:rPr>
+                <w:sz w:val="22"/>
+                <w:szCs w:val="22"/>
+              </w:rPr>
+              <w:t xml:space="preserve"/>
+            </w:r>
+          </w:p>
+        </w:tc>
+        <w:tc>
+          <w:tcPr>
+            <w:tcW w:type="dxa" w:w="3019"/>
+            <w:tcBorders>
+              <w:top w:val="single" w:color="B7C3D0" w:sz="4"/>
+              <w:left w:val="single" w:color="B7C3D0" w:sz="4"/>
+              <w:bottom w:val="single" w:color="B7C3D0" w:sz="4"/>
+              <w:right w:val="single" w:color="B7C3D0" w:sz="4"/>
+            </w:tcBorders>
+            <w:tcMar>
+              <w:top w:type="dxa" w:w="90"/>
+              <w:left w:type="dxa" w:w="120"/>
+              <w:bottom w:type="dxa" w:w="90"/>
+              <w:right w:type="dxa" w:w="120"/>
+            </w:tcMar>
+            <w:vAlign w:val="center"/>
+          </w:tcPr>
+          <w:p>
+            <w:pPr>
+              <w:spacing w:after="0"/>
+            </w:pPr>
+            <w:r>
+              <w:rPr>
+                <w:sz w:val="22"/>
+                <w:szCs w:val="22"/>
+              </w:rPr>
+              <w:t xml:space="preserve"/>
+            </w:r>
+          </w:p>
+        </w:tc>
+      </w:tr>
+      <w:tr>
+        <w:trPr>
+          <w:cantSplit/>
+          <w:trHeight w:val="560" w:hRule="atLeast"/>
+        </w:trPr>
+        <w:tc>
+          <w:tcPr>
+            <w:tcW w:type="dxa" w:w="3600"/>
+            <w:tcBorders>
+              <w:top w:val="single" w:color="B7C3D0" w:sz="4"/>
+              <w:left w:val="single" w:color="B7C3D0" w:sz="4"/>
+              <w:bottom w:val="single" w:color="B7C3D0" w:sz="4"/>
+              <w:right w:val="single" w:color="B7C3D0" w:sz="4"/>
+            </w:tcBorders>
+            <w:shd w:fill="E8EEF5" w:color="auto" w:val="clear"/>
+            <w:tcMar>
+              <w:top w:type="dxa" w:w="90"/>
+              <w:left w:type="dxa" w:w="120"/>
+              <w:bottom w:type="dxa" w:w="90"/>
+              <w:right w:type="dxa" w:w="120"/>
+            </w:tcMar>
+            <w:vAlign w:val="center"/>
+          </w:tcPr>
+          <w:p>
+            <w:pPr>
+              <w:spacing w:after="0"/>
+            </w:pPr>
+            <w:r>
+              <w:rPr>
+                <w:b/>
+                <w:bCs/>
+                <w:sz w:val="20"/>
+                <w:szCs w:val="20"/>
+              </w:rPr>
+              <w:t xml:space="preserve">Star’s temperature (K)</w:t>
+            </w:r>
+          </w:p>
+        </w:tc>
+        <w:tc>
+          <w:tcPr>
+            <w:tcW w:type="dxa" w:w="3019"/>
+            <w:tcBorders>
+              <w:top w:val="single" w:color="B7C3D0" w:sz="4"/>
+              <w:left w:val="single" w:color="B7C3D0" w:sz="4"/>
+              <w:bottom w:val="single" w:color="B7C3D0" w:sz="4"/>
+              <w:right w:val="single" w:color="B7C3D0" w:sz="4"/>
+            </w:tcBorders>
+            <w:tcMar>
+              <w:top w:type="dxa" w:w="90"/>
+              <w:left w:type="dxa" w:w="120"/>
+              <w:bottom w:type="dxa" w:w="90"/>
+              <w:right w:type="dxa" w:w="120"/>
+            </w:tcMar>
+            <w:vAlign w:val="center"/>
+          </w:tcPr>
+          <w:p>
+            <w:pPr>
+              <w:spacing w:after="0"/>
+            </w:pPr>
+            <w:r>
+              <w:rPr>
+                <w:sz w:val="22"/>
+                <w:szCs w:val="22"/>
+              </w:rPr>
+              <w:t xml:space="preserve"/>
+            </w:r>
+          </w:p>
+        </w:tc>
+        <w:tc>
+          <w:tcPr>
+            <w:tcW w:type="dxa" w:w="3019"/>
+            <w:tcBorders>
+              <w:top w:val="single" w:color="B7C3D0" w:sz="4"/>
+              <w:left w:val="single" w:color="B7C3D0" w:sz="4"/>
+              <w:bottom w:val="single" w:color="B7C3D0" w:sz="4"/>
+              <w:right w:val="single" w:color="B7C3D0" w:sz="4"/>
+            </w:tcBorders>
+            <w:tcMar>
+              <w:top w:type="dxa" w:w="90"/>
+              <w:left w:type="dxa" w:w="120"/>
+              <w:bottom w:type="dxa" w:w="90"/>
+              <w:right w:type="dxa" w:w="120"/>
+            </w:tcMar>
+            <w:vAlign w:val="center"/>
+          </w:tcPr>
+          <w:p>
+            <w:pPr>
+              <w:spacing w:after="0"/>
+            </w:pPr>
+            <w:r>
+              <w:rPr>
+                <w:sz w:val="22"/>
+                <w:szCs w:val="22"/>
+              </w:rPr>
+              <w:t xml:space="preserve"/>
+            </w:r>
+          </w:p>
+        </w:tc>
+      </w:tr>
+    </w:tbl>
+    <w:p>
+      <w:pPr>
+        <w:spacing w:after="160"/>
+      </w:pPr>
+    </w:p>
+    <w:tbl>
+      <w:tblPr>
+        <w:tblW w:type="dxa" w:w="9638"/>
+        <w:tblBorders>
+          <w:top w:val="single" w:color="auto" w:sz="4"/>
+          <w:left w:val="single" w:color="auto" w:sz="4"/>
+          <w:bottom w:val="single" w:color="auto" w:sz="4"/>
+          <w:right w:val="single" w:color="auto" w:sz="4"/>
+          <w:insideH w:val="single" w:color="auto" w:sz="4"/>
+          <w:insideV w:val="single" w:color="auto" w:sz="4"/>
+        </w:tblBorders>
+      </w:tblPr>
+      <w:tblGrid>
+        <w:gridCol w:w="6338"/>
+        <w:gridCol w:w="3300"/>
+      </w:tblGrid>
+      <w:tr>
+        <w:trPr>
+          <w:cantSplit/>
+          <w:tblHeader/>
+        </w:trPr>
+        <w:tc>
+          <w:tcPr>
+            <w:tcW w:type="dxa" w:w="6338"/>
+            <w:tcBorders>
+              <w:top w:val="single" w:color="B7C3D0" w:sz="4"/>
+              <w:left w:val="single" w:color="B7C3D0" w:sz="4"/>
+              <w:bottom w:val="single" w:color="B7C3D0" w:sz="4"/>
+              <w:right w:val="single" w:color="B7C3D0" w:sz="4"/>
+            </w:tcBorders>
+            <w:shd w:fill="E8EEF5" w:color="auto" w:val="clear"/>
+            <w:tcMar>
+              <w:top w:type="dxa" w:w="90"/>
+              <w:left w:type="dxa" w:w="120"/>
+              <w:bottom w:type="dxa" w:w="90"/>
+              <w:right w:type="dxa" w:w="120"/>
+            </w:tcMar>
+            <w:vAlign w:val="center"/>
+          </w:tcPr>
+          <w:p>
+            <w:pPr>
+              <w:spacing w:after="0"/>
+            </w:pPr>
+            <w:r>
+              <w:rPr>
+                <w:b/>
+                <w:bCs/>
+                <w:sz w:val="20"/>
+                <w:szCs w:val="20"/>
+              </w:rPr>
+              <w:t xml:space="preserve">Confirmed planets</w:t>
+            </w:r>
+          </w:p>
+        </w:tc>
+        <w:tc>
+          <w:tcPr>
+            <w:tcW w:type="dxa" w:w="3300"/>
+            <w:tcBorders>
+              <w:top w:val="single" w:color="B7C3D0" w:sz="4"/>
+              <w:left w:val="single" w:color="B7C3D0" w:sz="4"/>
+              <w:bottom w:val="single" w:color="B7C3D0" w:sz="4"/>
+              <w:right w:val="single" w:color="B7C3D0" w:sz="4"/>
+            </w:tcBorders>
+            <w:shd w:fill="E8EEF5" w:color="auto" w:val="clear"/>
+            <w:tcMar>
+              <w:top w:type="dxa" w:w="90"/>
+              <w:left w:type="dxa" w:w="120"/>
+              <w:bottom w:type="dxa" w:w="90"/>
+              <w:right w:type="dxa" w:w="120"/>
+            </w:tcMar>
+            <w:vAlign w:val="center"/>
+          </w:tcPr>
+          <w:p>
+            <w:pPr>
+              <w:spacing w:after="0"/>
+            </w:pPr>
+            <w:r>
+              <w:rPr>
+                <w:b/>
+                <w:bCs/>
+                <w:sz w:val="20"/>
+                <w:szCs w:val="20"/>
+              </w:rPr>
+              <w:t xml:space="preserve">Number</w:t>
+            </w:r>
+          </w:p>
+        </w:tc>
+      </w:tr>
+      <w:tr>
+        <w:trPr>
+          <w:cantSplit/>
+          <w:trHeight w:val="560" w:hRule="atLeast"/>
+        </w:trPr>
+        <w:tc>
+          <w:tcPr>
+            <w:tcW w:type="dxa" w:w="6338"/>
+            <w:tcBorders>
+              <w:top w:val="single" w:color="B7C3D0" w:sz="4"/>
+              <w:left w:val="single" w:color="B7C3D0" w:sz="4"/>
+              <w:bottom w:val="single" w:color="B7C3D0" w:sz="4"/>
+              <w:right w:val="single" w:color="B7C3D0" w:sz="4"/>
+            </w:tcBorders>
+            <w:shd w:fill="E8EEF5" w:color="auto" w:val="clear"/>
+            <w:tcMar>
+              <w:top w:type="dxa" w:w="90"/>
+              <w:left w:type="dxa" w:w="120"/>
+              <w:bottom w:type="dxa" w:w="90"/>
+              <w:right w:type="dxa" w:w="120"/>
+            </w:tcMar>
+            <w:vAlign w:val="center"/>
+          </w:tcPr>
+          <w:p>
+            <w:pPr>
+              <w:spacing w:after="0"/>
+            </w:pPr>
+            <w:r>
+              <w:rPr>
+                <w:b/>
+                <w:bCs/>
+                <w:sz w:val="20"/>
+                <w:szCs w:val="20"/>
+              </w:rPr>
+              <w:t xml:space="preserve">Found by the transit method</w:t>
+            </w:r>
+          </w:p>
+        </w:tc>
+        <w:tc>
+          <w:tcPr>
+            <w:tcW w:type="dxa" w:w="3300"/>
+            <w:tcBorders>
+              <w:top w:val="single" w:color="B7C3D0" w:sz="4"/>
+              <w:left w:val="single" w:color="B7C3D0" w:sz="4"/>
+              <w:bottom w:val="single" w:color="B7C3D0" w:sz="4"/>
+              <w:right w:val="single" w:color="B7C3D0" w:sz="4"/>
+            </w:tcBorders>
+            <w:tcMar>
+              <w:top w:type="dxa" w:w="90"/>
+              <w:left w:type="dxa" w:w="120"/>
+              <w:bottom w:type="dxa" w:w="90"/>
+              <w:right w:type="dxa" w:w="120"/>
+            </w:tcMar>
+            <w:vAlign w:val="center"/>
+          </w:tcPr>
+          <w:p>
+            <w:pPr>
+              <w:spacing w:after="0"/>
+            </w:pPr>
+            <w:r>
+              <w:rPr>
+                <w:sz w:val="22"/>
+                <w:szCs w:val="22"/>
+              </w:rPr>
+              <w:t xml:space="preserve"/>
+            </w:r>
+          </w:p>
+        </w:tc>
+      </w:tr>
+      <w:tr>
+        <w:trPr>
+          <w:cantSplit/>
+          <w:trHeight w:val="560" w:hRule="atLeast"/>
+        </w:trPr>
+        <w:tc>
+          <w:tcPr>
+            <w:tcW w:type="dxa" w:w="6338"/>
+            <w:tcBorders>
+              <w:top w:val="single" w:color="B7C3D0" w:sz="4"/>
+              <w:left w:val="single" w:color="B7C3D0" w:sz="4"/>
+              <w:bottom w:val="single" w:color="B7C3D0" w:sz="4"/>
+              <w:right w:val="single" w:color="B7C3D0" w:sz="4"/>
+            </w:tcBorders>
+            <w:shd w:fill="E8EEF5" w:color="auto" w:val="clear"/>
+            <w:tcMar>
+              <w:top w:type="dxa" w:w="90"/>
+              <w:left w:type="dxa" w:w="120"/>
+              <w:bottom w:type="dxa" w:w="90"/>
+              <w:right w:type="dxa" w:w="120"/>
+            </w:tcMar>
+            <w:vAlign w:val="center"/>
+          </w:tcPr>
+          <w:p>
+            <w:pPr>
+              <w:spacing w:after="0"/>
+            </w:pPr>
+            <w:r>
+              <w:rPr>
+                <w:b/>
+                <w:bCs/>
+                <w:sz w:val="20"/>
+                <w:szCs w:val="20"/>
+              </w:rPr>
+              <w:t xml:space="preserve">Found by all methods</w:t>
+            </w:r>
+          </w:p>
+        </w:tc>
+        <w:tc>
+          <w:tcPr>
+            <w:tcW w:type="dxa" w:w="3300"/>
+            <w:tcBorders>
+              <w:top w:val="single" w:color="B7C3D0" w:sz="4"/>
+              <w:left w:val="single" w:color="B7C3D0" w:sz="4"/>
+              <w:bottom w:val="single" w:color="B7C3D0" w:sz="4"/>
+              <w:right w:val="single" w:color="B7C3D0" w:sz="4"/>
+            </w:tcBorders>
+            <w:tcMar>
+              <w:top w:type="dxa" w:w="90"/>
+              <w:left w:type="dxa" w:w="120"/>
+              <w:bottom w:type="dxa" w:w="90"/>
+              <w:right w:type="dxa" w:w="120"/>
+            </w:tcMar>
+            <w:vAlign w:val="center"/>
+          </w:tcPr>
+          <w:p>
+            <w:pPr>
+              <w:spacing w:after="0"/>
+            </w:pPr>
+            <w:r>
+              <w:rPr>
+                <w:sz w:val="22"/>
+                <w:szCs w:val="22"/>
+              </w:rPr>
+              <w:t xml:space="preserve"/>
+            </w:r>
+          </w:p>
+        </w:tc>
+      </w:tr>
+    </w:tbl>
+    <w:p>
+      <w:pPr>
+        <w:spacing w:after="160"/>
+      </w:pPr>
+    </w:p>
+    <w:p>
+      <w:pPr>
+        <w:keepNext/>
+        <w:spacing w:after="100" w:before="200"/>
+      </w:pPr>
+      <w:r>
+        <w:rPr>
+          <w:b/>
+          <w:bCs/>
+          <w:color w:val="003B71"/>
+          <w:sz w:val="23"/>
+          <w:szCs w:val="23"/>
+        </w:rPr>
+        <w:t xml:space="preserve">Your choices</w:t>
+      </w:r>
+    </w:p>
+    <w:p>
+      <w:pPr>
+        <w:keepNext/>
+        <w:spacing w:after="120"/>
+      </w:pPr>
+      <w:r>
+        <w:t xml:space="preserve">Record the values from your seeing profile, and describe the reference stars you chose.</w:t>
+      </w:r>
+    </w:p>
+    <w:tbl>
+      <w:tblPr>
+        <w:tblW w:type="dxa" w:w="9638"/>
+        <w:tblBorders>
+          <w:top w:val="single" w:color="auto" w:sz="4"/>
+          <w:left w:val="single" w:color="auto" w:sz="4"/>
+          <w:bottom w:val="single" w:color="auto" w:sz="4"/>
+          <w:right w:val="single" w:color="auto" w:sz="4"/>
+          <w:insideH w:val="single" w:color="auto" w:sz="4"/>
+          <w:insideV w:val="single" w:color="auto" w:sz="4"/>
+        </w:tblBorders>
+      </w:tblPr>
+      <w:tblGrid>
+        <w:gridCol w:w="6338"/>
+        <w:gridCol w:w="3300"/>
+      </w:tblGrid>
+      <w:tr>
+        <w:trPr>
+          <w:cantSplit/>
+          <w:tblHeader/>
+        </w:trPr>
+        <w:tc>
+          <w:tcPr>
+            <w:tcW w:type="dxa" w:w="6338"/>
+            <w:tcBorders>
+              <w:top w:val="single" w:color="B7C3D0" w:sz="4"/>
+              <w:left w:val="single" w:color="B7C3D0" w:sz="4"/>
+              <w:bottom w:val="single" w:color="B7C3D0" w:sz="4"/>
+              <w:right w:val="single" w:color="B7C3D0" w:sz="4"/>
+            </w:tcBorders>
+            <w:shd w:fill="E8EEF5" w:color="auto" w:val="clear"/>
+            <w:tcMar>
+              <w:top w:type="dxa" w:w="90"/>
+              <w:left w:type="dxa" w:w="120"/>
+              <w:bottom w:type="dxa" w:w="90"/>
+              <w:right w:type="dxa" w:w="120"/>
+            </w:tcMar>
+            <w:vAlign w:val="center"/>
+          </w:tcPr>
+          <w:p>
+            <w:pPr>
+              <w:spacing w:after="0"/>
+            </w:pPr>
+            <w:r>
+              <w:rPr>
+                <w:b/>
+                <w:bCs/>
+                <w:sz w:val="20"/>
+                <w:szCs w:val="20"/>
+              </w:rPr>
+              <w:t xml:space="preserve">Measurement</w:t>
+            </w:r>
+          </w:p>
+        </w:tc>
+        <w:tc>
+          <w:tcPr>
+            <w:tcW w:type="dxa" w:w="3300"/>
+            <w:tcBorders>
+              <w:top w:val="single" w:color="B7C3D0" w:sz="4"/>
+              <w:left w:val="single" w:color="B7C3D0" w:sz="4"/>
+              <w:bottom w:val="single" w:color="B7C3D0" w:sz="4"/>
+              <w:right w:val="single" w:color="B7C3D0" w:sz="4"/>
+            </w:tcBorders>
+            <w:shd w:fill="E8EEF5" w:color="auto" w:val="clear"/>
+            <w:tcMar>
+              <w:top w:type="dxa" w:w="90"/>
+              <w:left w:type="dxa" w:w="120"/>
+              <w:bottom w:type="dxa" w:w="90"/>
+              <w:right w:type="dxa" w:w="120"/>
+            </w:tcMar>
+            <w:vAlign w:val="center"/>
+          </w:tcPr>
+          <w:p>
+            <w:pPr>
+              <w:spacing w:after="0"/>
+            </w:pPr>
+            <w:r>
+              <w:rPr>
+                <w:b/>
+                <w:bCs/>
+                <w:sz w:val="20"/>
+                <w:szCs w:val="20"/>
+              </w:rPr>
+              <w:t xml:space="preserve">Your answer</w:t>
+            </w:r>
+          </w:p>
+        </w:tc>
+      </w:tr>
+      <w:tr>
+        <w:trPr>
+          <w:cantSplit/>
+          <w:trHeight w:val="560" w:hRule="atLeast"/>
+        </w:trPr>
+        <w:tc>
+          <w:tcPr>
+            <w:tcW w:type="dxa" w:w="6338"/>
+            <w:tcBorders>
+              <w:top w:val="single" w:color="B7C3D0" w:sz="4"/>
+              <w:left w:val="single" w:color="B7C3D0" w:sz="4"/>
+              <w:bottom w:val="single" w:color="B7C3D0" w:sz="4"/>
+              <w:right w:val="single" w:color="B7C3D0" w:sz="4"/>
+            </w:tcBorders>
+            <w:shd w:fill="E8EEF5" w:color="auto" w:val="clear"/>
+            <w:tcMar>
+              <w:top w:type="dxa" w:w="90"/>
+              <w:left w:type="dxa" w:w="120"/>
+              <w:bottom w:type="dxa" w:w="90"/>
+              <w:right w:type="dxa" w:w="120"/>
+            </w:tcMar>
+            <w:vAlign w:val="center"/>
+          </w:tcPr>
+          <w:p>
+            <w:pPr>
+              <w:spacing w:after="0"/>
+            </w:pPr>
+            <w:r>
+              <w:rPr>
+                <w:b/>
+                <w:bCs/>
+                <w:sz w:val="20"/>
+                <w:szCs w:val="20"/>
+              </w:rPr>
+              <w:t xml:space="preserve">FWHM of WASP-2 (pixels)</w:t>
+            </w:r>
+          </w:p>
+        </w:tc>
+        <w:tc>
+          <w:tcPr>
+            <w:tcW w:type="dxa" w:w="3300"/>
+            <w:tcBorders>
+              <w:top w:val="single" w:color="B7C3D0" w:sz="4"/>
+              <w:left w:val="single" w:color="B7C3D0" w:sz="4"/>
+              <w:bottom w:val="single" w:color="B7C3D0" w:sz="4"/>
+              <w:right w:val="single" w:color="B7C3D0" w:sz="4"/>
+            </w:tcBorders>
+            <w:tcMar>
+              <w:top w:type="dxa" w:w="90"/>
+              <w:left w:type="dxa" w:w="120"/>
+              <w:bottom w:type="dxa" w:w="90"/>
+              <w:right w:type="dxa" w:w="120"/>
+            </w:tcMar>
+            <w:vAlign w:val="center"/>
+          </w:tcPr>
+          <w:p>
+            <w:pPr>
+              <w:spacing w:after="0"/>
+            </w:pPr>
+            <w:r>
+              <w:rPr>
+                <w:sz w:val="22"/>
+                <w:szCs w:val="22"/>
+              </w:rPr>
+              <w:t xml:space="preserve"/>
+            </w:r>
+          </w:p>
+        </w:tc>
+      </w:tr>
+      <w:tr>
+        <w:trPr>
+          <w:cantSplit/>
+          <w:trHeight w:val="560" w:hRule="atLeast"/>
+        </w:trPr>
+        <w:tc>
+          <w:tcPr>
+            <w:tcW w:type="dxa" w:w="6338"/>
+            <w:tcBorders>
+              <w:top w:val="single" w:color="B7C3D0" w:sz="4"/>
+              <w:left w:val="single" w:color="B7C3D0" w:sz="4"/>
+              <w:bottom w:val="single" w:color="B7C3D0" w:sz="4"/>
+              <w:right w:val="single" w:color="B7C3D0" w:sz="4"/>
+            </w:tcBorders>
+            <w:shd w:fill="E8EEF5" w:color="auto" w:val="clear"/>
+            <w:tcMar>
+              <w:top w:type="dxa" w:w="90"/>
+              <w:left w:type="dxa" w:w="120"/>
+              <w:bottom w:type="dxa" w:w="90"/>
+              <w:right w:type="dxa" w:w="120"/>
+            </w:tcMar>
+            <w:vAlign w:val="center"/>
+          </w:tcPr>
+          <w:p>
+            <w:pPr>
+              <w:spacing w:after="0"/>
+            </w:pPr>
+            <w:r>
+              <w:rPr>
+                <w:b/>
+                <w:bCs/>
+                <w:sz w:val="20"/>
+                <w:szCs w:val="20"/>
+              </w:rPr>
+              <w:t xml:space="preserve">Aperture radius (pixels)</w:t>
+            </w:r>
+          </w:p>
+        </w:tc>
+        <w:tc>
+          <w:tcPr>
+            <w:tcW w:type="dxa" w:w="3300"/>
+            <w:tcBorders>
+              <w:top w:val="single" w:color="B7C3D0" w:sz="4"/>
+              <w:left w:val="single" w:color="B7C3D0" w:sz="4"/>
+              <w:bottom w:val="single" w:color="B7C3D0" w:sz="4"/>
+              <w:right w:val="single" w:color="B7C3D0" w:sz="4"/>
+            </w:tcBorders>
+            <w:tcMar>
+              <w:top w:type="dxa" w:w="90"/>
+              <w:left w:type="dxa" w:w="120"/>
+              <w:bottom w:type="dxa" w:w="90"/>
+              <w:right w:type="dxa" w:w="120"/>
+            </w:tcMar>
+            <w:vAlign w:val="center"/>
+          </w:tcPr>
+          <w:p>
+            <w:pPr>
+              <w:spacing w:after="0"/>
+            </w:pPr>
+            <w:r>
+              <w:rPr>
+                <w:sz w:val="22"/>
+                <w:szCs w:val="22"/>
+              </w:rPr>
+              <w:t xml:space="preserve"/>
+            </w:r>
+          </w:p>
+        </w:tc>
+      </w:tr>
+      <w:tr>
+        <w:trPr>
+          <w:cantSplit/>
+          <w:trHeight w:val="560" w:hRule="atLeast"/>
+        </w:trPr>
+        <w:tc>
+          <w:tcPr>
+            <w:tcW w:type="dxa" w:w="6338"/>
+            <w:tcBorders>
+              <w:top w:val="single" w:color="B7C3D0" w:sz="4"/>
+              <w:left w:val="single" w:color="B7C3D0" w:sz="4"/>
+              <w:bottom w:val="single" w:color="B7C3D0" w:sz="4"/>
+              <w:right w:val="single" w:color="B7C3D0" w:sz="4"/>
+            </w:tcBorders>
+            <w:shd w:fill="E8EEF5" w:color="auto" w:val="clear"/>
+            <w:tcMar>
+              <w:top w:type="dxa" w:w="90"/>
+              <w:left w:type="dxa" w:w="120"/>
+              <w:bottom w:type="dxa" w:w="90"/>
+              <w:right w:type="dxa" w:w="120"/>
+            </w:tcMar>
+            <w:vAlign w:val="center"/>
+          </w:tcPr>
+          <w:p>
+            <w:pPr>
+              <w:spacing w:after="0"/>
+            </w:pPr>
+            <w:r>
+              <w:rPr>
+                <w:b/>
+                <w:bCs/>
+                <w:sz w:val="20"/>
+                <w:szCs w:val="20"/>
+              </w:rPr>
+              <w:t xml:space="preserve">Background annulus, inner and outer radius (pixels)</w:t>
+            </w:r>
+          </w:p>
+        </w:tc>
+        <w:tc>
+          <w:tcPr>
+            <w:tcW w:type="dxa" w:w="3300"/>
+            <w:tcBorders>
+              <w:top w:val="single" w:color="B7C3D0" w:sz="4"/>
+              <w:left w:val="single" w:color="B7C3D0" w:sz="4"/>
+              <w:bottom w:val="single" w:color="B7C3D0" w:sz="4"/>
+              <w:right w:val="single" w:color="B7C3D0" w:sz="4"/>
+            </w:tcBorders>
+            <w:tcMar>
+              <w:top w:type="dxa" w:w="90"/>
+              <w:left w:type="dxa" w:w="120"/>
+              <w:bottom w:type="dxa" w:w="90"/>
+              <w:right w:type="dxa" w:w="120"/>
+            </w:tcMar>
+            <w:vAlign w:val="center"/>
+          </w:tcPr>
+          <w:p>
+            <w:pPr>
+              <w:spacing w:after="0"/>
+            </w:pPr>
+            <w:r>
+              <w:rPr>
+                <w:sz w:val="22"/>
+                <w:szCs w:val="22"/>
+              </w:rPr>
+              <w:t xml:space="preserve"/>
+            </w:r>
+          </w:p>
+        </w:tc>
+      </w:tr>
+      <w:tr>
+        <w:trPr>
+          <w:cantSplit/>
+          <w:trHeight w:val="560" w:hRule="atLeast"/>
+        </w:trPr>
+        <w:tc>
+          <w:tcPr>
+            <w:tcW w:type="dxa" w:w="6338"/>
+            <w:tcBorders>
+              <w:top w:val="single" w:color="B7C3D0" w:sz="4"/>
+              <w:left w:val="single" w:color="B7C3D0" w:sz="4"/>
+              <w:bottom w:val="single" w:color="B7C3D0" w:sz="4"/>
+              <w:right w:val="single" w:color="B7C3D0" w:sz="4"/>
+            </w:tcBorders>
+            <w:shd w:fill="E8EEF5" w:color="auto" w:val="clear"/>
+            <w:tcMar>
+              <w:top w:type="dxa" w:w="90"/>
+              <w:left w:type="dxa" w:w="120"/>
+              <w:bottom w:type="dxa" w:w="90"/>
+              <w:right w:type="dxa" w:w="120"/>
+            </w:tcMar>
+            <w:vAlign w:val="center"/>
+          </w:tcPr>
+          <w:p>
+            <w:pPr>
+              <w:spacing w:after="0"/>
+            </w:pPr>
+            <w:r>
+              <w:rPr>
+                <w:b/>
+                <w:bCs/>
+                <w:sz w:val="20"/>
+                <w:szCs w:val="20"/>
+              </w:rPr>
+              <w:t xml:space="preserve">Is the aperture radius between 1.5 and 2 times the FWHM?</w:t>
+            </w:r>
+          </w:p>
+        </w:tc>
+        <w:tc>
+          <w:tcPr>
+            <w:tcW w:type="dxa" w:w="3300"/>
+            <w:tcBorders>
+              <w:top w:val="single" w:color="B7C3D0" w:sz="4"/>
+              <w:left w:val="single" w:color="B7C3D0" w:sz="4"/>
+              <w:bottom w:val="single" w:color="B7C3D0" w:sz="4"/>
+              <w:right w:val="single" w:color="B7C3D0" w:sz="4"/>
+            </w:tcBorders>
+            <w:tcMar>
+              <w:top w:type="dxa" w:w="90"/>
+              <w:left w:type="dxa" w:w="120"/>
+              <w:bottom w:type="dxa" w:w="90"/>
+              <w:right w:type="dxa" w:w="120"/>
+            </w:tcMar>
+            <w:vAlign w:val="center"/>
+          </w:tcPr>
+          <w:p>
+            <w:pPr>
+              <w:spacing w:after="0"/>
+            </w:pPr>
+            <w:r>
+              <w:rPr>
+                <w:sz w:val="22"/>
+                <w:szCs w:val="22"/>
+              </w:rPr>
+              <w:t xml:space="preserve"/>
+            </w:r>
+          </w:p>
+        </w:tc>
+      </w:tr>
+    </w:tbl>
+    <w:p>
+      <w:pPr>
+        <w:spacing w:after="160"/>
+      </w:pPr>
+    </w:p>
+    <w:p>
+      <w:pPr>
+        <w:keepNext/>
+        <w:spacing w:after="120"/>
+      </w:pPr>
+      <w:r>
+        <w:t xml:space="preserve">Where in the image are your three reference stars, and why did you choose them?</w:t>
+      </w:r>
+    </w:p>
+    <w:tbl>
+      <w:tblPr>
+        <w:tblW w:type="dxa" w:w="9638"/>
+        <w:tblBorders>
+          <w:top w:val="single" w:color="auto" w:sz="4"/>
+          <w:left w:val="single" w:color="auto" w:sz="4"/>
+          <w:bottom w:val="single" w:color="auto" w:sz="4"/>
+          <w:right w:val="single" w:color="auto" w:sz="4"/>
+          <w:insideH w:val="single" w:color="auto" w:sz="4"/>
+          <w:insideV w:val="single" w:color="auto" w:sz="4"/>
+        </w:tblBorders>
+      </w:tblPr>
+      <w:tblGrid>
+        <w:gridCol w:w="9638"/>
+      </w:tblGrid>
+      <w:tr>
+        <w:trPr>
+          <w:trHeight w:val="2400" w:hRule="atLeast"/>
+        </w:trPr>
+        <w:tc>
+          <w:tcPr>
+            <w:tcW w:type="dxa" w:w="9638"/>
+            <w:tcBorders>
+              <w:top w:val="single" w:color="B7C3D0" w:sz="4"/>
+              <w:left w:val="single" w:color="B7C3D0" w:sz="4"/>
+              <w:bottom w:val="single" w:color="B7C3D0" w:sz="4"/>
+              <w:right w:val="single" w:color="B7C3D0" w:sz="4"/>
+            </w:tcBorders>
+            <w:tcMar>
+              <w:top w:type="dxa" w:w="90"/>
+              <w:left w:type="dxa" w:w="120"/>
+              <w:bottom w:type="dxa" w:w="90"/>
+              <w:right w:type="dxa" w:w="120"/>
+            </w:tcMar>
+            <w:vAlign w:val="top"/>
+          </w:tcPr>
+          <w:p>
+            <w:pPr>
+              <w:spacing w:after="0"/>
+            </w:pPr>
+            <w:r>
+              <w:rPr>
+                <w:i/>
+                <w:iCs/>
+                <w:color w:val="8A8A8A"/>
+              </w:rPr>
+              <w:t xml:space="preserve">Type your answer here</w:t>
+            </w:r>
+          </w:p>
+        </w:tc>
+      </w:tr>
+    </w:tbl>
     <w:p>
       <w:pPr>
         <w:keepNext/>
@@ -455,22 +1989,6 @@
     <w:p>
       <w:pPr>
         <w:keepNext/>
-        <w:spacing w:after="100" w:before="200"/>
-      </w:pPr>
-      <w:r>
-        <w:rPr>
-          <w:b/>
-          <w:bCs/>
-          <w:color w:val="003B71"/>
-          <w:sz w:val="23"/>
-          <w:szCs w:val="23"/>
-        </w:rPr>
-        <w:t xml:space="preserve">Your measurements</w:t>
-      </w:r>
-    </w:p>
-    <w:p>
-      <w:pPr>
-        <w:keepNext/>
         <w:spacing w:after="120"/>
       </w:pPr>
       <w:r>
@@ -490,8 +2008,8 @@
         </w:tblBorders>
       </w:tblPr>
       <w:tblGrid>
-        <w:gridCol w:w="4300"/>
-        <w:gridCol w:w="5338"/>
+        <w:gridCol w:w="6338"/>
+        <w:gridCol w:w="3300"/>
       </w:tblGrid>
       <w:tr>
         <w:trPr>
@@ -500,7 +2018,7 @@
         </w:trPr>
         <w:tc>
           <w:tcPr>
-            <w:tcW w:type="dxa" w:w="4300"/>
+            <w:tcW w:type="dxa" w:w="6338"/>
             <w:tcBorders>
               <w:top w:val="single" w:color="B7C3D0" w:sz="4"/>
               <w:left w:val="single" w:color="B7C3D0" w:sz="4"/>
@@ -533,7 +2051,7 @@
         </w:tc>
         <w:tc>
           <w:tcPr>
-            <w:tcW w:type="dxa" w:w="5338"/>
+            <w:tcW w:type="dxa" w:w="3300"/>
             <w:tcBorders>
               <w:top w:val="single" w:color="B7C3D0" w:sz="4"/>
               <w:left w:val="single" w:color="B7C3D0" w:sz="4"/>
@@ -572,7 +2090,7 @@
         </w:trPr>
         <w:tc>
           <w:tcPr>
-            <w:tcW w:type="dxa" w:w="4300"/>
+            <w:tcW w:type="dxa" w:w="6338"/>
             <w:tcBorders>
               <w:top w:val="single" w:color="B7C3D0" w:sz="4"/>
               <w:left w:val="single" w:color="B7C3D0" w:sz="4"/>
@@ -605,7 +2123,7 @@
         </w:tc>
         <w:tc>
           <w:tcPr>
-            <w:tcW w:type="dxa" w:w="5338"/>
+            <w:tcW w:type="dxa" w:w="3300"/>
             <w:tcBorders>
               <w:top w:val="single" w:color="B7C3D0" w:sz="4"/>
               <w:left w:val="single" w:color="B7C3D0" w:sz="4"/>
@@ -641,7 +2159,7 @@
         </w:trPr>
         <w:tc>
           <w:tcPr>
-            <w:tcW w:type="dxa" w:w="4300"/>
+            <w:tcW w:type="dxa" w:w="6338"/>
             <w:tcBorders>
               <w:top w:val="single" w:color="B7C3D0" w:sz="4"/>
               <w:left w:val="single" w:color="B7C3D0" w:sz="4"/>
@@ -674,7 +2192,7 @@
         </w:tc>
         <w:tc>
           <w:tcPr>
-            <w:tcW w:type="dxa" w:w="5338"/>
+            <w:tcW w:type="dxa" w:w="3300"/>
             <w:tcBorders>
               <w:top w:val="single" w:color="B7C3D0" w:sz="4"/>
               <w:left w:val="single" w:color="B7C3D0" w:sz="4"/>
@@ -858,7 +2376,7 @@
                 <w:b/>
                 <w:bCs/>
               </w:rPr>
-              <w:t xml:space="preserve">Why do we divide the brightness of WASP-2 by the brightness of reference stars, rather than measuring WASP-2 on its own?</w:t>
+              <w:t xml:space="preserve">The archive gives a mass for 51 Pegasi b but no radius. Why?</w:t>
             </w:r>
           </w:p>
         </w:tc>
@@ -915,7 +2433,7 @@
               <w:spacing w:after="0"/>
             </w:pPr>
             <w:r>
-              <w:t xml:space="preserve">To make WASP-2 look brighter, so the dip is easier to see</w:t>
+              <w:t xml:space="preserve">It’s too far away to measure</w:t>
             </w:r>
           </w:p>
         </w:tc>
@@ -972,7 +2490,7 @@
               <w:spacing w:after="0"/>
             </w:pPr>
             <w:r>
-              <w:t xml:space="preserve">Because the reference stars have planets too</w:t>
+              <w:t xml:space="preserve">It was found by the wobble it causes in its star’s motion, and it doesn’t pass in front of its star, so it has never been seen blocking any light</w:t>
             </w:r>
           </w:p>
         </w:tc>
@@ -1029,7 +2547,7 @@
               <w:spacing w:after="0"/>
             </w:pPr>
             <w:r>
-              <w:t xml:space="preserve">Because haze, thin cloud and the star sinking lower in the sky affect all the stars in an image in the same way, so dividing cancels them out</w:t>
+              <w:t xml:space="preserve">It has no solid surface, so it has no radius</w:t>
             </w:r>
           </w:p>
         </w:tc>
@@ -1086,7 +2604,7 @@
               <w:spacing w:after="0"/>
             </w:pPr>
             <w:r>
-              <w:t xml:space="preserve">To convert the brightness into units of the Sun’s brightness</w:t>
+              <w:t xml:space="preserve">Its star is too faint for telescopes to see</w:t>
             </w:r>
           </w:p>
         </w:tc>
@@ -1153,7 +2671,7 @@
                 <w:b/>
                 <w:bCs/>
               </w:rPr>
-              <w:t xml:space="preserve">What makes a good reference star?</w:t>
+              <w:t xml:space="preserve">Why have most known exoplanets been found by the transit method?</w:t>
             </w:r>
           </w:p>
         </w:tc>
@@ -1210,7 +2728,7 @@
               <w:spacing w:after="0"/>
             </w:pPr>
             <w:r>
-              <w:t xml:space="preserve">The brightest star in the image, even if it’s saturated</w:t>
+              <w:t xml:space="preserve">Transiting planets are more common than any other kind</w:t>
             </w:r>
           </w:p>
         </w:tc>
@@ -1267,7 +2785,7 @@
               <w:spacing w:after="0"/>
             </w:pPr>
             <w:r>
-              <w:t xml:space="preserve">A star near the edge of the image, away from the target</w:t>
+              <w:t xml:space="preserve">It’s the only method that works for giant planets</w:t>
             </w:r>
           </w:p>
         </w:tc>
@@ -1324,7 +2842,7 @@
               <w:spacing w:after="0"/>
             </w:pPr>
             <w:r>
-              <w:t xml:space="preserve">A star of similar brightness to the target, with no close neighbours, whose own brightness doesn’t change</w:t>
+              <w:t xml:space="preserve">Space telescopes such as Kepler and TESS can watch hundreds of thousands of stars at once, catching any that dim</w:t>
             </w:r>
           </w:p>
         </w:tc>
@@ -1381,7 +2899,7 @@
               <w:spacing w:after="0"/>
             </w:pPr>
             <w:r>
-              <w:t xml:space="preserve">Any star that’s a different colour from the target</w:t>
+              <w:t xml:space="preserve">Transits make stars much brighter, so they’re easy to spot</w:t>
             </w:r>
           </w:p>
         </w:tc>
@@ -1448,7 +2966,7 @@
                 <w:b/>
                 <w:bCs/>
               </w:rPr>
-              <w:t xml:space="preserve">What is the background annulus (the outer ring around each star) for?</w:t>
+              <w:t xml:space="preserve">The background annulus measures light that didn’t come from the star. Where does that light come from?</w:t>
             </w:r>
           </w:p>
         </w:tc>
@@ -1505,7 +3023,7 @@
               <w:spacing w:after="0"/>
             </w:pPr>
             <w:r>
-              <w:t xml:space="preserve">It collects extra light from the star to make it brighter</w:t>
+              <w:t xml:space="preserve">The planet itself</w:t>
             </w:r>
           </w:p>
         </w:tc>
@@ -1562,7 +3080,7 @@
               <w:spacing w:after="0"/>
             </w:pPr>
             <w:r>
-              <w:t xml:space="preserve">It blocks the light from the planet</w:t>
+              <w:t xml:space="preserve">The star’s outer layers</w:t>
             </w:r>
           </w:p>
         </w:tc>
@@ -1619,7 +3137,7 @@
               <w:spacing w:after="0"/>
             </w:pPr>
             <w:r>
-              <w:t xml:space="preserve">It marks the star’s position so the images can be aligned</w:t>
+              <w:t xml:space="preserve">The Moon only</w:t>
             </w:r>
           </w:p>
         </w:tc>
@@ -1676,7 +3194,7 @@
               <w:spacing w:after="0"/>
             </w:pPr>
             <w:r>
-              <w:t xml:space="preserve">It measures the glow of the sky around the star, which is then subtracted from the starlight</w:t>
+              <w:t xml:space="preserve">Scattered light, the glow of the atmosphere, and noise from the telescope’s camera</w:t>
             </w:r>
           </w:p>
         </w:tc>
@@ -1743,7 +3261,7 @@
                 <w:b/>
                 <w:bCs/>
               </w:rPr>
-              <w:t xml:space="preserve">During the ingress (the start of a transit), the brightness falls gradually rather than all at once. Why?</w:t>
+              <w:t xml:space="preserve">What would happen if you chose an aperture much bigger than 2 times the FWHM?</w:t>
             </w:r>
           </w:p>
         </w:tc>
@@ -1800,7 +3318,7 @@
               <w:spacing w:after="0"/>
             </w:pPr>
             <w:r>
-              <w:t xml:space="preserve">The planet is moving onto the face of the star, so it covers more and more of the star until it’s fully in front</w:t>
+              <w:t xml:space="preserve">It would miss some of the star’s light</w:t>
             </w:r>
           </w:p>
         </w:tc>
@@ -1857,7 +3375,7 @@
               <w:spacing w:after="0"/>
             </w:pPr>
             <w:r>
-              <w:t xml:space="preserve">The planet is moving behind the star</w:t>
+              <w:t xml:space="preserve">It would collect more sky, and possibly light from neighbouring stars, adding noise to your light curve</w:t>
             </w:r>
           </w:p>
         </w:tc>
@@ -1914,7 +3432,7 @@
               <w:spacing w:after="0"/>
             </w:pPr>
             <w:r>
-              <w:t xml:space="preserve">The star is slowly shrinking</w:t>
+              <w:t xml:space="preserve">The star would look brighter, so the transit would look deeper</w:t>
             </w:r>
           </w:p>
         </w:tc>
@@ -1971,7 +3489,597 @@
               <w:spacing w:after="0"/>
             </w:pPr>
             <w:r>
-              <w:t xml:space="preserve">The telescope takes time to refocus</w:t>
+              <w:t xml:space="preserve">Nothing would change</w:t>
+            </w:r>
+          </w:p>
+        </w:tc>
+      </w:tr>
+    </w:tbl>
+    <w:p>
+      <w:pPr>
+        <w:spacing w:after="160"/>
+      </w:pPr>
+    </w:p>
+    <w:tbl>
+      <w:tblPr>
+        <w:tblW w:type="dxa" w:w="9638"/>
+        <w:tblBorders>
+          <w:top w:val="single" w:color="auto" w:sz="4"/>
+          <w:left w:val="single" w:color="auto" w:sz="4"/>
+          <w:bottom w:val="single" w:color="auto" w:sz="4"/>
+          <w:right w:val="single" w:color="auto" w:sz="4"/>
+          <w:insideH w:val="single" w:color="auto" w:sz="4"/>
+          <w:insideV w:val="single" w:color="auto" w:sz="4"/>
+        </w:tblBorders>
+      </w:tblPr>
+      <w:tblGrid>
+        <w:gridCol w:w="800"/>
+        <w:gridCol w:w="8838"/>
+      </w:tblGrid>
+      <w:tr>
+        <w:trPr>
+          <w:cantSplit/>
+        </w:trPr>
+        <w:tc>
+          <w:tcPr>
+            <w:tcW w:type="dxa" w:w="9638"/>
+            <w:gridSpan w:val="2"/>
+            <w:tcBorders>
+              <w:top w:val="single" w:color="B7C3D0" w:sz="4"/>
+              <w:left w:val="single" w:color="B7C3D0" w:sz="4"/>
+              <w:bottom w:val="single" w:color="B7C3D0" w:sz="4"/>
+              <w:right w:val="single" w:color="B7C3D0" w:sz="4"/>
+            </w:tcBorders>
+            <w:shd w:fill="E8EEF5" w:color="auto" w:val="clear"/>
+            <w:tcMar>
+              <w:top w:type="dxa" w:w="90"/>
+              <w:left w:type="dxa" w:w="120"/>
+              <w:bottom w:type="dxa" w:w="90"/>
+              <w:right w:type="dxa" w:w="120"/>
+            </w:tcMar>
+          </w:tcPr>
+          <w:p>
+            <w:pPr>
+              <w:keepNext/>
+              <w:spacing w:after="0"/>
+            </w:pPr>
+            <w:r>
+              <w:rPr>
+                <w:b/>
+                <w:bCs/>
+                <w:color w:val="003B71"/>
+              </w:rPr>
+              <w:t xml:space="preserve">Question 5. </w:t>
+            </w:r>
+            <w:r>
+              <w:rPr>
+                <w:b/>
+                <w:bCs/>
+              </w:rPr>
+              <w:t xml:space="preserve">Why do we divide the brightness of WASP-2 by the brightness of reference stars, rather than measuring WASP-2 on its own?</w:t>
+            </w:r>
+          </w:p>
+        </w:tc>
+      </w:tr>
+      <w:tr>
+        <w:trPr>
+          <w:cantSplit/>
+        </w:trPr>
+        <w:tc>
+          <w:tcPr>
+            <w:tcW w:type="dxa" w:w="800"/>
+            <w:tcBorders>
+              <w:top w:val="single" w:color="B7C3D0" w:sz="4"/>
+              <w:left w:val="single" w:color="B7C3D0" w:sz="4"/>
+              <w:bottom w:val="single" w:color="B7C3D0" w:sz="4"/>
+              <w:right w:val="single" w:color="B7C3D0" w:sz="4"/>
+            </w:tcBorders>
+            <w:tcMar>
+              <w:top w:type="dxa" w:w="90"/>
+              <w:left w:type="dxa" w:w="120"/>
+              <w:bottom w:type="dxa" w:w="90"/>
+              <w:right w:type="dxa" w:w="120"/>
+            </w:tcMar>
+            <w:vAlign w:val="center"/>
+          </w:tcPr>
+          <w:p>
+            <w:pPr>
+              <w:keepNext/>
+              <w:spacing w:after="0"/>
+              <w:jc w:val="center"/>
+            </w:pPr>
+          </w:p>
+        </w:tc>
+        <w:tc>
+          <w:tcPr>
+            <w:tcW w:type="dxa" w:w="8838"/>
+            <w:tcBorders>
+              <w:top w:val="single" w:color="B7C3D0" w:sz="4"/>
+              <w:left w:val="single" w:color="B7C3D0" w:sz="4"/>
+              <w:bottom w:val="single" w:color="B7C3D0" w:sz="4"/>
+              <w:right w:val="single" w:color="B7C3D0" w:sz="4"/>
+            </w:tcBorders>
+            <w:tcMar>
+              <w:top w:type="dxa" w:w="90"/>
+              <w:left w:type="dxa" w:w="120"/>
+              <w:bottom w:type="dxa" w:w="90"/>
+              <w:right w:type="dxa" w:w="120"/>
+            </w:tcMar>
+            <w:vAlign w:val="center"/>
+          </w:tcPr>
+          <w:p>
+            <w:pPr>
+              <w:keepNext/>
+              <w:spacing w:after="0"/>
+            </w:pPr>
+            <w:r>
+              <w:t xml:space="preserve">Because haze, thin cloud and the star sinking lower in the sky affect all the stars in an image in the same way, so dividing cancels them out</w:t>
+            </w:r>
+          </w:p>
+        </w:tc>
+      </w:tr>
+      <w:tr>
+        <w:trPr>
+          <w:cantSplit/>
+        </w:trPr>
+        <w:tc>
+          <w:tcPr>
+            <w:tcW w:type="dxa" w:w="800"/>
+            <w:tcBorders>
+              <w:top w:val="single" w:color="B7C3D0" w:sz="4"/>
+              <w:left w:val="single" w:color="B7C3D0" w:sz="4"/>
+              <w:bottom w:val="single" w:color="B7C3D0" w:sz="4"/>
+              <w:right w:val="single" w:color="B7C3D0" w:sz="4"/>
+            </w:tcBorders>
+            <w:tcMar>
+              <w:top w:type="dxa" w:w="90"/>
+              <w:left w:type="dxa" w:w="120"/>
+              <w:bottom w:type="dxa" w:w="90"/>
+              <w:right w:type="dxa" w:w="120"/>
+            </w:tcMar>
+            <w:vAlign w:val="center"/>
+          </w:tcPr>
+          <w:p>
+            <w:pPr>
+              <w:keepNext/>
+              <w:spacing w:after="0"/>
+              <w:jc w:val="center"/>
+            </w:pPr>
+          </w:p>
+        </w:tc>
+        <w:tc>
+          <w:tcPr>
+            <w:tcW w:type="dxa" w:w="8838"/>
+            <w:tcBorders>
+              <w:top w:val="single" w:color="B7C3D0" w:sz="4"/>
+              <w:left w:val="single" w:color="B7C3D0" w:sz="4"/>
+              <w:bottom w:val="single" w:color="B7C3D0" w:sz="4"/>
+              <w:right w:val="single" w:color="B7C3D0" w:sz="4"/>
+            </w:tcBorders>
+            <w:tcMar>
+              <w:top w:type="dxa" w:w="90"/>
+              <w:left w:type="dxa" w:w="120"/>
+              <w:bottom w:type="dxa" w:w="90"/>
+              <w:right w:type="dxa" w:w="120"/>
+            </w:tcMar>
+            <w:vAlign w:val="center"/>
+          </w:tcPr>
+          <w:p>
+            <w:pPr>
+              <w:keepNext/>
+              <w:spacing w:after="0"/>
+            </w:pPr>
+            <w:r>
+              <w:t xml:space="preserve">To make WASP-2 look brighter, so the dip is easier to see</w:t>
+            </w:r>
+          </w:p>
+        </w:tc>
+      </w:tr>
+      <w:tr>
+        <w:trPr>
+          <w:cantSplit/>
+        </w:trPr>
+        <w:tc>
+          <w:tcPr>
+            <w:tcW w:type="dxa" w:w="800"/>
+            <w:tcBorders>
+              <w:top w:val="single" w:color="B7C3D0" w:sz="4"/>
+              <w:left w:val="single" w:color="B7C3D0" w:sz="4"/>
+              <w:bottom w:val="single" w:color="B7C3D0" w:sz="4"/>
+              <w:right w:val="single" w:color="B7C3D0" w:sz="4"/>
+            </w:tcBorders>
+            <w:tcMar>
+              <w:top w:type="dxa" w:w="90"/>
+              <w:left w:type="dxa" w:w="120"/>
+              <w:bottom w:type="dxa" w:w="90"/>
+              <w:right w:type="dxa" w:w="120"/>
+            </w:tcMar>
+            <w:vAlign w:val="center"/>
+          </w:tcPr>
+          <w:p>
+            <w:pPr>
+              <w:keepNext/>
+              <w:spacing w:after="0"/>
+              <w:jc w:val="center"/>
+            </w:pPr>
+          </w:p>
+        </w:tc>
+        <w:tc>
+          <w:tcPr>
+            <w:tcW w:type="dxa" w:w="8838"/>
+            <w:tcBorders>
+              <w:top w:val="single" w:color="B7C3D0" w:sz="4"/>
+              <w:left w:val="single" w:color="B7C3D0" w:sz="4"/>
+              <w:bottom w:val="single" w:color="B7C3D0" w:sz="4"/>
+              <w:right w:val="single" w:color="B7C3D0" w:sz="4"/>
+            </w:tcBorders>
+            <w:tcMar>
+              <w:top w:type="dxa" w:w="90"/>
+              <w:left w:type="dxa" w:w="120"/>
+              <w:bottom w:type="dxa" w:w="90"/>
+              <w:right w:type="dxa" w:w="120"/>
+            </w:tcMar>
+            <w:vAlign w:val="center"/>
+          </w:tcPr>
+          <w:p>
+            <w:pPr>
+              <w:keepNext/>
+              <w:spacing w:after="0"/>
+            </w:pPr>
+            <w:r>
+              <w:t xml:space="preserve">Because the reference stars have planets too</w:t>
+            </w:r>
+          </w:p>
+        </w:tc>
+      </w:tr>
+      <w:tr>
+        <w:trPr>
+          <w:cantSplit/>
+        </w:trPr>
+        <w:tc>
+          <w:tcPr>
+            <w:tcW w:type="dxa" w:w="800"/>
+            <w:tcBorders>
+              <w:top w:val="single" w:color="B7C3D0" w:sz="4"/>
+              <w:left w:val="single" w:color="B7C3D0" w:sz="4"/>
+              <w:bottom w:val="single" w:color="B7C3D0" w:sz="4"/>
+              <w:right w:val="single" w:color="B7C3D0" w:sz="4"/>
+            </w:tcBorders>
+            <w:tcMar>
+              <w:top w:type="dxa" w:w="90"/>
+              <w:left w:type="dxa" w:w="120"/>
+              <w:bottom w:type="dxa" w:w="90"/>
+              <w:right w:type="dxa" w:w="120"/>
+            </w:tcMar>
+            <w:vAlign w:val="center"/>
+          </w:tcPr>
+          <w:p>
+            <w:pPr>
+              <w:keepNext w:val="false"/>
+              <w:spacing w:after="0"/>
+              <w:jc w:val="center"/>
+            </w:pPr>
+          </w:p>
+        </w:tc>
+        <w:tc>
+          <w:tcPr>
+            <w:tcW w:type="dxa" w:w="8838"/>
+            <w:tcBorders>
+              <w:top w:val="single" w:color="B7C3D0" w:sz="4"/>
+              <w:left w:val="single" w:color="B7C3D0" w:sz="4"/>
+              <w:bottom w:val="single" w:color="B7C3D0" w:sz="4"/>
+              <w:right w:val="single" w:color="B7C3D0" w:sz="4"/>
+            </w:tcBorders>
+            <w:tcMar>
+              <w:top w:type="dxa" w:w="90"/>
+              <w:left w:type="dxa" w:w="120"/>
+              <w:bottom w:type="dxa" w:w="90"/>
+              <w:right w:type="dxa" w:w="120"/>
+            </w:tcMar>
+            <w:vAlign w:val="center"/>
+          </w:tcPr>
+          <w:p>
+            <w:pPr>
+              <w:keepNext w:val="false"/>
+              <w:spacing w:after="0"/>
+            </w:pPr>
+            <w:r>
+              <w:t xml:space="preserve">To convert the brightness into units of the Sun’s brightness</w:t>
+            </w:r>
+          </w:p>
+        </w:tc>
+      </w:tr>
+    </w:tbl>
+    <w:p>
+      <w:pPr>
+        <w:spacing w:after="160"/>
+      </w:pPr>
+    </w:p>
+    <w:tbl>
+      <w:tblPr>
+        <w:tblW w:type="dxa" w:w="9638"/>
+        <w:tblBorders>
+          <w:top w:val="single" w:color="auto" w:sz="4"/>
+          <w:left w:val="single" w:color="auto" w:sz="4"/>
+          <w:bottom w:val="single" w:color="auto" w:sz="4"/>
+          <w:right w:val="single" w:color="auto" w:sz="4"/>
+          <w:insideH w:val="single" w:color="auto" w:sz="4"/>
+          <w:insideV w:val="single" w:color="auto" w:sz="4"/>
+        </w:tblBorders>
+      </w:tblPr>
+      <w:tblGrid>
+        <w:gridCol w:w="800"/>
+        <w:gridCol w:w="8838"/>
+      </w:tblGrid>
+      <w:tr>
+        <w:trPr>
+          <w:cantSplit/>
+        </w:trPr>
+        <w:tc>
+          <w:tcPr>
+            <w:tcW w:type="dxa" w:w="9638"/>
+            <w:gridSpan w:val="2"/>
+            <w:tcBorders>
+              <w:top w:val="single" w:color="B7C3D0" w:sz="4"/>
+              <w:left w:val="single" w:color="B7C3D0" w:sz="4"/>
+              <w:bottom w:val="single" w:color="B7C3D0" w:sz="4"/>
+              <w:right w:val="single" w:color="B7C3D0" w:sz="4"/>
+            </w:tcBorders>
+            <w:shd w:fill="E8EEF5" w:color="auto" w:val="clear"/>
+            <w:tcMar>
+              <w:top w:type="dxa" w:w="90"/>
+              <w:left w:type="dxa" w:w="120"/>
+              <w:bottom w:type="dxa" w:w="90"/>
+              <w:right w:type="dxa" w:w="120"/>
+            </w:tcMar>
+          </w:tcPr>
+          <w:p>
+            <w:pPr>
+              <w:keepNext/>
+              <w:spacing w:after="0"/>
+            </w:pPr>
+            <w:r>
+              <w:rPr>
+                <w:b/>
+                <w:bCs/>
+                <w:color w:val="003B71"/>
+              </w:rPr>
+              <w:t xml:space="preserve">Question 6. </w:t>
+            </w:r>
+            <w:r>
+              <w:rPr>
+                <w:b/>
+                <w:bCs/>
+              </w:rPr>
+              <w:t xml:space="preserve">Does your light curve tell you how bright WASP-2 really is?</w:t>
+            </w:r>
+          </w:p>
+        </w:tc>
+      </w:tr>
+      <w:tr>
+        <w:trPr>
+          <w:cantSplit/>
+        </w:trPr>
+        <w:tc>
+          <w:tcPr>
+            <w:tcW w:type="dxa" w:w="800"/>
+            <w:tcBorders>
+              <w:top w:val="single" w:color="B7C3D0" w:sz="4"/>
+              <w:left w:val="single" w:color="B7C3D0" w:sz="4"/>
+              <w:bottom w:val="single" w:color="B7C3D0" w:sz="4"/>
+              <w:right w:val="single" w:color="B7C3D0" w:sz="4"/>
+            </w:tcBorders>
+            <w:tcMar>
+              <w:top w:type="dxa" w:w="90"/>
+              <w:left w:type="dxa" w:w="120"/>
+              <w:bottom w:type="dxa" w:w="90"/>
+              <w:right w:type="dxa" w:w="120"/>
+            </w:tcMar>
+            <w:vAlign w:val="center"/>
+          </w:tcPr>
+          <w:p>
+            <w:pPr>
+              <w:keepNext/>
+              <w:spacing w:after="0"/>
+              <w:jc w:val="center"/>
+            </w:pPr>
+          </w:p>
+        </w:tc>
+        <w:tc>
+          <w:tcPr>
+            <w:tcW w:type="dxa" w:w="8838"/>
+            <w:tcBorders>
+              <w:top w:val="single" w:color="B7C3D0" w:sz="4"/>
+              <w:left w:val="single" w:color="B7C3D0" w:sz="4"/>
+              <w:bottom w:val="single" w:color="B7C3D0" w:sz="4"/>
+              <w:right w:val="single" w:color="B7C3D0" w:sz="4"/>
+            </w:tcBorders>
+            <w:tcMar>
+              <w:top w:type="dxa" w:w="90"/>
+              <w:left w:type="dxa" w:w="120"/>
+              <w:bottom w:type="dxa" w:w="90"/>
+              <w:right w:type="dxa" w:w="120"/>
+            </w:tcMar>
+            <w:vAlign w:val="center"/>
+          </w:tcPr>
+          <w:p>
+            <w:pPr>
+              <w:keepNext/>
+              <w:spacing w:after="0"/>
+            </w:pPr>
+            <w:r>
+              <w:t xml:space="preserve">Yes, in watts</w:t>
+            </w:r>
+          </w:p>
+        </w:tc>
+      </w:tr>
+      <w:tr>
+        <w:trPr>
+          <w:cantSplit/>
+        </w:trPr>
+        <w:tc>
+          <w:tcPr>
+            <w:tcW w:type="dxa" w:w="800"/>
+            <w:tcBorders>
+              <w:top w:val="single" w:color="B7C3D0" w:sz="4"/>
+              <w:left w:val="single" w:color="B7C3D0" w:sz="4"/>
+              <w:bottom w:val="single" w:color="B7C3D0" w:sz="4"/>
+              <w:right w:val="single" w:color="B7C3D0" w:sz="4"/>
+            </w:tcBorders>
+            <w:tcMar>
+              <w:top w:type="dxa" w:w="90"/>
+              <w:left w:type="dxa" w:w="120"/>
+              <w:bottom w:type="dxa" w:w="90"/>
+              <w:right w:type="dxa" w:w="120"/>
+            </w:tcMar>
+            <w:vAlign w:val="center"/>
+          </w:tcPr>
+          <w:p>
+            <w:pPr>
+              <w:keepNext/>
+              <w:spacing w:after="0"/>
+              <w:jc w:val="center"/>
+            </w:pPr>
+          </w:p>
+        </w:tc>
+        <w:tc>
+          <w:tcPr>
+            <w:tcW w:type="dxa" w:w="8838"/>
+            <w:tcBorders>
+              <w:top w:val="single" w:color="B7C3D0" w:sz="4"/>
+              <w:left w:val="single" w:color="B7C3D0" w:sz="4"/>
+              <w:bottom w:val="single" w:color="B7C3D0" w:sz="4"/>
+              <w:right w:val="single" w:color="B7C3D0" w:sz="4"/>
+            </w:tcBorders>
+            <w:tcMar>
+              <w:top w:type="dxa" w:w="90"/>
+              <w:left w:type="dxa" w:w="120"/>
+              <w:bottom w:type="dxa" w:w="90"/>
+              <w:right w:type="dxa" w:w="120"/>
+            </w:tcMar>
+            <w:vAlign w:val="center"/>
+          </w:tcPr>
+          <w:p>
+            <w:pPr>
+              <w:keepNext/>
+              <w:spacing w:after="0"/>
+            </w:pPr>
+            <w:r>
+              <w:t xml:space="preserve">Yes, because AstroImageJ calibrates every image</w:t>
+            </w:r>
+          </w:p>
+        </w:tc>
+      </w:tr>
+      <w:tr>
+        <w:trPr>
+          <w:cantSplit/>
+        </w:trPr>
+        <w:tc>
+          <w:tcPr>
+            <w:tcW w:type="dxa" w:w="800"/>
+            <w:tcBorders>
+              <w:top w:val="single" w:color="B7C3D0" w:sz="4"/>
+              <w:left w:val="single" w:color="B7C3D0" w:sz="4"/>
+              <w:bottom w:val="single" w:color="B7C3D0" w:sz="4"/>
+              <w:right w:val="single" w:color="B7C3D0" w:sz="4"/>
+            </w:tcBorders>
+            <w:tcMar>
+              <w:top w:type="dxa" w:w="90"/>
+              <w:left w:type="dxa" w:w="120"/>
+              <w:bottom w:type="dxa" w:w="90"/>
+              <w:right w:type="dxa" w:w="120"/>
+            </w:tcMar>
+            <w:vAlign w:val="center"/>
+          </w:tcPr>
+          <w:p>
+            <w:pPr>
+              <w:keepNext/>
+              <w:spacing w:after="0"/>
+              <w:jc w:val="center"/>
+            </w:pPr>
+          </w:p>
+        </w:tc>
+        <w:tc>
+          <w:tcPr>
+            <w:tcW w:type="dxa" w:w="8838"/>
+            <w:tcBorders>
+              <w:top w:val="single" w:color="B7C3D0" w:sz="4"/>
+              <w:left w:val="single" w:color="B7C3D0" w:sz="4"/>
+              <w:bottom w:val="single" w:color="B7C3D0" w:sz="4"/>
+              <w:right w:val="single" w:color="B7C3D0" w:sz="4"/>
+            </w:tcBorders>
+            <w:tcMar>
+              <w:top w:type="dxa" w:w="90"/>
+              <w:left w:type="dxa" w:w="120"/>
+              <w:bottom w:type="dxa" w:w="90"/>
+              <w:right w:type="dxa" w:w="120"/>
+            </w:tcMar>
+            <w:vAlign w:val="center"/>
+          </w:tcPr>
+          <w:p>
+            <w:pPr>
+              <w:keepNext/>
+              <w:spacing w:after="0"/>
+            </w:pPr>
+            <w:r>
+              <w:t xml:space="preserve">No, it only shows how WASP-2’s brightness changes compared with the reference stars</w:t>
+            </w:r>
+          </w:p>
+        </w:tc>
+      </w:tr>
+      <w:tr>
+        <w:trPr>
+          <w:cantSplit/>
+        </w:trPr>
+        <w:tc>
+          <w:tcPr>
+            <w:tcW w:type="dxa" w:w="800"/>
+            <w:tcBorders>
+              <w:top w:val="single" w:color="B7C3D0" w:sz="4"/>
+              <w:left w:val="single" w:color="B7C3D0" w:sz="4"/>
+              <w:bottom w:val="single" w:color="B7C3D0" w:sz="4"/>
+              <w:right w:val="single" w:color="B7C3D0" w:sz="4"/>
+            </w:tcBorders>
+            <w:tcMar>
+              <w:top w:type="dxa" w:w="90"/>
+              <w:left w:type="dxa" w:w="120"/>
+              <w:bottom w:type="dxa" w:w="90"/>
+              <w:right w:type="dxa" w:w="120"/>
+            </w:tcMar>
+            <w:vAlign w:val="center"/>
+          </w:tcPr>
+          <w:p>
+            <w:pPr>
+              <w:keepNext w:val="false"/>
+              <w:spacing w:after="0"/>
+              <w:jc w:val="center"/>
+            </w:pPr>
+          </w:p>
+        </w:tc>
+        <w:tc>
+          <w:tcPr>
+            <w:tcW w:type="dxa" w:w="8838"/>
+            <w:tcBorders>
+              <w:top w:val="single" w:color="B7C3D0" w:sz="4"/>
+              <w:left w:val="single" w:color="B7C3D0" w:sz="4"/>
+              <w:bottom w:val="single" w:color="B7C3D0" w:sz="4"/>
+              <w:right w:val="single" w:color="B7C3D0" w:sz="4"/>
+            </w:tcBorders>
+            <w:tcMar>
+              <w:top w:type="dxa" w:w="90"/>
+              <w:left w:type="dxa" w:w="120"/>
+              <w:bottom w:type="dxa" w:w="90"/>
+              <w:right w:type="dxa" w:w="120"/>
+            </w:tcMar>
+            <w:vAlign w:val="center"/>
+          </w:tcPr>
+          <w:p>
+            <w:pPr>
+              <w:keepNext w:val="false"/>
+              <w:spacing w:after="0"/>
+            </w:pPr>
+            <w:r>
+              <w:t xml:space="preserve">No, because the images are black and white</w:t>
             </w:r>
           </w:p>
         </w:tc>
@@ -2646,6 +4754,108 @@
           </w:p>
         </w:tc>
       </w:tr>
+      <w:tr>
+        <w:trPr>
+          <w:cantSplit/>
+          <w:trHeight w:val="560" w:hRule="atLeast"/>
+        </w:trPr>
+        <w:tc>
+          <w:tcPr>
+            <w:tcW w:type="dxa" w:w="3600"/>
+            <w:tcBorders>
+              <w:top w:val="single" w:color="B7C3D0" w:sz="4"/>
+              <w:left w:val="single" w:color="B7C3D0" w:sz="4"/>
+              <w:bottom w:val="single" w:color="B7C3D0" w:sz="4"/>
+              <w:right w:val="single" w:color="B7C3D0" w:sz="4"/>
+            </w:tcBorders>
+            <w:shd w:fill="E8EEF5" w:color="auto" w:val="clear"/>
+            <w:tcMar>
+              <w:top w:type="dxa" w:w="90"/>
+              <w:left w:type="dxa" w:w="120"/>
+              <w:bottom w:type="dxa" w:w="90"/>
+              <w:right w:type="dxa" w:w="120"/>
+            </w:tcMar>
+            <w:vAlign w:val="center"/>
+          </w:tcPr>
+          <w:p>
+            <w:pPr>
+              <w:spacing w:after="0"/>
+            </w:pPr>
+            <w:r>
+              <w:rPr>
+                <w:b/>
+                <w:bCs/>
+                <w:sz w:val="20"/>
+                <w:szCs w:val="20"/>
+              </w:rPr>
+              <w:t xml:space="preserve">When would the next transit after the end of the data have happened? (day)</w:t>
+            </w:r>
+          </w:p>
+        </w:tc>
+        <w:tc>
+          <w:tcPr>
+            <w:tcW w:type="dxa" w:w="3019"/>
+            <w:tcBorders>
+              <w:top w:val="single" w:color="B7C3D0" w:sz="4"/>
+              <w:left w:val="single" w:color="B7C3D0" w:sz="4"/>
+              <w:bottom w:val="single" w:color="B7C3D0" w:sz="4"/>
+              <w:right w:val="single" w:color="B7C3D0" w:sz="4"/>
+            </w:tcBorders>
+            <w:tcMar>
+              <w:top w:type="dxa" w:w="90"/>
+              <w:left w:type="dxa" w:w="120"/>
+              <w:bottom w:type="dxa" w:w="90"/>
+              <w:right w:type="dxa" w:w="120"/>
+            </w:tcMar>
+            <w:vAlign w:val="center"/>
+          </w:tcPr>
+          <w:p>
+            <w:pPr>
+              <w:spacing w:after="0"/>
+            </w:pPr>
+            <w:r>
+              <w:rPr>
+                <w:i/>
+                <w:iCs/>
+                <w:color w:val="8A8A8A"/>
+                <w:sz w:val="20"/>
+                <w:szCs w:val="20"/>
+              </w:rPr>
+              <w:t xml:space="preserve">(not needed)</w:t>
+            </w:r>
+          </w:p>
+        </w:tc>
+        <w:tc>
+          <w:tcPr>
+            <w:tcW w:type="dxa" w:w="3019"/>
+            <w:tcBorders>
+              <w:top w:val="single" w:color="B7C3D0" w:sz="4"/>
+              <w:left w:val="single" w:color="B7C3D0" w:sz="4"/>
+              <w:bottom w:val="single" w:color="B7C3D0" w:sz="4"/>
+              <w:right w:val="single" w:color="B7C3D0" w:sz="4"/>
+            </w:tcBorders>
+            <w:tcMar>
+              <w:top w:type="dxa" w:w="90"/>
+              <w:left w:type="dxa" w:w="120"/>
+              <w:bottom w:type="dxa" w:w="90"/>
+              <w:right w:type="dxa" w:w="120"/>
+            </w:tcMar>
+            <w:vAlign w:val="center"/>
+          </w:tcPr>
+          <w:p>
+            <w:pPr>
+              <w:spacing w:after="0"/>
+            </w:pPr>
+            <w:r>
+              <w:rPr>
+                <w:sz w:val="22"/>
+                <w:szCs w:val="22"/>
+              </w:rPr>
+              <w:t xml:space="preserve"/>
+            </w:r>
+          </w:p>
+        </w:tc>
+      </w:tr>
     </w:tbl>
     <w:p>
       <w:pPr>
@@ -2717,7 +4927,7 @@
                 <w:bCs/>
                 <w:color w:val="003B71"/>
               </w:rPr>
-              <w:t xml:space="preserve">Question 5. </w:t>
+              <w:t xml:space="preserve">Question 7. </w:t>
             </w:r>
             <w:r>
               <w:rPr>
@@ -2895,64 +5105,64 @@
               <w:spacing w:after="0"/>
             </w:pPr>
             <w:r>
+              <w:t xml:space="preserve">TESS only measures stars that have planets</w:t>
+            </w:r>
+          </w:p>
+        </w:tc>
+      </w:tr>
+      <w:tr>
+        <w:trPr>
+          <w:cantSplit/>
+        </w:trPr>
+        <w:tc>
+          <w:tcPr>
+            <w:tcW w:type="dxa" w:w="800"/>
+            <w:tcBorders>
+              <w:top w:val="single" w:color="B7C3D0" w:sz="4"/>
+              <w:left w:val="single" w:color="B7C3D0" w:sz="4"/>
+              <w:bottom w:val="single" w:color="B7C3D0" w:sz="4"/>
+              <w:right w:val="single" w:color="B7C3D0" w:sz="4"/>
+            </w:tcBorders>
+            <w:tcMar>
+              <w:top w:type="dxa" w:w="90"/>
+              <w:left w:type="dxa" w:w="120"/>
+              <w:bottom w:type="dxa" w:w="90"/>
+              <w:right w:type="dxa" w:w="120"/>
+            </w:tcMar>
+            <w:vAlign w:val="center"/>
+          </w:tcPr>
+          <w:p>
+            <w:pPr>
+              <w:keepNext w:val="false"/>
+              <w:spacing w:after="0"/>
+              <w:jc w:val="center"/>
+            </w:pPr>
+          </w:p>
+        </w:tc>
+        <w:tc>
+          <w:tcPr>
+            <w:tcW w:type="dxa" w:w="8838"/>
+            <w:tcBorders>
+              <w:top w:val="single" w:color="B7C3D0" w:sz="4"/>
+              <w:left w:val="single" w:color="B7C3D0" w:sz="4"/>
+              <w:bottom w:val="single" w:color="B7C3D0" w:sz="4"/>
+              <w:right w:val="single" w:color="B7C3D0" w:sz="4"/>
+            </w:tcBorders>
+            <w:tcMar>
+              <w:top w:type="dxa" w:w="90"/>
+              <w:left w:type="dxa" w:w="120"/>
+              <w:bottom w:type="dxa" w:w="90"/>
+              <w:right w:type="dxa" w:w="120"/>
+            </w:tcMar>
+            <w:vAlign w:val="center"/>
+          </w:tcPr>
+          <w:p>
+            <w:pPr>
+              <w:keepNext w:val="false"/>
+              <w:spacing w:after="0"/>
+            </w:pPr>
+            <w:r>
               <w:t xml:space="preserve">TESS is above Earth’s atmosphere, and it measured WASP-2 every 2 minutes for weeks without a break</w:t>
-            </w:r>
-          </w:p>
-        </w:tc>
-      </w:tr>
-      <w:tr>
-        <w:trPr>
-          <w:cantSplit/>
-        </w:trPr>
-        <w:tc>
-          <w:tcPr>
-            <w:tcW w:type="dxa" w:w="800"/>
-            <w:tcBorders>
-              <w:top w:val="single" w:color="B7C3D0" w:sz="4"/>
-              <w:left w:val="single" w:color="B7C3D0" w:sz="4"/>
-              <w:bottom w:val="single" w:color="B7C3D0" w:sz="4"/>
-              <w:right w:val="single" w:color="B7C3D0" w:sz="4"/>
-            </w:tcBorders>
-            <w:tcMar>
-              <w:top w:type="dxa" w:w="90"/>
-              <w:left w:type="dxa" w:w="120"/>
-              <w:bottom w:type="dxa" w:w="90"/>
-              <w:right w:type="dxa" w:w="120"/>
-            </w:tcMar>
-            <w:vAlign w:val="center"/>
-          </w:tcPr>
-          <w:p>
-            <w:pPr>
-              <w:keepNext w:val="false"/>
-              <w:spacing w:after="0"/>
-              <w:jc w:val="center"/>
-            </w:pPr>
-          </w:p>
-        </w:tc>
-        <w:tc>
-          <w:tcPr>
-            <w:tcW w:type="dxa" w:w="8838"/>
-            <w:tcBorders>
-              <w:top w:val="single" w:color="B7C3D0" w:sz="4"/>
-              <w:left w:val="single" w:color="B7C3D0" w:sz="4"/>
-              <w:bottom w:val="single" w:color="B7C3D0" w:sz="4"/>
-              <w:right w:val="single" w:color="B7C3D0" w:sz="4"/>
-            </w:tcBorders>
-            <w:tcMar>
-              <w:top w:type="dxa" w:w="90"/>
-              <w:left w:type="dxa" w:w="120"/>
-              <w:bottom w:type="dxa" w:w="90"/>
-              <w:right w:type="dxa" w:w="120"/>
-            </w:tcMar>
-            <w:vAlign w:val="center"/>
-          </w:tcPr>
-          <w:p>
-            <w:pPr>
-              <w:keepNext w:val="false"/>
-              <w:spacing w:after="0"/>
-            </w:pPr>
-            <w:r>
-              <w:t xml:space="preserve">TESS only measures stars that have planets</w:t>
             </w:r>
           </w:p>
         </w:tc>
@@ -3012,14 +5222,14 @@
                 <w:bCs/>
                 <w:color w:val="003B71"/>
               </w:rPr>
-              <w:t xml:space="preserve">Question 6. </w:t>
+              <w:t xml:space="preserve">Question 8. </w:t>
             </w:r>
             <w:r>
               <w:rPr>
                 <w:b/>
                 <w:bCs/>
               </w:rPr>
-              <w:t xml:space="preserve">Is the transit about the same depth from the ground and from space? Why?</w:t>
+              <w:t xml:space="preserve">If a planet were twice as wide as WASP-2b, how deep would its transit be, compared with WASP-2b’s?</w:t>
             </w:r>
           </w:p>
         </w:tc>
@@ -3076,7 +5286,7 @@
               <w:spacing w:after="0"/>
             </w:pPr>
             <w:r>
-              <w:t xml:space="preserve">Yes, roughly, because the depth depends on how much of the star’s face the planet covers, not on the telescope</w:t>
+              <w:t xml:space="preserve">The same depth</w:t>
             </w:r>
           </w:p>
         </w:tc>
@@ -3133,7 +5343,7 @@
               <w:spacing w:after="0"/>
             </w:pPr>
             <w:r>
-              <w:t xml:space="preserve">No, because a bigger telescope always measures a deeper transit</w:t>
+              <w:t xml:space="preserve">Twice as deep</w:t>
             </w:r>
           </w:p>
         </w:tc>
@@ -3190,7 +5400,7 @@
               <w:spacing w:after="0"/>
             </w:pPr>
             <w:r>
-              <w:t xml:space="preserve">No, because the planet has shrunk since 2008</w:t>
+              <w:t xml:space="preserve">Four times as deep</w:t>
             </w:r>
           </w:p>
         </w:tc>
@@ -3247,7 +5457,7 @@
               <w:spacing w:after="0"/>
             </w:pPr>
             <w:r>
-              <w:t xml:space="preserve">Yes, because both telescopes are on Earth</w:t>
+              <w:t xml:space="preserve">Eight times as deep</w:t>
             </w:r>
           </w:p>
         </w:tc>
@@ -3307,14 +5517,14 @@
                 <w:bCs/>
                 <w:color w:val="003B71"/>
               </w:rPr>
-              <w:t xml:space="preserve">Question 7. </w:t>
+              <w:t xml:space="preserve">Question 9. </w:t>
             </w:r>
             <w:r>
               <w:rPr>
                 <w:b/>
                 <w:bCs/>
               </w:rPr>
-              <w:t xml:space="preserve">Jupiter passing in front of the Sun would dim it by about 1%. WASP-2 is a little smaller than the Sun, and WASP-2b dims it by close to 2%. What kind of planet is WASP-2b most likely to be?</w:t>
+              <w:t xml:space="preserve">We only see a transit if the planet’s orbit is almost exactly lined up with our view. What does this mean?</w:t>
             </w:r>
           </w:p>
         </w:tc>
@@ -3371,7 +5581,7 @@
               <w:spacing w:after="0"/>
             </w:pPr>
             <w:r>
-              <w:t xml:space="preserve">A rocky planet about the size of Earth</w:t>
+              <w:t xml:space="preserve">Most planets never pass in front of their stars as seen from Earth, so for every transiting planet we find, many more go unseen</w:t>
             </w:r>
           </w:p>
         </w:tc>
@@ -3428,7 +5638,7 @@
               <w:spacing w:after="0"/>
             </w:pPr>
             <w:r>
-              <w:t xml:space="preserve">A giant planet roughly the size of Jupiter</w:t>
+              <w:t xml:space="preserve">All planets orbit in the same plane as Earth</w:t>
             </w:r>
           </w:p>
         </w:tc>
@@ -3485,7 +5695,7 @@
               <w:spacing w:after="0"/>
             </w:pPr>
             <w:r>
-              <w:t xml:space="preserve">A planet ten times bigger than Jupiter</w:t>
+              <w:t xml:space="preserve">Only planets in our own Solar System can be found this way</w:t>
             </w:r>
           </w:p>
         </w:tc>
@@ -3542,7 +5752,7 @@
               <w:spacing w:after="0"/>
             </w:pPr>
             <w:r>
-              <w:t xml:space="preserve">We can’t tell anything about its size from a transit</w:t>
+              <w:t xml:space="preserve">Every star has a planet that transits</w:t>
             </w:r>
           </w:p>
         </w:tc>
@@ -3602,14 +5812,14 @@
                 <w:bCs/>
                 <w:color w:val="003B71"/>
               </w:rPr>
-              <w:t xml:space="preserve">Question 8. </w:t>
+              <w:t xml:space="preserve">Question 10. </w:t>
             </w:r>
             <w:r>
               <w:rPr>
                 <w:b/>
                 <w:bCs/>
               </w:rPr>
-              <w:t xml:space="preserve">If a planet were twice as wide as WASP-2b, how deep would its transit be, compared with WASP-2b’s?</w:t>
+              <w:t xml:space="preserve">Compared with the planets in our Solar System, what do WASP-2b and 51 Pegasi b have in common?</w:t>
             </w:r>
           </w:p>
         </w:tc>
@@ -3666,7 +5876,7 @@
               <w:spacing w:after="0"/>
             </w:pPr>
             <w:r>
-              <w:t xml:space="preserve">The same depth</w:t>
+              <w:t xml:space="preserve">They’re both small, rocky planets</w:t>
             </w:r>
           </w:p>
         </w:tc>
@@ -3723,7 +5933,7 @@
               <w:spacing w:after="0"/>
             </w:pPr>
             <w:r>
-              <w:t xml:space="preserve">Twice as deep</w:t>
+              <w:t xml:space="preserve">They’re both giant planets that orbit their stars in just a few days, much closer than Mercury is to the Sun</w:t>
             </w:r>
           </w:p>
         </w:tc>
@@ -3780,7 +5990,7 @@
               <w:spacing w:after="0"/>
             </w:pPr>
             <w:r>
-              <w:t xml:space="preserve">Four times as deep</w:t>
+              <w:t xml:space="preserve">They’re both in their stars’ habitable zones</w:t>
             </w:r>
           </w:p>
         </w:tc>
@@ -3837,302 +6047,7 @@
               <w:spacing w:after="0"/>
             </w:pPr>
             <w:r>
-              <w:t xml:space="preserve">Eight times as deep</w:t>
-            </w:r>
-          </w:p>
-        </w:tc>
-      </w:tr>
-    </w:tbl>
-    <w:p>
-      <w:pPr>
-        <w:spacing w:after="160"/>
-      </w:pPr>
-    </w:p>
-    <w:tbl>
-      <w:tblPr>
-        <w:tblW w:type="dxa" w:w="9638"/>
-        <w:tblBorders>
-          <w:top w:val="single" w:color="auto" w:sz="4"/>
-          <w:left w:val="single" w:color="auto" w:sz="4"/>
-          <w:bottom w:val="single" w:color="auto" w:sz="4"/>
-          <w:right w:val="single" w:color="auto" w:sz="4"/>
-          <w:insideH w:val="single" w:color="auto" w:sz="4"/>
-          <w:insideV w:val="single" w:color="auto" w:sz="4"/>
-        </w:tblBorders>
-      </w:tblPr>
-      <w:tblGrid>
-        <w:gridCol w:w="800"/>
-        <w:gridCol w:w="8838"/>
-      </w:tblGrid>
-      <w:tr>
-        <w:trPr>
-          <w:cantSplit/>
-        </w:trPr>
-        <w:tc>
-          <w:tcPr>
-            <w:tcW w:type="dxa" w:w="9638"/>
-            <w:gridSpan w:val="2"/>
-            <w:tcBorders>
-              <w:top w:val="single" w:color="B7C3D0" w:sz="4"/>
-              <w:left w:val="single" w:color="B7C3D0" w:sz="4"/>
-              <w:bottom w:val="single" w:color="B7C3D0" w:sz="4"/>
-              <w:right w:val="single" w:color="B7C3D0" w:sz="4"/>
-            </w:tcBorders>
-            <w:shd w:fill="E8EEF5" w:color="auto" w:val="clear"/>
-            <w:tcMar>
-              <w:top w:type="dxa" w:w="90"/>
-              <w:left w:type="dxa" w:w="120"/>
-              <w:bottom w:type="dxa" w:w="90"/>
-              <w:right w:type="dxa" w:w="120"/>
-            </w:tcMar>
-          </w:tcPr>
-          <w:p>
-            <w:pPr>
-              <w:keepNext/>
-              <w:spacing w:after="0"/>
-            </w:pPr>
-            <w:r>
-              <w:rPr>
-                <w:b/>
-                <w:bCs/>
-                <w:color w:val="003B71"/>
-              </w:rPr>
-              <w:t xml:space="preserve">Question 9. </w:t>
-            </w:r>
-            <w:r>
-              <w:rPr>
-                <w:b/>
-                <w:bCs/>
-              </w:rPr>
-              <w:t xml:space="preserve">Why does the transit method mostly find large planets with short orbits?</w:t>
-            </w:r>
-          </w:p>
-        </w:tc>
-      </w:tr>
-      <w:tr>
-        <w:trPr>
-          <w:cantSplit/>
-        </w:trPr>
-        <w:tc>
-          <w:tcPr>
-            <w:tcW w:type="dxa" w:w="800"/>
-            <w:tcBorders>
-              <w:top w:val="single" w:color="B7C3D0" w:sz="4"/>
-              <w:left w:val="single" w:color="B7C3D0" w:sz="4"/>
-              <w:bottom w:val="single" w:color="B7C3D0" w:sz="4"/>
-              <w:right w:val="single" w:color="B7C3D0" w:sz="4"/>
-            </w:tcBorders>
-            <w:tcMar>
-              <w:top w:type="dxa" w:w="90"/>
-              <w:left w:type="dxa" w:w="120"/>
-              <w:bottom w:type="dxa" w:w="90"/>
-              <w:right w:type="dxa" w:w="120"/>
-            </w:tcMar>
-            <w:vAlign w:val="center"/>
-          </w:tcPr>
-          <w:p>
-            <w:pPr>
-              <w:keepNext/>
-              <w:spacing w:after="0"/>
-              <w:jc w:val="center"/>
-            </w:pPr>
-          </w:p>
-        </w:tc>
-        <w:tc>
-          <w:tcPr>
-            <w:tcW w:type="dxa" w:w="8838"/>
-            <w:tcBorders>
-              <w:top w:val="single" w:color="B7C3D0" w:sz="4"/>
-              <w:left w:val="single" w:color="B7C3D0" w:sz="4"/>
-              <w:bottom w:val="single" w:color="B7C3D0" w:sz="4"/>
-              <w:right w:val="single" w:color="B7C3D0" w:sz="4"/>
-            </w:tcBorders>
-            <w:tcMar>
-              <w:top w:type="dxa" w:w="90"/>
-              <w:left w:type="dxa" w:w="120"/>
-              <w:bottom w:type="dxa" w:w="90"/>
-              <w:right w:type="dxa" w:w="120"/>
-            </w:tcMar>
-            <w:vAlign w:val="center"/>
-          </w:tcPr>
-          <w:p>
-            <w:pPr>
-              <w:keepNext/>
-              <w:spacing w:after="0"/>
-            </w:pPr>
-            <w:r>
-              <w:t xml:space="preserve">Large planets on short orbits are more common than any other kind of planet</w:t>
-            </w:r>
-          </w:p>
-        </w:tc>
-      </w:tr>
-      <w:tr>
-        <w:trPr>
-          <w:cantSplit/>
-        </w:trPr>
-        <w:tc>
-          <w:tcPr>
-            <w:tcW w:type="dxa" w:w="800"/>
-            <w:tcBorders>
-              <w:top w:val="single" w:color="B7C3D0" w:sz="4"/>
-              <w:left w:val="single" w:color="B7C3D0" w:sz="4"/>
-              <w:bottom w:val="single" w:color="B7C3D0" w:sz="4"/>
-              <w:right w:val="single" w:color="B7C3D0" w:sz="4"/>
-            </w:tcBorders>
-            <w:tcMar>
-              <w:top w:type="dxa" w:w="90"/>
-              <w:left w:type="dxa" w:w="120"/>
-              <w:bottom w:type="dxa" w:w="90"/>
-              <w:right w:type="dxa" w:w="120"/>
-            </w:tcMar>
-            <w:vAlign w:val="center"/>
-          </w:tcPr>
-          <w:p>
-            <w:pPr>
-              <w:keepNext/>
-              <w:spacing w:after="0"/>
-              <w:jc w:val="center"/>
-            </w:pPr>
-          </w:p>
-        </w:tc>
-        <w:tc>
-          <w:tcPr>
-            <w:tcW w:type="dxa" w:w="8838"/>
-            <w:tcBorders>
-              <w:top w:val="single" w:color="B7C3D0" w:sz="4"/>
-              <w:left w:val="single" w:color="B7C3D0" w:sz="4"/>
-              <w:bottom w:val="single" w:color="B7C3D0" w:sz="4"/>
-              <w:right w:val="single" w:color="B7C3D0" w:sz="4"/>
-            </w:tcBorders>
-            <w:tcMar>
-              <w:top w:type="dxa" w:w="90"/>
-              <w:left w:type="dxa" w:w="120"/>
-              <w:bottom w:type="dxa" w:w="90"/>
-              <w:right w:type="dxa" w:w="120"/>
-            </w:tcMar>
-            <w:vAlign w:val="center"/>
-          </w:tcPr>
-          <w:p>
-            <w:pPr>
-              <w:keepNext/>
-              <w:spacing w:after="0"/>
-            </w:pPr>
-            <w:r>
-              <w:t xml:space="preserve">Small planets never pass in front of their stars</w:t>
-            </w:r>
-          </w:p>
-        </w:tc>
-      </w:tr>
-      <w:tr>
-        <w:trPr>
-          <w:cantSplit/>
-        </w:trPr>
-        <w:tc>
-          <w:tcPr>
-            <w:tcW w:type="dxa" w:w="800"/>
-            <w:tcBorders>
-              <w:top w:val="single" w:color="B7C3D0" w:sz="4"/>
-              <w:left w:val="single" w:color="B7C3D0" w:sz="4"/>
-              <w:bottom w:val="single" w:color="B7C3D0" w:sz="4"/>
-              <w:right w:val="single" w:color="B7C3D0" w:sz="4"/>
-            </w:tcBorders>
-            <w:tcMar>
-              <w:top w:type="dxa" w:w="90"/>
-              <w:left w:type="dxa" w:w="120"/>
-              <w:bottom w:type="dxa" w:w="90"/>
-              <w:right w:type="dxa" w:w="120"/>
-            </w:tcMar>
-            <w:vAlign w:val="center"/>
-          </w:tcPr>
-          <w:p>
-            <w:pPr>
-              <w:keepNext/>
-              <w:spacing w:after="0"/>
-              <w:jc w:val="center"/>
-            </w:pPr>
-          </w:p>
-        </w:tc>
-        <w:tc>
-          <w:tcPr>
-            <w:tcW w:type="dxa" w:w="8838"/>
-            <w:tcBorders>
-              <w:top w:val="single" w:color="B7C3D0" w:sz="4"/>
-              <w:left w:val="single" w:color="B7C3D0" w:sz="4"/>
-              <w:bottom w:val="single" w:color="B7C3D0" w:sz="4"/>
-              <w:right w:val="single" w:color="B7C3D0" w:sz="4"/>
-            </w:tcBorders>
-            <w:tcMar>
-              <w:top w:type="dxa" w:w="90"/>
-              <w:left w:type="dxa" w:w="120"/>
-              <w:bottom w:type="dxa" w:w="90"/>
-              <w:right w:type="dxa" w:w="120"/>
-            </w:tcMar>
-            <w:vAlign w:val="center"/>
-          </w:tcPr>
-          <w:p>
-            <w:pPr>
-              <w:keepNext/>
-              <w:spacing w:after="0"/>
-            </w:pPr>
-            <w:r>
-              <w:t xml:space="preserve">Telescopes can only see planets that are close to their stars</w:t>
-            </w:r>
-          </w:p>
-        </w:tc>
-      </w:tr>
-      <w:tr>
-        <w:trPr>
-          <w:cantSplit/>
-        </w:trPr>
-        <w:tc>
-          <w:tcPr>
-            <w:tcW w:type="dxa" w:w="800"/>
-            <w:tcBorders>
-              <w:top w:val="single" w:color="B7C3D0" w:sz="4"/>
-              <w:left w:val="single" w:color="B7C3D0" w:sz="4"/>
-              <w:bottom w:val="single" w:color="B7C3D0" w:sz="4"/>
-              <w:right w:val="single" w:color="B7C3D0" w:sz="4"/>
-            </w:tcBorders>
-            <w:tcMar>
-              <w:top w:type="dxa" w:w="90"/>
-              <w:left w:type="dxa" w:w="120"/>
-              <w:bottom w:type="dxa" w:w="90"/>
-              <w:right w:type="dxa" w:w="120"/>
-            </w:tcMar>
-            <w:vAlign w:val="center"/>
-          </w:tcPr>
-          <w:p>
-            <w:pPr>
-              <w:keepNext w:val="false"/>
-              <w:spacing w:after="0"/>
-              <w:jc w:val="center"/>
-            </w:pPr>
-          </w:p>
-        </w:tc>
-        <w:tc>
-          <w:tcPr>
-            <w:tcW w:type="dxa" w:w="8838"/>
-            <w:tcBorders>
-              <w:top w:val="single" w:color="B7C3D0" w:sz="4"/>
-              <w:left w:val="single" w:color="B7C3D0" w:sz="4"/>
-              <w:bottom w:val="single" w:color="B7C3D0" w:sz="4"/>
-              <w:right w:val="single" w:color="B7C3D0" w:sz="4"/>
-            </w:tcBorders>
-            <w:tcMar>
-              <w:top w:type="dxa" w:w="90"/>
-              <w:left w:type="dxa" w:w="120"/>
-              <w:bottom w:type="dxa" w:w="90"/>
-              <w:right w:type="dxa" w:w="120"/>
-            </w:tcMar>
-            <w:vAlign w:val="center"/>
-          </w:tcPr>
-          <w:p>
-            <w:pPr>
-              <w:keepNext w:val="false"/>
-              <w:spacing w:after="0"/>
-            </w:pPr>
-            <w:r>
-              <w:t xml:space="preserve">Large planets make deeper dips, short orbits give many transits to measure, and close-in planets are more likely to be lined up with our view</w:t>
+              <w:t xml:space="preserve">They were both found by the transit method</w:t>
             </w:r>
           </w:p>
         </w:tc>
@@ -4242,7 +6157,7 @@
         <w:spacing w:after="120"/>
       </w:pPr>
       <w:r>
-        <w:t xml:space="preserve">An Earth-sized planet crossing a Sun-like star would dim it by only about 0.01%. Using what you’ve seen in Parts 1 and 2, explain why we need space telescopes like TESS, and many measurements, to find planets like Earth.</w:t>
+        <w:t xml:space="preserve">An Earth-sized planet crossing a Sun-like star would dim it by only about 0.01%, and the transit method favours large planets on short orbits. Using what you’ve seen in Parts 1 and 2, explain why finding planets like Earth needs space telescopes and many measurements.</w:t>
       </w:r>
     </w:p>
     <w:tbl>

</xml_diff>

<commit_message>
C2 proforma: add a question on how measurements become planet properties
Co-Authored-By: Claude Opus 5.5 <noreply@anthropic.com>
Claude-Session: https://claude.ai/code/session_01NAwACSWWsG155bmFUMGXxb
</commit_message>
<xml_diff>
--- a/C2/AstroLabC2_Proforma.docx
+++ b/C2/AstroLabC2_Proforma.docx
@@ -6058,6 +6058,83 @@
         <w:spacing w:after="160"/>
       </w:pPr>
     </w:p>
+    <w:p>
+      <w:pPr>
+        <w:keepNext/>
+        <w:spacing w:after="100" w:before="200"/>
+      </w:pPr>
+      <w:r>
+        <w:rPr>
+          <w:b/>
+          <w:bCs/>
+          <w:color w:val="003B71"/>
+          <w:sz w:val="23"/>
+          <w:szCs w:val="23"/>
+        </w:rPr>
+        <w:t xml:space="preserve">From light curve to planet</w:t>
+      </w:r>
+    </w:p>
+    <w:p>
+      <w:pPr>
+        <w:keepNext/>
+        <w:spacing w:after="120"/>
+      </w:pPr>
+      <w:r>
+        <w:t xml:space="preserve">Read the From light curve to planet section at the end of Part 2. Which measurement from the light curve tells us the planet’s size, and which tells us how far it is from its star? Why can’t a transit on its own tell us the planet’s mass?</w:t>
+      </w:r>
+    </w:p>
+    <w:tbl>
+      <w:tblPr>
+        <w:tblW w:type="dxa" w:w="9638"/>
+        <w:tblBorders>
+          <w:top w:val="single" w:color="auto" w:sz="4"/>
+          <w:left w:val="single" w:color="auto" w:sz="4"/>
+          <w:bottom w:val="single" w:color="auto" w:sz="4"/>
+          <w:right w:val="single" w:color="auto" w:sz="4"/>
+          <w:insideH w:val="single" w:color="auto" w:sz="4"/>
+          <w:insideV w:val="single" w:color="auto" w:sz="4"/>
+        </w:tblBorders>
+      </w:tblPr>
+      <w:tblGrid>
+        <w:gridCol w:w="9638"/>
+      </w:tblGrid>
+      <w:tr>
+        <w:trPr>
+          <w:trHeight w:val="2400" w:hRule="atLeast"/>
+        </w:trPr>
+        <w:tc>
+          <w:tcPr>
+            <w:tcW w:type="dxa" w:w="9638"/>
+            <w:tcBorders>
+              <w:top w:val="single" w:color="B7C3D0" w:sz="4"/>
+              <w:left w:val="single" w:color="B7C3D0" w:sz="4"/>
+              <w:bottom w:val="single" w:color="B7C3D0" w:sz="4"/>
+              <w:right w:val="single" w:color="B7C3D0" w:sz="4"/>
+            </w:tcBorders>
+            <w:tcMar>
+              <w:top w:type="dxa" w:w="90"/>
+              <w:left w:type="dxa" w:w="120"/>
+              <w:bottom w:type="dxa" w:w="90"/>
+              <w:right w:type="dxa" w:w="120"/>
+            </w:tcMar>
+            <w:vAlign w:val="top"/>
+          </w:tcPr>
+          <w:p>
+            <w:pPr>
+              <w:spacing w:after="0"/>
+            </w:pPr>
+            <w:r>
+              <w:rPr>
+                <w:i/>
+                <w:iCs/>
+                <w:color w:val="8A8A8A"/>
+              </w:rPr>
+              <w:t xml:space="preserve">Type your answer here</w:t>
+            </w:r>
+          </w:p>
+        </w:tc>
+      </w:tr>
+    </w:tbl>
     <w:p>
       <w:pPr>
         <w:keepNext/>

</xml_diff>

<commit_message>
C2 proforma: add a question on how measurements become planet properties (#16)
Claude-Session: https://claude.ai/code/session_01NAwACSWWsG155bmFUMGXxb

Co-authored-by: Claude <noreply@anthropic.com>
</commit_message>
<xml_diff>
--- a/C2/AstroLabC2_Proforma.docx
+++ b/C2/AstroLabC2_Proforma.docx
@@ -6058,6 +6058,83 @@
         <w:spacing w:after="160"/>
       </w:pPr>
     </w:p>
+    <w:p>
+      <w:pPr>
+        <w:keepNext/>
+        <w:spacing w:after="100" w:before="200"/>
+      </w:pPr>
+      <w:r>
+        <w:rPr>
+          <w:b/>
+          <w:bCs/>
+          <w:color w:val="003B71"/>
+          <w:sz w:val="23"/>
+          <w:szCs w:val="23"/>
+        </w:rPr>
+        <w:t xml:space="preserve">From light curve to planet</w:t>
+      </w:r>
+    </w:p>
+    <w:p>
+      <w:pPr>
+        <w:keepNext/>
+        <w:spacing w:after="120"/>
+      </w:pPr>
+      <w:r>
+        <w:t xml:space="preserve">Read the From light curve to planet section at the end of Part 2. Which measurement from the light curve tells us the planet’s size, and which tells us how far it is from its star? Why can’t a transit on its own tell us the planet’s mass?</w:t>
+      </w:r>
+    </w:p>
+    <w:tbl>
+      <w:tblPr>
+        <w:tblW w:type="dxa" w:w="9638"/>
+        <w:tblBorders>
+          <w:top w:val="single" w:color="auto" w:sz="4"/>
+          <w:left w:val="single" w:color="auto" w:sz="4"/>
+          <w:bottom w:val="single" w:color="auto" w:sz="4"/>
+          <w:right w:val="single" w:color="auto" w:sz="4"/>
+          <w:insideH w:val="single" w:color="auto" w:sz="4"/>
+          <w:insideV w:val="single" w:color="auto" w:sz="4"/>
+        </w:tblBorders>
+      </w:tblPr>
+      <w:tblGrid>
+        <w:gridCol w:w="9638"/>
+      </w:tblGrid>
+      <w:tr>
+        <w:trPr>
+          <w:trHeight w:val="2400" w:hRule="atLeast"/>
+        </w:trPr>
+        <w:tc>
+          <w:tcPr>
+            <w:tcW w:type="dxa" w:w="9638"/>
+            <w:tcBorders>
+              <w:top w:val="single" w:color="B7C3D0" w:sz="4"/>
+              <w:left w:val="single" w:color="B7C3D0" w:sz="4"/>
+              <w:bottom w:val="single" w:color="B7C3D0" w:sz="4"/>
+              <w:right w:val="single" w:color="B7C3D0" w:sz="4"/>
+            </w:tcBorders>
+            <w:tcMar>
+              <w:top w:type="dxa" w:w="90"/>
+              <w:left w:type="dxa" w:w="120"/>
+              <w:bottom w:type="dxa" w:w="90"/>
+              <w:right w:type="dxa" w:w="120"/>
+            </w:tcMar>
+            <w:vAlign w:val="top"/>
+          </w:tcPr>
+          <w:p>
+            <w:pPr>
+              <w:spacing w:after="0"/>
+            </w:pPr>
+            <w:r>
+              <w:rPr>
+                <w:i/>
+                <w:iCs/>
+                <w:color w:val="8A8A8A"/>
+              </w:rPr>
+              <w:t xml:space="preserve">Type your answer here</w:t>
+            </w:r>
+          </w:p>
+        </w:tc>
+      </w:tr>
+    </w:tbl>
     <w:p>
       <w:pPr>
         <w:keepNext/>

</xml_diff>